<commit_message>
updated author checklist and reporting summary
</commit_message>
<xml_diff>
--- a/paper/admin/Author_Checklist_NCOMMS-23-10640C__1762787328_45.docx
+++ b/paper/admin/Author_Checklist_NCOMMS-23-10640C__1762787328_45.docx
@@ -869,29 +869,7 @@
                 <w:szCs w:val="16"/>
                 <w14:ligatures w14:val="none"/>
               </w:rPr>
-              <w:t>accessible in its current form</w:t>
-            </w:r>
-            <w:r>
-              <w:rPr>
-                <w:rFonts w:ascii="Arial" w:eastAsia="Times New Roman" w:hAnsi="Arial" w:cs="Arial"/>
-                <w:color w:val="000000"/>
-                <w:kern w:val="0"/>
-                <w:sz w:val="16"/>
-                <w:szCs w:val="16"/>
-                <w14:ligatures w14:val="none"/>
-              </w:rPr>
-              <w:t>,</w:t>
-            </w:r>
-            <w:r>
-              <w:rPr>
-                <w:rFonts w:ascii="Arial" w:eastAsia="Times New Roman" w:hAnsi="Arial" w:cs="Arial"/>
-                <w:color w:val="000000"/>
-                <w:kern w:val="0"/>
-                <w:sz w:val="16"/>
-                <w:szCs w:val="16"/>
-                <w14:ligatures w14:val="none"/>
-              </w:rPr>
-              <w:t xml:space="preserve"> </w:t>
+              <w:t xml:space="preserve">accessible in its current form </w:t>
             </w:r>
             <w:r>
               <w:rPr>
@@ -935,18 +913,7 @@
                 <w:szCs w:val="16"/>
                 <w14:ligatures w14:val="none"/>
               </w:rPr>
-              <w:t xml:space="preserve"> of </w:t>
-            </w:r>
-            <w:r>
-              <w:rPr>
-                <w:rFonts w:ascii="Arial" w:eastAsia="Times New Roman" w:hAnsi="Arial" w:cs="Arial"/>
-                <w:color w:val="000000"/>
-                <w:kern w:val="0"/>
-                <w:sz w:val="16"/>
-                <w:szCs w:val="16"/>
-                <w14:ligatures w14:val="none"/>
-              </w:rPr>
-              <w:t>our manuscript</w:t>
+              <w:t xml:space="preserve"> of our manuscript</w:t>
             </w:r>
             <w:r>
               <w:rPr>
@@ -1040,7 +1007,6 @@
                 <w:kern w:val="0"/>
                 <w:sz w:val="16"/>
                 <w:szCs w:val="16"/>
-                <w:highlight w:val="yellow"/>
                 <w14:ligatures w14:val="none"/>
               </w:rPr>
               <w:lastRenderedPageBreak/>
@@ -1053,7 +1019,6 @@
                 <w:kern w:val="0"/>
                 <w:sz w:val="16"/>
                 <w:szCs w:val="16"/>
-                <w:highlight w:val="yellow"/>
                 <w14:ligatures w14:val="none"/>
               </w:rPr>
               <w:br/>
@@ -1065,7 +1030,6 @@
                 <w:kern w:val="0"/>
                 <w:sz w:val="16"/>
                 <w:szCs w:val="16"/>
-                <w:highlight w:val="yellow"/>
                 <w14:ligatures w14:val="none"/>
               </w:rPr>
               <w:br/>
@@ -1078,7 +1042,6 @@
                 <w:kern w:val="0"/>
                 <w:sz w:val="16"/>
                 <w:szCs w:val="16"/>
-                <w:highlight w:val="yellow"/>
                 <w14:ligatures w14:val="none"/>
               </w:rPr>
               <w:br/>
@@ -1090,7 +1053,6 @@
                 <w:kern w:val="0"/>
                 <w:sz w:val="16"/>
                 <w:szCs w:val="16"/>
-                <w:highlight w:val="yellow"/>
                 <w14:ligatures w14:val="none"/>
               </w:rPr>
               <w:br/>
@@ -1103,7 +1065,6 @@
                 <w:kern w:val="0"/>
                 <w:sz w:val="16"/>
                 <w:szCs w:val="16"/>
-                <w:highlight w:val="yellow"/>
                 <w14:ligatures w14:val="none"/>
               </w:rPr>
               <w:br/>
@@ -1115,7 +1076,6 @@
                 <w:kern w:val="0"/>
                 <w:sz w:val="16"/>
                 <w:szCs w:val="16"/>
-                <w:highlight w:val="yellow"/>
                 <w14:ligatures w14:val="none"/>
               </w:rPr>
               <w:br/>
@@ -1128,7 +1088,6 @@
                 <w:kern w:val="0"/>
                 <w:sz w:val="16"/>
                 <w:szCs w:val="16"/>
-                <w:highlight w:val="yellow"/>
                 <w14:ligatures w14:val="none"/>
               </w:rPr>
               <w:br/>
@@ -1140,7 +1099,6 @@
                 <w:kern w:val="0"/>
                 <w:sz w:val="16"/>
                 <w:szCs w:val="16"/>
-                <w:highlight w:val="yellow"/>
                 <w14:ligatures w14:val="none"/>
               </w:rPr>
               <w:br/>
@@ -1153,7 +1111,6 @@
                 <w:kern w:val="0"/>
                 <w:sz w:val="16"/>
                 <w:szCs w:val="16"/>
-                <w:highlight w:val="yellow"/>
                 <w14:ligatures w14:val="none"/>
               </w:rPr>
               <w:br/>
@@ -1165,7 +1122,6 @@
                 <w:kern w:val="0"/>
                 <w:sz w:val="16"/>
                 <w:szCs w:val="16"/>
-                <w:highlight w:val="yellow"/>
                 <w14:ligatures w14:val="none"/>
               </w:rPr>
               <w:br/>
@@ -1178,7 +1134,6 @@
                 <w:kern w:val="0"/>
                 <w:sz w:val="16"/>
                 <w:szCs w:val="16"/>
-                <w:highlight w:val="yellow"/>
                 <w14:ligatures w14:val="none"/>
               </w:rPr>
               <w:br/>
@@ -1190,7 +1145,6 @@
                 <w:kern w:val="0"/>
                 <w:sz w:val="16"/>
                 <w:szCs w:val="16"/>
-                <w:highlight w:val="yellow"/>
                 <w14:ligatures w14:val="none"/>
               </w:rPr>
               <w:br/>
@@ -1203,7 +1157,6 @@
                 <w:kern w:val="0"/>
                 <w:sz w:val="16"/>
                 <w:szCs w:val="16"/>
-                <w:highlight w:val="yellow"/>
                 <w14:ligatures w14:val="none"/>
               </w:rPr>
               <w:br/>
@@ -1215,7 +1168,6 @@
                 <w:kern w:val="0"/>
                 <w:sz w:val="16"/>
                 <w:szCs w:val="16"/>
-                <w:highlight w:val="yellow"/>
                 <w14:ligatures w14:val="none"/>
               </w:rPr>
               <w:br/>
@@ -1228,7 +1180,6 @@
                 <w:kern w:val="0"/>
                 <w:sz w:val="16"/>
                 <w:szCs w:val="16"/>
-                <w:highlight w:val="yellow"/>
                 <w14:ligatures w14:val="none"/>
               </w:rPr>
               <w:br/>
@@ -1240,7 +1191,6 @@
                 <w:kern w:val="0"/>
                 <w:sz w:val="16"/>
                 <w:szCs w:val="16"/>
-                <w:highlight w:val="yellow"/>
                 <w14:ligatures w14:val="none"/>
               </w:rPr>
               <w:br/>
@@ -1272,6 +1222,17 @@
                 <w14:ligatures w14:val="none"/>
               </w:rPr>
             </w:pPr>
+            <w:r>
+              <w:rPr>
+                <w:rFonts w:ascii="Arial" w:eastAsia="Times New Roman" w:hAnsi="Arial" w:cs="Arial"/>
+                <w:color w:val="000000"/>
+                <w:kern w:val="0"/>
+                <w:sz w:val="16"/>
+                <w:szCs w:val="16"/>
+                <w14:ligatures w14:val="none"/>
+              </w:rPr>
+              <w:t>Traditional quiz scores provide limited insight into what students know. The authors show that text embedding models combined with short multiple-choice quizzes yield high-resolution maps of conceptual knowledge and learning.</w:t>
+            </w:r>
           </w:p>
         </w:tc>
       </w:tr>
@@ -1299,18 +1260,16 @@
                 <w:kern w:val="0"/>
                 <w:sz w:val="16"/>
                 <w:szCs w:val="16"/>
-                <w:highlight w:val="yellow"/>
-                <w14:ligatures w14:val="none"/>
-              </w:rPr>
-            </w:pPr>
-            <w:r>
-              <w:rPr>
-                <w:rFonts w:ascii="Arial" w:eastAsia="Times New Roman" w:hAnsi="Arial" w:cs="Arial"/>
-                <w:color w:val="000000"/>
-                <w:kern w:val="0"/>
-                <w:sz w:val="16"/>
-                <w:szCs w:val="16"/>
-                <w:highlight w:val="yellow"/>
+                <w14:ligatures w14:val="none"/>
+              </w:rPr>
+            </w:pPr>
+            <w:r>
+              <w:rPr>
+                <w:rFonts w:ascii="Arial" w:eastAsia="Times New Roman" w:hAnsi="Arial" w:cs="Arial"/>
+                <w:color w:val="000000"/>
+                <w:kern w:val="0"/>
+                <w:sz w:val="16"/>
+                <w:szCs w:val="16"/>
                 <w14:ligatures w14:val="none"/>
               </w:rPr>
               <w:t xml:space="preserve">Please provide a more toned down, descriptive, title. </w:t>
@@ -1342,6 +1301,50 @@
                 <w14:ligatures w14:val="none"/>
               </w:rPr>
             </w:pPr>
+            <w:r>
+              <w:rPr>
+                <w:rFonts w:ascii="Arial" w:eastAsia="Times New Roman" w:hAnsi="Arial" w:cs="Arial"/>
+                <w:color w:val="000000"/>
+                <w:kern w:val="0"/>
+                <w:sz w:val="16"/>
+                <w:szCs w:val="16"/>
+                <w14:ligatures w14:val="none"/>
+              </w:rPr>
+              <w:t xml:space="preserve">We have </w:t>
+            </w:r>
+            <w:r>
+              <w:rPr>
+                <w:rFonts w:ascii="Arial" w:eastAsia="Times New Roman" w:hAnsi="Arial" w:cs="Arial"/>
+                <w:color w:val="000000"/>
+                <w:kern w:val="0"/>
+                <w:sz w:val="16"/>
+                <w:szCs w:val="16"/>
+                <w14:ligatures w14:val="none"/>
+              </w:rPr>
+              <w:t xml:space="preserve">updated </w:t>
+            </w:r>
+            <w:r>
+              <w:rPr>
+                <w:rFonts w:ascii="Arial" w:eastAsia="Times New Roman" w:hAnsi="Arial" w:cs="Arial"/>
+                <w:color w:val="000000"/>
+                <w:kern w:val="0"/>
+                <w:sz w:val="16"/>
+                <w:szCs w:val="16"/>
+                <w14:ligatures w14:val="none"/>
+              </w:rPr>
+              <w:t>the</w:t>
+            </w:r>
+            <w:r>
+              <w:rPr>
+                <w:rFonts w:ascii="Arial" w:eastAsia="Times New Roman" w:hAnsi="Arial" w:cs="Arial"/>
+                <w:color w:val="000000"/>
+                <w:kern w:val="0"/>
+                <w:sz w:val="16"/>
+                <w:szCs w:val="16"/>
+                <w14:ligatures w14:val="none"/>
+              </w:rPr>
+              <w:t xml:space="preserve"> title in both the main text and Supplementary Information file.</w:t>
+            </w:r>
           </w:p>
         </w:tc>
       </w:tr>
@@ -2236,7 +2239,29 @@
                 <w:szCs w:val="16"/>
                 <w14:ligatures w14:val="none"/>
               </w:rPr>
-              <w:t>article contains 8 Figures and no Tables</w:t>
+              <w:t xml:space="preserve">article contains 8 </w:t>
+            </w:r>
+            <w:r>
+              <w:rPr>
+                <w:rFonts w:ascii="Arial" w:eastAsia="Times New Roman" w:hAnsi="Arial" w:cs="Arial"/>
+                <w:color w:val="000000"/>
+                <w:kern w:val="0"/>
+                <w:sz w:val="16"/>
+                <w:szCs w:val="16"/>
+                <w14:ligatures w14:val="none"/>
+              </w:rPr>
+              <w:t>f</w:t>
+            </w:r>
+            <w:r>
+              <w:rPr>
+                <w:rFonts w:ascii="Arial" w:eastAsia="Times New Roman" w:hAnsi="Arial" w:cs="Arial"/>
+                <w:color w:val="000000"/>
+                <w:kern w:val="0"/>
+                <w:sz w:val="16"/>
+                <w:szCs w:val="16"/>
+                <w14:ligatures w14:val="none"/>
+              </w:rPr>
+              <w:t>igures and no Tables</w:t>
             </w:r>
             <w:r>
               <w:rPr>
@@ -2330,7 +2355,6 @@
                 <w:kern w:val="0"/>
                 <w:sz w:val="16"/>
                 <w:szCs w:val="16"/>
-                <w:highlight w:val="yellow"/>
                 <w14:ligatures w14:val="none"/>
               </w:rPr>
               <w:lastRenderedPageBreak/>
@@ -2343,7 +2367,6 @@
                 <w:kern w:val="0"/>
                 <w:sz w:val="16"/>
                 <w:szCs w:val="16"/>
-                <w:highlight w:val="yellow"/>
                 <w14:ligatures w14:val="none"/>
               </w:rPr>
               <w:br/>
@@ -2355,7 +2378,6 @@
                 <w:kern w:val="0"/>
                 <w:sz w:val="16"/>
                 <w:szCs w:val="16"/>
-                <w:highlight w:val="yellow"/>
                 <w14:ligatures w14:val="none"/>
               </w:rPr>
               <w:br/>
@@ -2387,6 +2409,67 @@
                 <w14:ligatures w14:val="none"/>
               </w:rPr>
             </w:pPr>
+            <w:r>
+              <w:rPr>
+                <w:rFonts w:ascii="Arial" w:eastAsia="Times New Roman" w:hAnsi="Arial" w:cs="Arial"/>
+                <w:color w:val="000000"/>
+                <w:kern w:val="0"/>
+                <w:sz w:val="16"/>
+                <w:szCs w:val="16"/>
+                <w14:ligatures w14:val="none"/>
+              </w:rPr>
+              <w:t>We have uploaded the main Figures as separate individual files and included their legends in the main manuscript.</w:t>
+            </w:r>
+          </w:p>
+          <w:p>
+            <w:pPr>
+              <w:spacing w:after="0" w:line="240" w:lineRule="auto"/>
+              <w:rPr>
+                <w:rFonts w:ascii="Arial" w:eastAsia="Times New Roman" w:hAnsi="Arial" w:cs="Arial"/>
+                <w:color w:val="000000"/>
+                <w:kern w:val="0"/>
+                <w:sz w:val="16"/>
+                <w:szCs w:val="16"/>
+                <w14:ligatures w14:val="none"/>
+              </w:rPr>
+            </w:pPr>
+          </w:p>
+          <w:p>
+            <w:pPr>
+              <w:spacing w:after="0" w:line="240" w:lineRule="auto"/>
+              <w:rPr>
+                <w:rFonts w:ascii="Arial" w:eastAsia="Times New Roman" w:hAnsi="Arial" w:cs="Arial"/>
+                <w:color w:val="000000"/>
+                <w:kern w:val="0"/>
+                <w:sz w:val="16"/>
+                <w:szCs w:val="16"/>
+                <w14:ligatures w14:val="none"/>
+              </w:rPr>
+            </w:pPr>
+          </w:p>
+          <w:p>
+            <w:pPr>
+              <w:spacing w:after="0" w:line="240" w:lineRule="auto"/>
+              <w:rPr>
+                <w:rFonts w:ascii="Arial" w:eastAsia="Times New Roman" w:hAnsi="Arial" w:cs="Arial"/>
+                <w:color w:val="000000"/>
+                <w:kern w:val="0"/>
+                <w:sz w:val="16"/>
+                <w:szCs w:val="16"/>
+                <w14:ligatures w14:val="none"/>
+              </w:rPr>
+            </w:pPr>
+            <w:r>
+              <w:rPr>
+                <w:rFonts w:ascii="Arial" w:eastAsia="Times New Roman" w:hAnsi="Arial" w:cs="Arial"/>
+                <w:color w:val="000000"/>
+                <w:kern w:val="0"/>
+                <w:sz w:val="16"/>
+                <w:szCs w:val="16"/>
+                <w14:ligatures w14:val="none"/>
+              </w:rPr>
+              <w:t>All Supplementary Figures are included in the Supplementary Information PDF.</w:t>
+            </w:r>
           </w:p>
         </w:tc>
       </w:tr>
@@ -3013,7 +3096,6 @@
                 <w:kern w:val="0"/>
                 <w:sz w:val="16"/>
                 <w:szCs w:val="16"/>
-                <w:highlight w:val="yellow"/>
                 <w14:ligatures w14:val="none"/>
               </w:rPr>
               <w:t>We do not edit Supplementary Information files; they will be uploaded with the published article as they are submitted with the final version of your manuscript. Any tracked changes should be removed from the file and the file should be provided as a PDF file. Supplementary Figures do not need to be provided separately.</w:t>
@@ -3044,6 +3126,17 @@
                 <w14:ligatures w14:val="none"/>
               </w:rPr>
             </w:pPr>
+            <w:r>
+              <w:rPr>
+                <w:rFonts w:ascii="Arial" w:eastAsia="Times New Roman" w:hAnsi="Arial" w:cs="Arial"/>
+                <w:color w:val="000000"/>
+                <w:kern w:val="0"/>
+                <w:sz w:val="16"/>
+                <w:szCs w:val="16"/>
+                <w14:ligatures w14:val="none"/>
+              </w:rPr>
+              <w:t>We have provided our Supplementary Information file as a PDF with all tracked changes removed.</w:t>
+            </w:r>
           </w:p>
         </w:tc>
       </w:tr>
@@ -3347,6 +3440,127 @@
                 <w14:ligatures w14:val="none"/>
               </w:rPr>
             </w:pPr>
+            <w:r>
+              <w:rPr>
+                <w:rFonts w:ascii="Arial" w:eastAsia="Times New Roman" w:hAnsi="Arial" w:cs="Arial"/>
+                <w:color w:val="000000"/>
+                <w:kern w:val="0"/>
+                <w:sz w:val="16"/>
+                <w:szCs w:val="16"/>
+                <w14:ligatures w14:val="none"/>
+              </w:rPr>
+              <w:t xml:space="preserve">We have removed all non-essential </w:t>
+            </w:r>
+            <w:r>
+              <w:rPr>
+                <w:rFonts w:ascii="Arial" w:eastAsia="Times New Roman" w:hAnsi="Arial" w:cs="Arial"/>
+                <w:color w:val="000000"/>
+                <w:kern w:val="0"/>
+                <w:sz w:val="16"/>
+                <w:szCs w:val="16"/>
+                <w14:ligatures w14:val="none"/>
+              </w:rPr>
+              <w:t>speech/</w:t>
+            </w:r>
+            <w:r>
+              <w:rPr>
+                <w:rFonts w:ascii="Arial" w:eastAsia="Times New Roman" w:hAnsi="Arial" w:cs="Arial"/>
+                <w:color w:val="000000"/>
+                <w:kern w:val="0"/>
+                <w:sz w:val="16"/>
+                <w:szCs w:val="16"/>
+                <w14:ligatures w14:val="none"/>
+              </w:rPr>
+              <w:t xml:space="preserve">quotation </w:t>
+            </w:r>
+            <w:r>
+              <w:rPr>
+                <w:rFonts w:ascii="Arial" w:eastAsia="Times New Roman" w:hAnsi="Arial" w:cs="Arial"/>
+                <w:color w:val="000000"/>
+                <w:kern w:val="0"/>
+                <w:sz w:val="16"/>
+                <w:szCs w:val="16"/>
+                <w14:ligatures w14:val="none"/>
+              </w:rPr>
+              <w:t xml:space="preserve">marks </w:t>
+            </w:r>
+            <w:r>
+              <w:rPr>
+                <w:rFonts w:ascii="Arial" w:eastAsia="Times New Roman" w:hAnsi="Arial" w:cs="Arial"/>
+                <w:color w:val="000000"/>
+                <w:kern w:val="0"/>
+                <w:sz w:val="16"/>
+                <w:szCs w:val="16"/>
+                <w14:ligatures w14:val="none"/>
+              </w:rPr>
+              <w:t>from the body of our manuscript</w:t>
+            </w:r>
+            <w:r>
+              <w:rPr>
+                <w:rFonts w:ascii="Arial" w:eastAsia="Times New Roman" w:hAnsi="Arial" w:cs="Arial"/>
+                <w:color w:val="000000"/>
+                <w:kern w:val="0"/>
+                <w:sz w:val="16"/>
+                <w:szCs w:val="16"/>
+                <w14:ligatures w14:val="none"/>
+              </w:rPr>
+              <w:t xml:space="preserve">, </w:t>
+            </w:r>
+            <w:r>
+              <w:rPr>
+                <w:rFonts w:ascii="Arial" w:eastAsia="Times New Roman" w:hAnsi="Arial" w:cs="Arial"/>
+                <w:color w:val="000000"/>
+                <w:kern w:val="0"/>
+                <w:sz w:val="16"/>
+                <w:szCs w:val="16"/>
+                <w14:ligatures w14:val="none"/>
+              </w:rPr>
+              <w:t xml:space="preserve">except as appropriate for technical terms. We have also removed all italics from </w:t>
+            </w:r>
+            <w:r>
+              <w:rPr>
+                <w:rFonts w:ascii="Arial" w:eastAsia="Times New Roman" w:hAnsi="Arial" w:cs="Arial"/>
+                <w:color w:val="000000"/>
+                <w:kern w:val="0"/>
+                <w:sz w:val="16"/>
+                <w:szCs w:val="16"/>
+                <w14:ligatures w14:val="none"/>
+              </w:rPr>
+              <w:t xml:space="preserve">our manuscript and figures, </w:t>
+            </w:r>
+            <w:r>
+              <w:rPr>
+                <w:rFonts w:ascii="Arial" w:eastAsia="Times New Roman" w:hAnsi="Arial" w:cs="Arial"/>
+                <w:color w:val="000000"/>
+                <w:kern w:val="0"/>
+                <w:sz w:val="16"/>
+                <w:szCs w:val="16"/>
+                <w14:ligatures w14:val="none"/>
+              </w:rPr>
+              <w:t xml:space="preserve">except for the titles of the two lectures participants </w:t>
+            </w:r>
+            <w:r>
+              <w:rPr>
+                <w:rFonts w:ascii="Arial" w:eastAsia="Times New Roman" w:hAnsi="Arial" w:cs="Arial"/>
+                <w:color w:val="000000"/>
+                <w:kern w:val="0"/>
+                <w:sz w:val="16"/>
+                <w:szCs w:val="16"/>
+                <w14:ligatures w14:val="none"/>
+              </w:rPr>
+              <w:t xml:space="preserve">viewed </w:t>
+            </w:r>
+            <w:r>
+              <w:rPr>
+                <w:rFonts w:ascii="Arial" w:eastAsia="Times New Roman" w:hAnsi="Arial" w:cs="Arial"/>
+                <w:color w:val="000000"/>
+                <w:kern w:val="0"/>
+                <w:sz w:val="16"/>
+                <w:szCs w:val="16"/>
+                <w14:ligatures w14:val="none"/>
+              </w:rPr>
+              <w:t>in our study, which we believe should be italicized.</w:t>
+            </w:r>
           </w:p>
         </w:tc>
       </w:tr>
@@ -3414,6 +3628,28 @@
                 <w14:ligatures w14:val="none"/>
               </w:rPr>
             </w:pPr>
+            <w:r>
+              <w:rPr>
+                <w:rFonts w:ascii="Arial" w:eastAsia="Times New Roman" w:hAnsi="Arial" w:cs="Arial"/>
+                <w:color w:val="000000"/>
+                <w:kern w:val="0"/>
+                <w:sz w:val="16"/>
+                <w:szCs w:val="16"/>
+                <w14:ligatures w14:val="none"/>
+              </w:rPr>
+              <w:t xml:space="preserve">We confirm that all mathematical terms </w:t>
+            </w:r>
+            <w:r>
+              <w:rPr>
+                <w:rFonts w:ascii="Arial" w:eastAsia="Times New Roman" w:hAnsi="Arial" w:cs="Arial"/>
+                <w:color w:val="000000"/>
+                <w:kern w:val="0"/>
+                <w:sz w:val="16"/>
+                <w:szCs w:val="16"/>
+                <w14:ligatures w14:val="none"/>
+              </w:rPr>
+              <w:t>appearing in text, figures, tables, and legends throughout our manuscript and Supplementary Information file conform to these guidelines. All equations in the main text are supplied in editable format in our LaTeX source file.</w:t>
+            </w:r>
           </w:p>
         </w:tc>
       </w:tr>
@@ -3481,6 +3717,17 @@
                 <w14:ligatures w14:val="none"/>
               </w:rPr>
             </w:pPr>
+            <w:r>
+              <w:rPr>
+                <w:rFonts w:ascii="Arial" w:eastAsia="Times New Roman" w:hAnsi="Arial" w:cs="Arial"/>
+                <w:color w:val="000000"/>
+                <w:kern w:val="0"/>
+                <w:sz w:val="16"/>
+                <w:szCs w:val="16"/>
+                <w14:ligatures w14:val="none"/>
+              </w:rPr>
+              <w:t>Done.</w:t>
+            </w:r>
           </w:p>
         </w:tc>
       </w:tr>
@@ -3544,7 +3791,18 @@
                 <w14:ligatures w14:val="none"/>
               </w:rPr>
               <w:br/>
-              <w:t xml:space="preserve">Null effect interpretations should be based on appropriate statistical tests (e.g., Bayes Factors or equivalence tests).  </w:t>
+              <w:t>Null effect interpretations should be based on appropriate statistical tests (e.g., Bayes Factors or equivalence tests).</w:t>
+            </w:r>
+            <w:r>
+              <w:rPr>
+                <w:rFonts w:ascii="Arial" w:eastAsia="Times New Roman" w:hAnsi="Arial" w:cs="Arial"/>
+                <w:color w:val="000000"/>
+                <w:kern w:val="0"/>
+                <w:sz w:val="16"/>
+                <w:szCs w:val="16"/>
+                <w14:ligatures w14:val="none"/>
+              </w:rPr>
+              <w:t xml:space="preserve">  </w:t>
             </w:r>
           </w:p>
         </w:tc>
@@ -3572,6 +3830,72 @@
                 <w14:ligatures w14:val="none"/>
               </w:rPr>
             </w:pPr>
+            <w:r>
+              <w:rPr>
+                <w:rFonts w:ascii="Arial" w:eastAsia="Times New Roman" w:hAnsi="Arial" w:cs="Arial"/>
+                <w:color w:val="000000"/>
+                <w:kern w:val="0"/>
+                <w:sz w:val="16"/>
+                <w:szCs w:val="16"/>
+                <w14:ligatures w14:val="none"/>
+              </w:rPr>
+              <w:t xml:space="preserve">We </w:t>
+            </w:r>
+            <w:r>
+              <w:rPr>
+                <w:rFonts w:ascii="Arial" w:eastAsia="Times New Roman" w:hAnsi="Arial" w:cs="Arial"/>
+                <w:color w:val="000000"/>
+                <w:kern w:val="0"/>
+                <w:sz w:val="16"/>
+                <w:szCs w:val="16"/>
+                <w14:ligatures w14:val="none"/>
+              </w:rPr>
+              <w:t xml:space="preserve">have </w:t>
+            </w:r>
+            <w:r>
+              <w:rPr>
+                <w:rFonts w:ascii="Arial" w:eastAsia="Times New Roman" w:hAnsi="Arial" w:cs="Arial"/>
+                <w:color w:val="000000"/>
+                <w:kern w:val="0"/>
+                <w:sz w:val="16"/>
+                <w:szCs w:val="16"/>
+                <w14:ligatures w14:val="none"/>
+              </w:rPr>
+              <w:t>confirm</w:t>
+            </w:r>
+            <w:r>
+              <w:rPr>
+                <w:rFonts w:ascii="Arial" w:eastAsia="Times New Roman" w:hAnsi="Arial" w:cs="Arial"/>
+                <w:color w:val="000000"/>
+                <w:kern w:val="0"/>
+                <w:sz w:val="16"/>
+                <w:szCs w:val="16"/>
+                <w14:ligatures w14:val="none"/>
+              </w:rPr>
+              <w:t>ed</w:t>
+            </w:r>
+            <w:r>
+              <w:rPr>
+                <w:rFonts w:ascii="Arial" w:eastAsia="Times New Roman" w:hAnsi="Arial" w:cs="Arial"/>
+                <w:color w:val="000000"/>
+                <w:kern w:val="0"/>
+                <w:sz w:val="16"/>
+                <w:szCs w:val="16"/>
+                <w14:ligatures w14:val="none"/>
+              </w:rPr>
+              <w:t xml:space="preserve"> that our reporting and interpretation of statistical results conforms </w:t>
+            </w:r>
+            <w:r>
+              <w:rPr>
+                <w:rFonts w:ascii="Arial" w:eastAsia="Times New Roman" w:hAnsi="Arial" w:cs="Arial"/>
+                <w:color w:val="000000"/>
+                <w:kern w:val="0"/>
+                <w:sz w:val="16"/>
+                <w:szCs w:val="16"/>
+                <w14:ligatures w14:val="none"/>
+              </w:rPr>
+              <w:t>to these guidelines.</w:t>
+            </w:r>
           </w:p>
         </w:tc>
       </w:tr>
@@ -3639,6 +3963,17 @@
                 <w14:ligatures w14:val="none"/>
               </w:rPr>
             </w:pPr>
+            <w:r>
+              <w:rPr>
+                <w:rFonts w:ascii="Arial" w:eastAsia="Times New Roman" w:hAnsi="Arial" w:cs="Arial"/>
+                <w:color w:val="000000"/>
+                <w:kern w:val="0"/>
+                <w:sz w:val="16"/>
+                <w:szCs w:val="16"/>
+                <w14:ligatures w14:val="none"/>
+              </w:rPr>
+              <w:t>Done.</w:t>
+            </w:r>
           </w:p>
         </w:tc>
       </w:tr>
@@ -3706,6 +4041,17 @@
                 <w14:ligatures w14:val="none"/>
               </w:rPr>
             </w:pPr>
+            <w:r>
+              <w:rPr>
+                <w:rFonts w:ascii="Arial" w:eastAsia="Times New Roman" w:hAnsi="Arial" w:cs="Arial"/>
+                <w:color w:val="000000"/>
+                <w:kern w:val="0"/>
+                <w:sz w:val="16"/>
+                <w:szCs w:val="16"/>
+                <w14:ligatures w14:val="none"/>
+              </w:rPr>
+              <w:t>We have renamed our “Supplementary results” section to “Supplementary discussion” to comply with this guideline. We refer to this section in the Discussion section of our main manuscript.</w:t>
+            </w:r>
           </w:p>
         </w:tc>
       </w:tr>
@@ -3773,6 +4119,578 @@
                 <w14:ligatures w14:val="none"/>
               </w:rPr>
             </w:pPr>
+            <w:r>
+              <w:rPr>
+                <w:rFonts w:ascii="Arial" w:eastAsia="Times New Roman" w:hAnsi="Arial" w:cs="Arial"/>
+                <w:color w:val="000000"/>
+                <w:kern w:val="0"/>
+                <w:sz w:val="16"/>
+                <w:szCs w:val="16"/>
+                <w14:ligatures w14:val="none"/>
+              </w:rPr>
+              <w:t xml:space="preserve">Khan Academy content is </w:t>
+            </w:r>
+            <w:r>
+              <w:rPr>
+                <w:rFonts w:ascii="Arial" w:eastAsia="Times New Roman" w:hAnsi="Arial" w:cs="Arial"/>
+                <w:color w:val="000000"/>
+                <w:kern w:val="0"/>
+                <w:sz w:val="16"/>
+                <w:szCs w:val="16"/>
+                <w14:ligatures w14:val="none"/>
+              </w:rPr>
+              <w:t>provided under a Creative Commons license</w:t>
+            </w:r>
+            <w:r>
+              <w:rPr>
+                <w:rFonts w:ascii="Arial" w:eastAsia="Times New Roman" w:hAnsi="Arial" w:cs="Arial"/>
+                <w:color w:val="000000"/>
+                <w:kern w:val="0"/>
+                <w:sz w:val="16"/>
+                <w:szCs w:val="16"/>
+                <w14:ligatures w14:val="none"/>
+              </w:rPr>
+              <w:t xml:space="preserve">, and we have included the attribution statement </w:t>
+            </w:r>
+            <w:r>
+              <w:rPr>
+                <w:rFonts w:ascii="Arial" w:eastAsia="Times New Roman" w:hAnsi="Arial" w:cs="Arial"/>
+                <w:color w:val="000000"/>
+                <w:kern w:val="0"/>
+                <w:sz w:val="16"/>
+                <w:szCs w:val="16"/>
+                <w14:ligatures w14:val="none"/>
+              </w:rPr>
+              <w:t xml:space="preserve">requested by </w:t>
+            </w:r>
+            <w:r>
+              <w:rPr>
+                <w:rFonts w:ascii="Arial" w:eastAsia="Times New Roman" w:hAnsi="Arial" w:cs="Arial"/>
+                <w:color w:val="000000"/>
+                <w:kern w:val="0"/>
+                <w:sz w:val="16"/>
+                <w:szCs w:val="16"/>
+                <w14:ligatures w14:val="none"/>
+              </w:rPr>
+              <w:t>Khan Academy in our Data availability section.</w:t>
+            </w:r>
+            <w:r>
+              <w:rPr>
+                <w:rFonts w:ascii="Arial" w:eastAsia="Times New Roman" w:hAnsi="Arial" w:cs="Arial"/>
+                <w:color w:val="000000"/>
+                <w:kern w:val="0"/>
+                <w:sz w:val="16"/>
+                <w:szCs w:val="16"/>
+                <w14:ligatures w14:val="none"/>
+              </w:rPr>
+              <w:t xml:space="preserve"> </w:t>
+            </w:r>
+            <w:r>
+              <w:rPr>
+                <w:rFonts w:ascii="Arial" w:eastAsia="Times New Roman" w:hAnsi="Arial" w:cs="Arial"/>
+                <w:color w:val="000000"/>
+                <w:kern w:val="0"/>
+                <w:sz w:val="16"/>
+                <w:szCs w:val="16"/>
+                <w14:ligatures w14:val="none"/>
+              </w:rPr>
+              <w:t>In addition</w:t>
+            </w:r>
+            <w:r>
+              <w:rPr>
+                <w:rFonts w:ascii="Arial" w:eastAsia="Times New Roman" w:hAnsi="Arial" w:cs="Arial"/>
+                <w:color w:val="000000"/>
+                <w:kern w:val="0"/>
+                <w:sz w:val="16"/>
+                <w:szCs w:val="16"/>
+                <w14:ligatures w14:val="none"/>
+              </w:rPr>
+              <w:t>, w</w:t>
+            </w:r>
+            <w:r>
+              <w:rPr>
+                <w:rFonts w:ascii="Arial" w:eastAsia="Times New Roman" w:hAnsi="Arial" w:cs="Arial"/>
+                <w:color w:val="000000"/>
+                <w:kern w:val="0"/>
+                <w:sz w:val="16"/>
+                <w:szCs w:val="16"/>
+                <w14:ligatures w14:val="none"/>
+              </w:rPr>
+              <w:t xml:space="preserve">e believe the </w:t>
+            </w:r>
+            <w:r>
+              <w:rPr>
+                <w:rFonts w:ascii="Arial" w:eastAsia="Times New Roman" w:hAnsi="Arial" w:cs="Arial"/>
+                <w:color w:val="000000"/>
+                <w:kern w:val="0"/>
+                <w:sz w:val="16"/>
+                <w:szCs w:val="16"/>
+                <w14:ligatures w14:val="none"/>
+              </w:rPr>
+              <w:t xml:space="preserve">inclusion of </w:t>
+            </w:r>
+            <w:r>
+              <w:rPr>
+                <w:rFonts w:ascii="Arial" w:eastAsia="Times New Roman" w:hAnsi="Arial" w:cs="Arial"/>
+                <w:color w:val="000000"/>
+                <w:kern w:val="0"/>
+                <w:sz w:val="16"/>
+                <w:szCs w:val="16"/>
+                <w14:ligatures w14:val="none"/>
+              </w:rPr>
+              <w:t>limited</w:t>
+            </w:r>
+            <w:r>
+              <w:rPr>
+                <w:rFonts w:ascii="Arial" w:eastAsia="Times New Roman" w:hAnsi="Arial" w:cs="Arial"/>
+                <w:color w:val="000000"/>
+                <w:kern w:val="0"/>
+                <w:sz w:val="16"/>
+                <w:szCs w:val="16"/>
+                <w14:ligatures w14:val="none"/>
+              </w:rPr>
+              <w:t xml:space="preserve"> excerpts </w:t>
+            </w:r>
+            <w:r>
+              <w:rPr>
+                <w:rFonts w:ascii="Arial" w:eastAsia="Times New Roman" w:hAnsi="Arial" w:cs="Arial"/>
+                <w:color w:val="000000"/>
+                <w:kern w:val="0"/>
+                <w:sz w:val="16"/>
+                <w:szCs w:val="16"/>
+                <w14:ligatures w14:val="none"/>
+              </w:rPr>
+              <w:t>from</w:t>
+            </w:r>
+            <w:r>
+              <w:rPr>
+                <w:rFonts w:ascii="Arial" w:eastAsia="Times New Roman" w:hAnsi="Arial" w:cs="Arial"/>
+                <w:color w:val="000000"/>
+                <w:kern w:val="0"/>
+                <w:sz w:val="16"/>
+                <w:szCs w:val="16"/>
+                <w14:ligatures w14:val="none"/>
+              </w:rPr>
+              <w:t xml:space="preserve"> the lecture transcripts in certain tables &amp; figures qualifies </w:t>
+            </w:r>
+            <w:r>
+              <w:rPr>
+                <w:rFonts w:ascii="Arial" w:eastAsia="Times New Roman" w:hAnsi="Arial" w:cs="Arial"/>
+                <w:color w:val="000000"/>
+                <w:kern w:val="0"/>
+                <w:sz w:val="16"/>
+                <w:szCs w:val="16"/>
+                <w14:ligatures w14:val="none"/>
+              </w:rPr>
+              <w:t>under scholarly Fair Use</w:t>
+            </w:r>
+            <w:r>
+              <w:rPr>
+                <w:rFonts w:ascii="Arial" w:eastAsia="Times New Roman" w:hAnsi="Arial" w:cs="Arial"/>
+                <w:color w:val="000000"/>
+                <w:kern w:val="0"/>
+                <w:sz w:val="16"/>
+                <w:szCs w:val="16"/>
+                <w14:ligatures w14:val="none"/>
+              </w:rPr>
+              <w:t xml:space="preserve">, as </w:t>
+            </w:r>
+            <w:r>
+              <w:rPr>
+                <w:rFonts w:ascii="Arial" w:eastAsia="Times New Roman" w:hAnsi="Arial" w:cs="Arial"/>
+                <w:color w:val="000000"/>
+                <w:kern w:val="0"/>
+                <w:sz w:val="16"/>
+                <w:szCs w:val="16"/>
+                <w14:ligatures w14:val="none"/>
+              </w:rPr>
+              <w:t xml:space="preserve">these </w:t>
+            </w:r>
+            <w:r>
+              <w:rPr>
+                <w:rFonts w:ascii="Arial" w:eastAsia="Times New Roman" w:hAnsi="Arial" w:cs="Arial"/>
+                <w:color w:val="000000"/>
+                <w:kern w:val="0"/>
+                <w:sz w:val="16"/>
+                <w:szCs w:val="16"/>
+                <w14:ligatures w14:val="none"/>
+              </w:rPr>
+              <w:t xml:space="preserve">minimal </w:t>
+            </w:r>
+            <w:r>
+              <w:rPr>
+                <w:rFonts w:ascii="Arial" w:eastAsia="Times New Roman" w:hAnsi="Arial" w:cs="Arial"/>
+                <w:color w:val="000000"/>
+                <w:kern w:val="0"/>
+                <w:sz w:val="16"/>
+                <w:szCs w:val="16"/>
+                <w14:ligatures w14:val="none"/>
+              </w:rPr>
+              <w:t>examples</w:t>
+            </w:r>
+            <w:r>
+              <w:rPr>
+                <w:rFonts w:ascii="Arial" w:eastAsia="Times New Roman" w:hAnsi="Arial" w:cs="Arial"/>
+                <w:color w:val="000000"/>
+                <w:kern w:val="0"/>
+                <w:sz w:val="16"/>
+                <w:szCs w:val="16"/>
+                <w14:ligatures w14:val="none"/>
+              </w:rPr>
+              <w:t xml:space="preserve"> </w:t>
+            </w:r>
+            <w:r>
+              <w:rPr>
+                <w:rFonts w:ascii="Arial" w:eastAsia="Times New Roman" w:hAnsi="Arial" w:cs="Arial"/>
+                <w:color w:val="000000"/>
+                <w:kern w:val="0"/>
+                <w:sz w:val="16"/>
+                <w:szCs w:val="16"/>
+                <w14:ligatures w14:val="none"/>
+              </w:rPr>
+              <w:t xml:space="preserve">(1) </w:t>
+            </w:r>
+            <w:r>
+              <w:rPr>
+                <w:rFonts w:ascii="Arial" w:eastAsia="Times New Roman" w:hAnsi="Arial" w:cs="Arial"/>
+                <w:color w:val="000000"/>
+                <w:kern w:val="0"/>
+                <w:sz w:val="16"/>
+                <w:szCs w:val="16"/>
+                <w14:ligatures w14:val="none"/>
+              </w:rPr>
+              <w:t xml:space="preserve">are essential </w:t>
+            </w:r>
+            <w:r>
+              <w:rPr>
+                <w:rFonts w:ascii="Arial" w:eastAsia="Times New Roman" w:hAnsi="Arial" w:cs="Arial"/>
+                <w:color w:val="000000"/>
+                <w:kern w:val="0"/>
+                <w:sz w:val="16"/>
+                <w:szCs w:val="16"/>
+                <w14:ligatures w14:val="none"/>
+              </w:rPr>
+              <w:t xml:space="preserve">for </w:t>
+            </w:r>
+            <w:r>
+              <w:rPr>
+                <w:rFonts w:ascii="Arial" w:eastAsia="Times New Roman" w:hAnsi="Arial" w:cs="Arial"/>
+                <w:color w:val="000000"/>
+                <w:kern w:val="0"/>
+                <w:sz w:val="16"/>
+                <w:szCs w:val="16"/>
+                <w14:ligatures w14:val="none"/>
+              </w:rPr>
+              <w:t xml:space="preserve">readers to </w:t>
+            </w:r>
+            <w:r>
+              <w:rPr>
+                <w:rFonts w:ascii="Arial" w:eastAsia="Times New Roman" w:hAnsi="Arial" w:cs="Arial"/>
+                <w:color w:val="000000"/>
+                <w:kern w:val="0"/>
+                <w:sz w:val="16"/>
+                <w:szCs w:val="16"/>
+                <w14:ligatures w14:val="none"/>
+              </w:rPr>
+              <w:t xml:space="preserve">understand our approach and assess its validity, </w:t>
+            </w:r>
+            <w:r>
+              <w:rPr>
+                <w:rFonts w:ascii="Arial" w:eastAsia="Times New Roman" w:hAnsi="Arial" w:cs="Arial"/>
+                <w:color w:val="000000"/>
+                <w:kern w:val="0"/>
+                <w:sz w:val="16"/>
+                <w:szCs w:val="16"/>
+                <w14:ligatures w14:val="none"/>
+              </w:rPr>
+              <w:t xml:space="preserve">(2) </w:t>
+            </w:r>
+            <w:r>
+              <w:rPr>
+                <w:rFonts w:ascii="Arial" w:eastAsia="Times New Roman" w:hAnsi="Arial" w:cs="Arial"/>
+                <w:color w:val="000000"/>
+                <w:kern w:val="0"/>
+                <w:sz w:val="16"/>
+                <w:szCs w:val="16"/>
+                <w14:ligatures w14:val="none"/>
+              </w:rPr>
+              <w:t xml:space="preserve">are presented for a transformative purpose (i.e., </w:t>
+            </w:r>
+            <w:r>
+              <w:rPr>
+                <w:rFonts w:ascii="Arial" w:eastAsia="Times New Roman" w:hAnsi="Arial" w:cs="Arial"/>
+                <w:color w:val="000000"/>
+                <w:kern w:val="0"/>
+                <w:sz w:val="16"/>
+                <w:szCs w:val="16"/>
+                <w14:ligatures w14:val="none"/>
+              </w:rPr>
+              <w:t xml:space="preserve">conveying </w:t>
+            </w:r>
+            <w:r>
+              <w:rPr>
+                <w:rFonts w:ascii="Arial" w:eastAsia="Times New Roman" w:hAnsi="Arial" w:cs="Arial"/>
+                <w:color w:val="000000"/>
+                <w:kern w:val="0"/>
+                <w:sz w:val="16"/>
+                <w:szCs w:val="16"/>
+                <w14:ligatures w14:val="none"/>
+              </w:rPr>
+              <w:t xml:space="preserve">the </w:t>
+            </w:r>
+            <w:r>
+              <w:rPr>
+                <w:rFonts w:ascii="Arial" w:eastAsia="Times New Roman" w:hAnsi="Arial" w:cs="Arial"/>
+                <w:color w:val="000000"/>
+                <w:kern w:val="0"/>
+                <w:sz w:val="16"/>
+                <w:szCs w:val="16"/>
+                <w14:ligatures w14:val="none"/>
+              </w:rPr>
+              <w:t xml:space="preserve">results </w:t>
+            </w:r>
+            <w:r>
+              <w:rPr>
+                <w:rFonts w:ascii="Arial" w:eastAsia="Times New Roman" w:hAnsi="Arial" w:cs="Arial"/>
+                <w:color w:val="000000"/>
+                <w:kern w:val="0"/>
+                <w:sz w:val="16"/>
+                <w:szCs w:val="16"/>
+                <w14:ligatures w14:val="none"/>
+              </w:rPr>
+              <w:t xml:space="preserve">of scientific analyses </w:t>
+            </w:r>
+            <w:r>
+              <w:rPr>
+                <w:rFonts w:ascii="Arial" w:eastAsia="Times New Roman" w:hAnsi="Arial" w:cs="Arial"/>
+                <w:color w:val="000000"/>
+                <w:kern w:val="0"/>
+                <w:sz w:val="16"/>
+                <w:szCs w:val="16"/>
+                <w14:ligatures w14:val="none"/>
+              </w:rPr>
+              <w:t xml:space="preserve">rather than teaching </w:t>
+            </w:r>
+            <w:r>
+              <w:rPr>
+                <w:rFonts w:ascii="Arial" w:eastAsia="Times New Roman" w:hAnsi="Arial" w:cs="Arial"/>
+                <w:color w:val="000000"/>
+                <w:kern w:val="0"/>
+                <w:sz w:val="16"/>
+                <w:szCs w:val="16"/>
+                <w14:ligatures w14:val="none"/>
+              </w:rPr>
+              <w:t xml:space="preserve">the </w:t>
+            </w:r>
+            <w:r>
+              <w:rPr>
+                <w:rFonts w:ascii="Arial" w:eastAsia="Times New Roman" w:hAnsi="Arial" w:cs="Arial"/>
+                <w:color w:val="000000"/>
+                <w:kern w:val="0"/>
+                <w:sz w:val="16"/>
+                <w:szCs w:val="16"/>
+                <w14:ligatures w14:val="none"/>
+              </w:rPr>
+              <w:t>content</w:t>
+            </w:r>
+            <w:r>
+              <w:rPr>
+                <w:rFonts w:ascii="Arial" w:eastAsia="Times New Roman" w:hAnsi="Arial" w:cs="Arial"/>
+                <w:color w:val="000000"/>
+                <w:kern w:val="0"/>
+                <w:sz w:val="16"/>
+                <w:szCs w:val="16"/>
+                <w14:ligatures w14:val="none"/>
+              </w:rPr>
+              <w:t xml:space="preserve"> of the lectures themselves</w:t>
+            </w:r>
+            <w:r>
+              <w:rPr>
+                <w:rFonts w:ascii="Arial" w:eastAsia="Times New Roman" w:hAnsi="Arial" w:cs="Arial"/>
+                <w:color w:val="000000"/>
+                <w:kern w:val="0"/>
+                <w:sz w:val="16"/>
+                <w:szCs w:val="16"/>
+                <w14:ligatures w14:val="none"/>
+              </w:rPr>
+              <w:t xml:space="preserve">), </w:t>
+            </w:r>
+            <w:r>
+              <w:rPr>
+                <w:rFonts w:ascii="Arial" w:eastAsia="Times New Roman" w:hAnsi="Arial" w:cs="Arial"/>
+                <w:color w:val="000000"/>
+                <w:kern w:val="0"/>
+                <w:sz w:val="16"/>
+                <w:szCs w:val="16"/>
+                <w14:ligatures w14:val="none"/>
+              </w:rPr>
+              <w:t xml:space="preserve">and </w:t>
+            </w:r>
+            <w:r>
+              <w:rPr>
+                <w:rFonts w:ascii="Arial" w:eastAsia="Times New Roman" w:hAnsi="Arial" w:cs="Arial"/>
+                <w:color w:val="000000"/>
+                <w:kern w:val="0"/>
+                <w:sz w:val="16"/>
+                <w:szCs w:val="16"/>
+                <w14:ligatures w14:val="none"/>
+              </w:rPr>
+              <w:t xml:space="preserve">(3) </w:t>
+            </w:r>
+            <w:r>
+              <w:rPr>
+                <w:rFonts w:ascii="Arial" w:eastAsia="Times New Roman" w:hAnsi="Arial" w:cs="Arial"/>
+                <w:color w:val="000000"/>
+                <w:kern w:val="0"/>
+                <w:sz w:val="16"/>
+                <w:szCs w:val="16"/>
+                <w14:ligatures w14:val="none"/>
+              </w:rPr>
+              <w:t xml:space="preserve">could not serve as a </w:t>
+            </w:r>
+            <w:r>
+              <w:rPr>
+                <w:rFonts w:ascii="Arial" w:eastAsia="Times New Roman" w:hAnsi="Arial" w:cs="Arial"/>
+                <w:color w:val="000000"/>
+                <w:kern w:val="0"/>
+                <w:sz w:val="16"/>
+                <w:szCs w:val="16"/>
+                <w14:ligatures w14:val="none"/>
+              </w:rPr>
+              <w:t>substitute</w:t>
+            </w:r>
+            <w:r>
+              <w:rPr>
+                <w:rFonts w:ascii="Arial" w:eastAsia="Times New Roman" w:hAnsi="Arial" w:cs="Arial"/>
+                <w:color w:val="000000"/>
+                <w:kern w:val="0"/>
+                <w:sz w:val="16"/>
+                <w:szCs w:val="16"/>
+                <w14:ligatures w14:val="none"/>
+              </w:rPr>
+              <w:t xml:space="preserve"> for </w:t>
+            </w:r>
+            <w:r>
+              <w:rPr>
+                <w:rFonts w:ascii="Arial" w:eastAsia="Times New Roman" w:hAnsi="Arial" w:cs="Arial"/>
+                <w:color w:val="000000"/>
+                <w:kern w:val="0"/>
+                <w:sz w:val="16"/>
+                <w:szCs w:val="16"/>
+                <w14:ligatures w14:val="none"/>
+              </w:rPr>
+              <w:t xml:space="preserve">viewing </w:t>
+            </w:r>
+            <w:r>
+              <w:rPr>
+                <w:rFonts w:ascii="Arial" w:eastAsia="Times New Roman" w:hAnsi="Arial" w:cs="Arial"/>
+                <w:color w:val="000000"/>
+                <w:kern w:val="0"/>
+                <w:sz w:val="16"/>
+                <w:szCs w:val="16"/>
+                <w14:ligatures w14:val="none"/>
+              </w:rPr>
+              <w:t xml:space="preserve">the original </w:t>
+            </w:r>
+            <w:r>
+              <w:rPr>
+                <w:rFonts w:ascii="Arial" w:eastAsia="Times New Roman" w:hAnsi="Arial" w:cs="Arial"/>
+                <w:color w:val="000000"/>
+                <w:kern w:val="0"/>
+                <w:sz w:val="16"/>
+                <w:szCs w:val="16"/>
+                <w14:ligatures w14:val="none"/>
+              </w:rPr>
+              <w:t>lecture</w:t>
+            </w:r>
+            <w:r>
+              <w:rPr>
+                <w:rFonts w:ascii="Arial" w:eastAsia="Times New Roman" w:hAnsi="Arial" w:cs="Arial"/>
+                <w:color w:val="000000"/>
+                <w:kern w:val="0"/>
+                <w:sz w:val="16"/>
+                <w:szCs w:val="16"/>
+                <w14:ligatures w14:val="none"/>
+              </w:rPr>
+              <w:t>s</w:t>
+            </w:r>
+            <w:r>
+              <w:rPr>
+                <w:rFonts w:ascii="Arial" w:eastAsia="Times New Roman" w:hAnsi="Arial" w:cs="Arial"/>
+                <w:color w:val="000000"/>
+                <w:kern w:val="0"/>
+                <w:sz w:val="16"/>
+                <w:szCs w:val="16"/>
+                <w14:ligatures w14:val="none"/>
+              </w:rPr>
+              <w:t xml:space="preserve"> </w:t>
+            </w:r>
+            <w:r>
+              <w:rPr>
+                <w:rFonts w:ascii="Arial" w:eastAsia="Times New Roman" w:hAnsi="Arial" w:cs="Arial"/>
+                <w:color w:val="000000"/>
+                <w:kern w:val="0"/>
+                <w:sz w:val="16"/>
+                <w:szCs w:val="16"/>
+                <w14:ligatures w14:val="none"/>
+              </w:rPr>
+              <w:t xml:space="preserve">and </w:t>
+            </w:r>
+            <w:r>
+              <w:rPr>
+                <w:rFonts w:ascii="Arial" w:eastAsia="Times New Roman" w:hAnsi="Arial" w:cs="Arial"/>
+                <w:color w:val="000000"/>
+                <w:kern w:val="0"/>
+                <w:sz w:val="16"/>
+                <w:szCs w:val="16"/>
+                <w14:ligatures w14:val="none"/>
+              </w:rPr>
+              <w:t xml:space="preserve">therefore </w:t>
+            </w:r>
+            <w:r>
+              <w:rPr>
+                <w:rFonts w:ascii="Arial" w:eastAsia="Times New Roman" w:hAnsi="Arial" w:cs="Arial"/>
+                <w:color w:val="000000"/>
+                <w:kern w:val="0"/>
+                <w:sz w:val="16"/>
+                <w:szCs w:val="16"/>
+                <w14:ligatures w14:val="none"/>
+              </w:rPr>
+              <w:t>pose no risk</w:t>
+            </w:r>
+            <w:r>
+              <w:rPr>
+                <w:rFonts w:ascii="Arial" w:eastAsia="Times New Roman" w:hAnsi="Arial" w:cs="Arial"/>
+                <w:color w:val="000000"/>
+                <w:kern w:val="0"/>
+                <w:sz w:val="16"/>
+                <w:szCs w:val="16"/>
+                <w14:ligatures w14:val="none"/>
+              </w:rPr>
+              <w:t xml:space="preserve"> of </w:t>
+            </w:r>
+            <w:r>
+              <w:rPr>
+                <w:rFonts w:ascii="Arial" w:eastAsia="Times New Roman" w:hAnsi="Arial" w:cs="Arial"/>
+                <w:color w:val="000000"/>
+                <w:kern w:val="0"/>
+                <w:sz w:val="16"/>
+                <w:szCs w:val="16"/>
+                <w14:ligatures w14:val="none"/>
+              </w:rPr>
+              <w:t>diminishing the commercial value or intended use of the underlying Khan Academy materials</w:t>
+            </w:r>
+            <w:r>
+              <w:rPr>
+                <w:rFonts w:ascii="Arial" w:eastAsia="Times New Roman" w:hAnsi="Arial" w:cs="Arial"/>
+                <w:color w:val="000000"/>
+                <w:kern w:val="0"/>
+                <w:sz w:val="16"/>
+                <w:szCs w:val="16"/>
+                <w14:ligatures w14:val="none"/>
+              </w:rPr>
+              <w:t>.</w:t>
+            </w:r>
           </w:p>
         </w:tc>
       </w:tr>
@@ -4076,6 +4994,39 @@
                 <w14:ligatures w14:val="none"/>
               </w:rPr>
             </w:pPr>
+            <w:r>
+              <w:rPr>
+                <w:rFonts w:ascii="Arial" w:eastAsia="Times New Roman" w:hAnsi="Arial" w:cs="Arial"/>
+                <w:color w:val="000000"/>
+                <w:kern w:val="0"/>
+                <w:sz w:val="16"/>
+                <w:szCs w:val="16"/>
+                <w14:ligatures w14:val="none"/>
+              </w:rPr>
+              <w:t xml:space="preserve">We confirm that </w:t>
+            </w:r>
+            <w:r>
+              <w:rPr>
+                <w:rFonts w:ascii="Arial" w:eastAsia="Times New Roman" w:hAnsi="Arial" w:cs="Arial"/>
+                <w:color w:val="000000"/>
+                <w:kern w:val="0"/>
+                <w:sz w:val="16"/>
+                <w:szCs w:val="16"/>
+                <w14:ligatures w14:val="none"/>
+              </w:rPr>
+              <w:t xml:space="preserve">all figures </w:t>
+            </w:r>
+            <w:r>
+              <w:rPr>
+                <w:rFonts w:ascii="Arial" w:eastAsia="Times New Roman" w:hAnsi="Arial" w:cs="Arial"/>
+                <w:color w:val="000000"/>
+                <w:kern w:val="0"/>
+                <w:sz w:val="16"/>
+                <w:szCs w:val="16"/>
+                <w14:ligatures w14:val="none"/>
+              </w:rPr>
+              <w:t>conform to the guidelines linked below.</w:t>
+            </w:r>
           </w:p>
         </w:tc>
       </w:tr>
@@ -4279,15 +5230,46 @@
               <w:spacing w:after="0" w:line="240" w:lineRule="auto"/>
               <w:rPr>
                 <w:rFonts w:ascii="Arial" w:eastAsia="Times New Roman" w:hAnsi="Arial" w:cs="Arial"/>
-                <w:b/>
-                <w:bCs/>
-                <w:color w:val="000000"/>
-                <w:kern w:val="0"/>
-                <w:sz w:val="16"/>
-                <w:szCs w:val="16"/>
-                <w14:ligatures w14:val="none"/>
-              </w:rPr>
-            </w:pPr>
+                <w:color w:val="000000"/>
+                <w:kern w:val="0"/>
+                <w:sz w:val="16"/>
+                <w:szCs w:val="16"/>
+                <w14:ligatures w14:val="none"/>
+              </w:rPr>
+            </w:pPr>
+            <w:r>
+              <w:rPr>
+                <w:rFonts w:ascii="Arial" w:eastAsia="Times New Roman" w:hAnsi="Arial" w:cs="Arial"/>
+                <w:color w:val="000000"/>
+                <w:kern w:val="0"/>
+                <w:sz w:val="16"/>
+                <w:szCs w:val="16"/>
+                <w14:ligatures w14:val="none"/>
+              </w:rPr>
+              <w:t xml:space="preserve">We have revised </w:t>
+            </w:r>
+            <w:r>
+              <w:rPr>
+                <w:rFonts w:ascii="Arial" w:eastAsia="Times New Roman" w:hAnsi="Arial" w:cs="Arial"/>
+                <w:color w:val="000000"/>
+                <w:kern w:val="0"/>
+                <w:sz w:val="16"/>
+                <w:szCs w:val="16"/>
+                <w14:ligatures w14:val="none"/>
+              </w:rPr>
+              <w:t>Figure 5 to comply with this policy</w:t>
+            </w:r>
+            <w:r>
+              <w:rPr>
+                <w:rFonts w:ascii="Arial" w:eastAsia="Times New Roman" w:hAnsi="Arial" w:cs="Arial"/>
+                <w:color w:val="000000"/>
+                <w:kern w:val="0"/>
+                <w:sz w:val="16"/>
+                <w:szCs w:val="16"/>
+                <w14:ligatures w14:val="none"/>
+              </w:rPr>
+              <w:t>.</w:t>
+            </w:r>
           </w:p>
         </w:tc>
       </w:tr>
@@ -4379,6 +5361,39 @@
                 <w14:ligatures w14:val="none"/>
               </w:rPr>
             </w:pPr>
+            <w:r>
+              <w:rPr>
+                <w:rFonts w:ascii="Arial" w:eastAsia="Times New Roman" w:hAnsi="Arial" w:cs="Arial"/>
+                <w:color w:val="000000"/>
+                <w:kern w:val="0"/>
+                <w:sz w:val="16"/>
+                <w:szCs w:val="16"/>
+                <w14:ligatures w14:val="none"/>
+              </w:rPr>
+              <w:t xml:space="preserve">We confirm that our </w:t>
+            </w:r>
+            <w:r>
+              <w:rPr>
+                <w:rFonts w:ascii="Arial" w:eastAsia="Times New Roman" w:hAnsi="Arial" w:cs="Arial"/>
+                <w:color w:val="000000"/>
+                <w:kern w:val="0"/>
+                <w:sz w:val="16"/>
+                <w:szCs w:val="16"/>
+                <w14:ligatures w14:val="none"/>
+              </w:rPr>
+              <w:t>statistical reporting conforms to these guidelines</w:t>
+            </w:r>
+            <w:r>
+              <w:rPr>
+                <w:rFonts w:ascii="Arial" w:eastAsia="Times New Roman" w:hAnsi="Arial" w:cs="Arial"/>
+                <w:color w:val="000000"/>
+                <w:kern w:val="0"/>
+                <w:sz w:val="16"/>
+                <w:szCs w:val="16"/>
+                <w14:ligatures w14:val="none"/>
+              </w:rPr>
+              <w:t>.</w:t>
+            </w:r>
           </w:p>
         </w:tc>
       </w:tr>
@@ -4470,15 +5485,90 @@
               <w:spacing w:after="0" w:line="240" w:lineRule="auto"/>
               <w:rPr>
                 <w:rFonts w:ascii="Arial" w:eastAsia="Times New Roman" w:hAnsi="Arial" w:cs="Arial"/>
-                <w:b/>
-                <w:bCs/>
-                <w:color w:val="000000"/>
-                <w:kern w:val="0"/>
-                <w:sz w:val="16"/>
-                <w:szCs w:val="16"/>
-                <w14:ligatures w14:val="none"/>
-              </w:rPr>
-            </w:pPr>
+                <w:color w:val="000000"/>
+                <w:kern w:val="0"/>
+                <w:sz w:val="16"/>
+                <w:szCs w:val="16"/>
+                <w14:ligatures w14:val="none"/>
+              </w:rPr>
+            </w:pPr>
+            <w:r>
+              <w:rPr>
+                <w:rFonts w:ascii="Arial" w:eastAsia="Times New Roman" w:hAnsi="Arial" w:cs="Arial"/>
+                <w:color w:val="000000"/>
+                <w:kern w:val="0"/>
+                <w:sz w:val="16"/>
+                <w:szCs w:val="16"/>
+                <w14:ligatures w14:val="none"/>
+              </w:rPr>
+              <w:t xml:space="preserve">We have </w:t>
+            </w:r>
+            <w:r>
+              <w:rPr>
+                <w:rFonts w:ascii="Arial" w:eastAsia="Times New Roman" w:hAnsi="Arial" w:cs="Arial"/>
+                <w:color w:val="000000"/>
+                <w:kern w:val="0"/>
+                <w:sz w:val="16"/>
+                <w:szCs w:val="16"/>
+                <w14:ligatures w14:val="none"/>
+              </w:rPr>
+              <w:t xml:space="preserve">updated the </w:t>
+            </w:r>
+            <w:r>
+              <w:rPr>
+                <w:rFonts w:ascii="Arial" w:eastAsia="Times New Roman" w:hAnsi="Arial" w:cs="Arial"/>
+                <w:color w:val="000000"/>
+                <w:kern w:val="0"/>
+                <w:sz w:val="16"/>
+                <w:szCs w:val="16"/>
+                <w14:ligatures w14:val="none"/>
+              </w:rPr>
+              <w:t xml:space="preserve">legend </w:t>
+            </w:r>
+            <w:r>
+              <w:rPr>
+                <w:rFonts w:ascii="Arial" w:eastAsia="Times New Roman" w:hAnsi="Arial" w:cs="Arial"/>
+                <w:color w:val="000000"/>
+                <w:kern w:val="0"/>
+                <w:sz w:val="16"/>
+                <w:szCs w:val="16"/>
+                <w14:ligatures w14:val="none"/>
+              </w:rPr>
+              <w:t xml:space="preserve">for Figure 5 to </w:t>
+            </w:r>
+            <w:r>
+              <w:rPr>
+                <w:rFonts w:ascii="Arial" w:eastAsia="Times New Roman" w:hAnsi="Arial" w:cs="Arial"/>
+                <w:color w:val="000000"/>
+                <w:kern w:val="0"/>
+                <w:sz w:val="16"/>
+                <w:szCs w:val="16"/>
+                <w14:ligatures w14:val="none"/>
+              </w:rPr>
+              <w:t xml:space="preserve">note the number of </w:t>
+            </w:r>
+            <w:r>
+              <w:rPr>
+                <w:rFonts w:ascii="Arial" w:eastAsia="Times New Roman" w:hAnsi="Arial" w:cs="Arial"/>
+                <w:color w:val="000000"/>
+                <w:kern w:val="0"/>
+                <w:sz w:val="16"/>
+                <w:szCs w:val="16"/>
+                <w14:ligatures w14:val="none"/>
+              </w:rPr>
+              <w:t xml:space="preserve">samples (participants) </w:t>
+            </w:r>
+            <w:r>
+              <w:rPr>
+                <w:rFonts w:ascii="Arial" w:eastAsia="Times New Roman" w:hAnsi="Arial" w:cs="Arial"/>
+                <w:color w:val="000000"/>
+                <w:kern w:val="0"/>
+                <w:sz w:val="16"/>
+                <w:szCs w:val="16"/>
+                <w14:ligatures w14:val="none"/>
+              </w:rPr>
+              <w:t>used to derive the error ribbons in panels a &amp; c, and error bars in panels b &amp; d.</w:t>
+            </w:r>
           </w:p>
         </w:tc>
       </w:tr>
@@ -4611,15 +5701,79 @@
               <w:spacing w:after="240" w:line="240" w:lineRule="auto"/>
               <w:rPr>
                 <w:rFonts w:ascii="Arial" w:eastAsia="Times New Roman" w:hAnsi="Arial" w:cs="Arial"/>
-                <w:b/>
-                <w:bCs/>
-                <w:color w:val="000000"/>
-                <w:kern w:val="0"/>
-                <w:sz w:val="16"/>
-                <w:szCs w:val="16"/>
-                <w14:ligatures w14:val="none"/>
-              </w:rPr>
-            </w:pPr>
+                <w:color w:val="000000"/>
+                <w:kern w:val="0"/>
+                <w:sz w:val="16"/>
+                <w:szCs w:val="16"/>
+                <w14:ligatures w14:val="none"/>
+              </w:rPr>
+            </w:pPr>
+            <w:r>
+              <w:rPr>
+                <w:rFonts w:ascii="Arial" w:eastAsia="Times New Roman" w:hAnsi="Arial" w:cs="Arial"/>
+                <w:color w:val="000000"/>
+                <w:kern w:val="0"/>
+                <w:sz w:val="16"/>
+                <w:szCs w:val="16"/>
+                <w14:ligatures w14:val="none"/>
+              </w:rPr>
+              <w:t xml:space="preserve">We have updated the legends for each figure to </w:t>
+            </w:r>
+            <w:r>
+              <w:rPr>
+                <w:rFonts w:ascii="Arial" w:eastAsia="Times New Roman" w:hAnsi="Arial" w:cs="Arial"/>
+                <w:color w:val="000000"/>
+                <w:kern w:val="0"/>
+                <w:sz w:val="16"/>
+                <w:szCs w:val="16"/>
+                <w14:ligatures w14:val="none"/>
+              </w:rPr>
+              <w:t xml:space="preserve">explicitly </w:t>
+            </w:r>
+            <w:r>
+              <w:rPr>
+                <w:rFonts w:ascii="Arial" w:eastAsia="Times New Roman" w:hAnsi="Arial" w:cs="Arial"/>
+                <w:color w:val="000000"/>
+                <w:kern w:val="0"/>
+                <w:sz w:val="16"/>
+                <w:szCs w:val="16"/>
+                <w14:ligatures w14:val="none"/>
+              </w:rPr>
+              <w:t xml:space="preserve">note </w:t>
+            </w:r>
+            <w:r>
+              <w:rPr>
+                <w:rFonts w:ascii="Arial" w:eastAsia="Times New Roman" w:hAnsi="Arial" w:cs="Arial"/>
+                <w:color w:val="000000"/>
+                <w:kern w:val="0"/>
+                <w:sz w:val="16"/>
+                <w:szCs w:val="16"/>
+                <w14:ligatures w14:val="none"/>
+              </w:rPr>
+              <w:t xml:space="preserve">that </w:t>
+            </w:r>
+            <w:r>
+              <w:rPr>
+                <w:rFonts w:ascii="Arial" w:eastAsia="Times New Roman" w:hAnsi="Arial" w:cs="Arial"/>
+                <w:color w:val="000000"/>
+                <w:kern w:val="0"/>
+                <w:sz w:val="16"/>
+                <w:szCs w:val="16"/>
+                <w14:ligatures w14:val="none"/>
+              </w:rPr>
+              <w:t>error bars/bands display 95% confidence intervals of the mean</w:t>
+            </w:r>
+            <w:r>
+              <w:rPr>
+                <w:rFonts w:ascii="Arial" w:eastAsia="Times New Roman" w:hAnsi="Arial" w:cs="Arial"/>
+                <w:color w:val="000000"/>
+                <w:kern w:val="0"/>
+                <w:sz w:val="16"/>
+                <w:szCs w:val="16"/>
+                <w14:ligatures w14:val="none"/>
+              </w:rPr>
+              <w:t>.</w:t>
+            </w:r>
           </w:p>
         </w:tc>
       </w:tr>
@@ -4815,15 +5969,158 @@
               <w:spacing w:after="240" w:line="240" w:lineRule="auto"/>
               <w:rPr>
                 <w:rFonts w:ascii="Arial" w:eastAsia="Times New Roman" w:hAnsi="Arial" w:cs="Arial"/>
-                <w:b/>
-                <w:bCs/>
-                <w:color w:val="000000"/>
-                <w:kern w:val="0"/>
-                <w:sz w:val="16"/>
-                <w:szCs w:val="16"/>
-                <w14:ligatures w14:val="none"/>
-              </w:rPr>
-            </w:pPr>
+                <w:color w:val="000000"/>
+                <w:kern w:val="0"/>
+                <w:sz w:val="16"/>
+                <w:szCs w:val="16"/>
+                <w14:ligatures w14:val="none"/>
+              </w:rPr>
+            </w:pPr>
+            <w:r>
+              <w:rPr>
+                <w:rFonts w:ascii="Arial" w:eastAsia="Times New Roman" w:hAnsi="Arial" w:cs="Arial"/>
+                <w:color w:val="000000"/>
+                <w:kern w:val="0"/>
+                <w:sz w:val="16"/>
+                <w:szCs w:val="16"/>
+                <w14:ligatures w14:val="none"/>
+              </w:rPr>
+              <w:t xml:space="preserve">We note that all statistical tests </w:t>
+            </w:r>
+            <w:r>
+              <w:rPr>
+                <w:rFonts w:ascii="Arial" w:eastAsia="Times New Roman" w:hAnsi="Arial" w:cs="Arial"/>
+                <w:color w:val="000000"/>
+                <w:kern w:val="0"/>
+                <w:sz w:val="16"/>
+                <w:szCs w:val="16"/>
+                <w14:ligatures w14:val="none"/>
+              </w:rPr>
+              <w:t>performed in our study were two-sided under the “Statistics” subheading in our Methods section.</w:t>
+            </w:r>
+          </w:p>
+          <w:p>
+            <w:pPr>
+              <w:spacing w:after="240" w:line="240" w:lineRule="auto"/>
+              <w:rPr>
+                <w:rFonts w:ascii="Arial" w:eastAsia="Times New Roman" w:hAnsi="Arial" w:cs="Arial"/>
+                <w:color w:val="000000"/>
+                <w:kern w:val="0"/>
+                <w:sz w:val="16"/>
+                <w:szCs w:val="16"/>
+                <w14:ligatures w14:val="none"/>
+              </w:rPr>
+            </w:pPr>
+            <w:r>
+              <w:rPr>
+                <w:rFonts w:ascii="Arial" w:eastAsia="Times New Roman" w:hAnsi="Arial" w:cs="Arial"/>
+                <w:color w:val="000000"/>
+                <w:kern w:val="0"/>
+                <w:sz w:val="16"/>
+                <w:szCs w:val="16"/>
+                <w14:ligatures w14:val="none"/>
+              </w:rPr>
+              <w:t xml:space="preserve">We </w:t>
+            </w:r>
+            <w:r>
+              <w:rPr>
+                <w:rFonts w:ascii="Arial" w:eastAsia="Times New Roman" w:hAnsi="Arial" w:cs="Arial"/>
+                <w:color w:val="000000"/>
+                <w:kern w:val="0"/>
+                <w:sz w:val="16"/>
+                <w:szCs w:val="16"/>
+                <w14:ligatures w14:val="none"/>
+              </w:rPr>
+              <w:t>provide</w:t>
+            </w:r>
+            <w:r>
+              <w:rPr>
+                <w:rFonts w:ascii="Arial" w:eastAsia="Times New Roman" w:hAnsi="Arial" w:cs="Arial"/>
+                <w:color w:val="000000"/>
+                <w:kern w:val="0"/>
+                <w:sz w:val="16"/>
+                <w:szCs w:val="16"/>
+                <w14:ligatures w14:val="none"/>
+              </w:rPr>
+              <w:t xml:space="preserve"> exact p-value</w:t>
+            </w:r>
+            <w:r>
+              <w:rPr>
+                <w:rFonts w:ascii="Arial" w:eastAsia="Times New Roman" w:hAnsi="Arial" w:cs="Arial"/>
+                <w:color w:val="000000"/>
+                <w:kern w:val="0"/>
+                <w:sz w:val="16"/>
+                <w:szCs w:val="16"/>
+                <w14:ligatures w14:val="none"/>
+              </w:rPr>
+              <w:t>s in figures 3b &amp; 6</w:t>
+            </w:r>
+            <w:r>
+              <w:rPr>
+                <w:rFonts w:ascii="Arial" w:eastAsia="Times New Roman" w:hAnsi="Arial" w:cs="Arial"/>
+                <w:color w:val="000000"/>
+                <w:kern w:val="0"/>
+                <w:sz w:val="16"/>
+                <w:szCs w:val="16"/>
+                <w14:ligatures w14:val="none"/>
+              </w:rPr>
+              <w:t>.</w:t>
+            </w:r>
+            <w:r>
+              <w:rPr>
+                <w:rFonts w:ascii="Arial" w:eastAsia="Times New Roman" w:hAnsi="Arial" w:cs="Arial"/>
+                <w:color w:val="000000"/>
+                <w:kern w:val="0"/>
+                <w:sz w:val="16"/>
+                <w:szCs w:val="16"/>
+                <w14:ligatures w14:val="none"/>
+              </w:rPr>
+              <w:t xml:space="preserve"> </w:t>
+            </w:r>
+            <w:r>
+              <w:rPr>
+                <w:rFonts w:ascii="Arial" w:eastAsia="Times New Roman" w:hAnsi="Arial" w:cs="Arial"/>
+                <w:color w:val="000000"/>
+                <w:kern w:val="0"/>
+                <w:sz w:val="16"/>
+                <w:szCs w:val="16"/>
+                <w14:ligatures w14:val="none"/>
+              </w:rPr>
+              <w:t>W</w:t>
+            </w:r>
+            <w:r>
+              <w:rPr>
+                <w:rFonts w:ascii="Arial" w:eastAsia="Times New Roman" w:hAnsi="Arial" w:cs="Arial"/>
+                <w:color w:val="000000"/>
+                <w:kern w:val="0"/>
+                <w:sz w:val="16"/>
+                <w:szCs w:val="16"/>
+                <w14:ligatures w14:val="none"/>
+              </w:rPr>
+              <w:t xml:space="preserve">e also report exact p-values in the main </w:t>
+            </w:r>
+            <w:r>
+              <w:rPr>
+                <w:rFonts w:ascii="Arial" w:eastAsia="Times New Roman" w:hAnsi="Arial" w:cs="Arial"/>
+                <w:color w:val="000000"/>
+                <w:kern w:val="0"/>
+                <w:sz w:val="16"/>
+                <w:szCs w:val="16"/>
+                <w14:ligatures w14:val="none"/>
+              </w:rPr>
+              <w:t xml:space="preserve">text </w:t>
+            </w:r>
+            <w:r>
+              <w:rPr>
+                <w:rFonts w:ascii="Arial" w:eastAsia="Times New Roman" w:hAnsi="Arial" w:cs="Arial"/>
+                <w:color w:val="000000"/>
+                <w:kern w:val="0"/>
+                <w:sz w:val="16"/>
+                <w:szCs w:val="16"/>
+                <w14:ligatures w14:val="none"/>
+              </w:rPr>
+              <w:t>when reporting results of these statistical tests.</w:t>
+            </w:r>
           </w:p>
         </w:tc>
       </w:tr>
@@ -4851,6 +6148,7 @@
                 <w:kern w:val="0"/>
                 <w:sz w:val="16"/>
                 <w:szCs w:val="16"/>
+                <w:highlight w:val="yellow"/>
                 <w14:ligatures w14:val="none"/>
               </w:rPr>
             </w:pPr>
@@ -4891,6 +6189,61 @@
                 <w14:ligatures w14:val="none"/>
               </w:rPr>
             </w:pPr>
+            <w:r>
+              <w:rPr>
+                <w:rFonts w:ascii="Arial" w:eastAsia="Times New Roman" w:hAnsi="Arial" w:cs="Arial"/>
+                <w:color w:val="000000"/>
+                <w:kern w:val="0"/>
+                <w:sz w:val="16"/>
+                <w:szCs w:val="16"/>
+                <w14:ligatures w14:val="none"/>
+              </w:rPr>
+              <w:t xml:space="preserve">We </w:t>
+            </w:r>
+            <w:r>
+              <w:rPr>
+                <w:rFonts w:ascii="Arial" w:eastAsia="Times New Roman" w:hAnsi="Arial" w:cs="Arial"/>
+                <w:color w:val="000000"/>
+                <w:kern w:val="0"/>
+                <w:sz w:val="16"/>
+                <w:szCs w:val="16"/>
+                <w14:ligatures w14:val="none"/>
+              </w:rPr>
+              <w:t xml:space="preserve">define </w:t>
+            </w:r>
+            <w:r>
+              <w:rPr>
+                <w:rFonts w:ascii="Arial" w:eastAsia="Times New Roman" w:hAnsi="Arial" w:cs="Arial"/>
+                <w:color w:val="000000"/>
+                <w:kern w:val="0"/>
+                <w:sz w:val="16"/>
+                <w:szCs w:val="16"/>
+                <w14:ligatures w14:val="none"/>
+              </w:rPr>
+              <w:t xml:space="preserve">shadings and symbols </w:t>
+            </w:r>
+            <w:r>
+              <w:rPr>
+                <w:rFonts w:ascii="Arial" w:eastAsia="Times New Roman" w:hAnsi="Arial" w:cs="Arial"/>
+                <w:color w:val="000000"/>
+                <w:kern w:val="0"/>
+                <w:sz w:val="16"/>
+                <w:szCs w:val="16"/>
+                <w14:ligatures w14:val="none"/>
+              </w:rPr>
+              <w:t xml:space="preserve">in keys </w:t>
+            </w:r>
+            <w:r>
+              <w:rPr>
+                <w:rFonts w:ascii="Arial" w:eastAsia="Times New Roman" w:hAnsi="Arial" w:cs="Arial"/>
+                <w:color w:val="000000"/>
+                <w:kern w:val="0"/>
+                <w:sz w:val="16"/>
+                <w:szCs w:val="16"/>
+                <w14:ligatures w14:val="none"/>
+              </w:rPr>
+              <w:t>within the image for all relevant figures.</w:t>
+            </w:r>
           </w:p>
         </w:tc>
       </w:tr>
@@ -5695,6 +7048,17 @@
                 <w14:ligatures w14:val="none"/>
               </w:rPr>
             </w:pPr>
+            <w:r>
+              <w:rPr>
+                <w:rFonts w:ascii="Arial" w:eastAsia="Times New Roman" w:hAnsi="Arial" w:cs="Arial"/>
+                <w:color w:val="000000"/>
+                <w:kern w:val="0"/>
+                <w:sz w:val="16"/>
+                <w:szCs w:val="16"/>
+                <w14:ligatures w14:val="none"/>
+              </w:rPr>
+              <w:t>See “Data availability” and “Code availability” sections of our manuscript.</w:t>
+            </w:r>
           </w:p>
         </w:tc>
       </w:tr>
@@ -5722,6 +7086,7 @@
                 <w:kern w:val="0"/>
                 <w:sz w:val="16"/>
                 <w:szCs w:val="16"/>
+                <w:highlight w:val="yellow"/>
                 <w14:ligatures w14:val="none"/>
               </w:rPr>
             </w:pPr>
@@ -5762,6 +7127,17 @@
                 <w14:ligatures w14:val="none"/>
               </w:rPr>
             </w:pPr>
+            <w:r>
+              <w:rPr>
+                <w:rFonts w:ascii="Arial" w:eastAsia="Times New Roman" w:hAnsi="Arial" w:cs="Arial"/>
+                <w:color w:val="000000"/>
+                <w:kern w:val="0"/>
+                <w:sz w:val="16"/>
+                <w:szCs w:val="16"/>
+                <w14:ligatures w14:val="none"/>
+              </w:rPr>
+              <w:t>Done.</w:t>
+            </w:r>
           </w:p>
         </w:tc>
       </w:tr>
@@ -5789,16 +7165,18 @@
                 <w:kern w:val="0"/>
                 <w:sz w:val="16"/>
                 <w:szCs w:val="16"/>
-                <w14:ligatures w14:val="none"/>
-              </w:rPr>
-            </w:pPr>
-            <w:r>
-              <w:rPr>
-                <w:rFonts w:ascii="Arial" w:eastAsia="Times New Roman" w:hAnsi="Arial" w:cs="Arial"/>
-                <w:color w:val="000000"/>
-                <w:kern w:val="0"/>
-                <w:sz w:val="16"/>
-                <w:szCs w:val="16"/>
+                <w:highlight w:val="yellow"/>
+                <w14:ligatures w14:val="none"/>
+              </w:rPr>
+            </w:pPr>
+            <w:r>
+              <w:rPr>
+                <w:rFonts w:ascii="Arial" w:eastAsia="Times New Roman" w:hAnsi="Arial" w:cs="Arial"/>
+                <w:color w:val="000000"/>
+                <w:kern w:val="0"/>
+                <w:sz w:val="16"/>
+                <w:szCs w:val="16"/>
+                <w:highlight w:val="yellow"/>
                 <w14:ligatures w14:val="none"/>
               </w:rPr>
               <w:t>We notice that you have deposited your code in a Github repository, which we fully support. We strongly encourage you in addition to make your code citable by obtaining a DOI for the Github repository in order to provide a permanent reference to the version of the code used in this study and improve reproducibility. This can be done by linking the repository to Zenodo, following the instructions here: https://guides.github.com/activities/citable-code/ Please cite the Github repository in your manuscript text or Code Availability statement and in your reference list: authors, title (this paper), repository name, DOI identifier, year. Alternatively, you can deposit the code in Gigantum or Code Ocean for the same purpose.</w:t>
@@ -5856,16 +7234,18 @@
                 <w:kern w:val="0"/>
                 <w:sz w:val="16"/>
                 <w:szCs w:val="16"/>
-                <w14:ligatures w14:val="none"/>
-              </w:rPr>
-            </w:pPr>
-            <w:r>
-              <w:rPr>
-                <w:rFonts w:ascii="Arial" w:eastAsia="Times New Roman" w:hAnsi="Arial" w:cs="Arial"/>
-                <w:color w:val="000000"/>
-                <w:kern w:val="0"/>
-                <w:sz w:val="16"/>
-                <w:szCs w:val="16"/>
+                <w:highlight w:val="yellow"/>
+                <w14:ligatures w14:val="none"/>
+              </w:rPr>
+            </w:pPr>
+            <w:r>
+              <w:rPr>
+                <w:rFonts w:ascii="Arial" w:eastAsia="Times New Roman" w:hAnsi="Arial" w:cs="Arial"/>
+                <w:color w:val="000000"/>
+                <w:kern w:val="0"/>
+                <w:sz w:val="16"/>
+                <w:szCs w:val="16"/>
+                <w:highlight w:val="yellow"/>
                 <w14:ligatures w14:val="none"/>
               </w:rPr>
               <w:t>Please provide a DOI URL to the Github repository in both the Data Availability and Code Availability Statement. You can obtain the DOI URL by linking the github page to Zenodo.</w:t>
@@ -6271,6 +7651,249 @@
                 <w14:ligatures w14:val="none"/>
               </w:rPr>
             </w:pPr>
+            <w:r>
+              <w:rPr>
+                <w:rFonts w:ascii="Arial" w:eastAsia="Times New Roman" w:hAnsi="Arial" w:cs="Arial"/>
+                <w:color w:val="000000"/>
+                <w:kern w:val="0"/>
+                <w:sz w:val="16"/>
+                <w:szCs w:val="16"/>
+                <w14:ligatures w14:val="none"/>
+              </w:rPr>
+              <w:t>We have included these statements in our Methods section and Reporting Summary.</w:t>
+            </w:r>
+          </w:p>
+          <w:p>
+            <w:pPr>
+              <w:spacing w:after="0" w:line="240" w:lineRule="auto"/>
+              <w:rPr>
+                <w:rFonts w:ascii="Arial" w:eastAsia="Times New Roman" w:hAnsi="Arial" w:cs="Arial"/>
+                <w:color w:val="000000"/>
+                <w:kern w:val="0"/>
+                <w:sz w:val="16"/>
+                <w:szCs w:val="16"/>
+                <w14:ligatures w14:val="none"/>
+              </w:rPr>
+            </w:pPr>
+          </w:p>
+          <w:p>
+            <w:pPr>
+              <w:spacing w:after="0" w:line="240" w:lineRule="auto"/>
+              <w:rPr>
+                <w:rFonts w:ascii="Arial" w:eastAsia="Times New Roman" w:hAnsi="Arial" w:cs="Arial"/>
+                <w:color w:val="000000"/>
+                <w:kern w:val="0"/>
+                <w:sz w:val="16"/>
+                <w:szCs w:val="16"/>
+                <w14:ligatures w14:val="none"/>
+              </w:rPr>
+            </w:pPr>
+          </w:p>
+          <w:p>
+            <w:pPr>
+              <w:spacing w:after="0" w:line="240" w:lineRule="auto"/>
+              <w:rPr>
+                <w:rFonts w:ascii="Arial" w:eastAsia="Times New Roman" w:hAnsi="Arial" w:cs="Arial"/>
+                <w:color w:val="000000"/>
+                <w:kern w:val="0"/>
+                <w:sz w:val="16"/>
+                <w:szCs w:val="16"/>
+                <w14:ligatures w14:val="none"/>
+              </w:rPr>
+            </w:pPr>
+          </w:p>
+          <w:p>
+            <w:pPr>
+              <w:spacing w:after="0" w:line="240" w:lineRule="auto"/>
+              <w:rPr>
+                <w:rFonts w:ascii="Arial" w:eastAsia="Times New Roman" w:hAnsi="Arial" w:cs="Arial"/>
+                <w:color w:val="000000"/>
+                <w:kern w:val="0"/>
+                <w:sz w:val="16"/>
+                <w:szCs w:val="16"/>
+                <w14:ligatures w14:val="none"/>
+              </w:rPr>
+            </w:pPr>
+          </w:p>
+          <w:p>
+            <w:pPr>
+              <w:spacing w:after="0" w:line="240" w:lineRule="auto"/>
+              <w:rPr>
+                <w:rFonts w:ascii="Arial" w:eastAsia="Times New Roman" w:hAnsi="Arial" w:cs="Arial"/>
+                <w:color w:val="000000"/>
+                <w:kern w:val="0"/>
+                <w:sz w:val="16"/>
+                <w:szCs w:val="16"/>
+                <w14:ligatures w14:val="none"/>
+              </w:rPr>
+            </w:pPr>
+          </w:p>
+          <w:p>
+            <w:pPr>
+              <w:spacing w:after="0" w:line="240" w:lineRule="auto"/>
+              <w:rPr>
+                <w:rFonts w:ascii="Arial" w:eastAsia="Times New Roman" w:hAnsi="Arial" w:cs="Arial"/>
+                <w:color w:val="000000"/>
+                <w:kern w:val="0"/>
+                <w:sz w:val="16"/>
+                <w:szCs w:val="16"/>
+                <w14:ligatures w14:val="none"/>
+              </w:rPr>
+            </w:pPr>
+            <w:r>
+              <w:rPr>
+                <w:rFonts w:ascii="Arial" w:eastAsia="Times New Roman" w:hAnsi="Arial" w:cs="Arial"/>
+                <w:color w:val="000000"/>
+                <w:kern w:val="0"/>
+                <w:sz w:val="16"/>
+                <w:szCs w:val="16"/>
+                <w14:ligatures w14:val="none"/>
+              </w:rPr>
+              <w:t>We have included these statements in our Methods section and Reporting Summary.</w:t>
+            </w:r>
+          </w:p>
+          <w:p>
+            <w:pPr>
+              <w:spacing w:after="0" w:line="240" w:lineRule="auto"/>
+              <w:rPr>
+                <w:rFonts w:ascii="Arial" w:eastAsia="Times New Roman" w:hAnsi="Arial" w:cs="Arial"/>
+                <w:color w:val="000000"/>
+                <w:kern w:val="0"/>
+                <w:sz w:val="16"/>
+                <w:szCs w:val="16"/>
+                <w14:ligatures w14:val="none"/>
+              </w:rPr>
+            </w:pPr>
+          </w:p>
+          <w:p>
+            <w:pPr>
+              <w:spacing w:after="0" w:line="240" w:lineRule="auto"/>
+              <w:rPr>
+                <w:rFonts w:ascii="Arial" w:eastAsia="Times New Roman" w:hAnsi="Arial" w:cs="Arial"/>
+                <w:color w:val="000000"/>
+                <w:kern w:val="0"/>
+                <w:sz w:val="16"/>
+                <w:szCs w:val="16"/>
+                <w14:ligatures w14:val="none"/>
+              </w:rPr>
+            </w:pPr>
+          </w:p>
+          <w:p>
+            <w:pPr>
+              <w:spacing w:after="0" w:line="240" w:lineRule="auto"/>
+              <w:rPr>
+                <w:rFonts w:ascii="Arial" w:eastAsia="Times New Roman" w:hAnsi="Arial" w:cs="Arial"/>
+                <w:color w:val="000000"/>
+                <w:kern w:val="0"/>
+                <w:sz w:val="16"/>
+                <w:szCs w:val="16"/>
+                <w14:ligatures w14:val="none"/>
+              </w:rPr>
+            </w:pPr>
+          </w:p>
+          <w:p>
+            <w:pPr>
+              <w:spacing w:after="0" w:line="240" w:lineRule="auto"/>
+              <w:rPr>
+                <w:rFonts w:ascii="Arial" w:eastAsia="Times New Roman" w:hAnsi="Arial" w:cs="Arial"/>
+                <w:color w:val="000000"/>
+                <w:kern w:val="0"/>
+                <w:sz w:val="16"/>
+                <w:szCs w:val="16"/>
+                <w14:ligatures w14:val="none"/>
+              </w:rPr>
+            </w:pPr>
+          </w:p>
+          <w:p>
+            <w:pPr>
+              <w:spacing w:after="0" w:line="240" w:lineRule="auto"/>
+              <w:rPr>
+                <w:rFonts w:ascii="Arial" w:eastAsia="Times New Roman" w:hAnsi="Arial" w:cs="Arial"/>
+                <w:color w:val="000000"/>
+                <w:kern w:val="0"/>
+                <w:sz w:val="16"/>
+                <w:szCs w:val="16"/>
+                <w14:ligatures w14:val="none"/>
+              </w:rPr>
+            </w:pPr>
+          </w:p>
+          <w:p>
+            <w:pPr>
+              <w:spacing w:after="0" w:line="240" w:lineRule="auto"/>
+              <w:rPr>
+                <w:rFonts w:ascii="Arial" w:eastAsia="Times New Roman" w:hAnsi="Arial" w:cs="Arial"/>
+                <w:color w:val="000000"/>
+                <w:kern w:val="0"/>
+                <w:sz w:val="16"/>
+                <w:szCs w:val="16"/>
+                <w14:ligatures w14:val="none"/>
+              </w:rPr>
+            </w:pPr>
+          </w:p>
+          <w:p>
+            <w:pPr>
+              <w:spacing w:after="0" w:line="240" w:lineRule="auto"/>
+              <w:rPr>
+                <w:rFonts w:ascii="Arial" w:eastAsia="Times New Roman" w:hAnsi="Arial" w:cs="Arial"/>
+                <w:color w:val="000000"/>
+                <w:kern w:val="0"/>
+                <w:sz w:val="16"/>
+                <w:szCs w:val="16"/>
+                <w14:ligatures w14:val="none"/>
+              </w:rPr>
+            </w:pPr>
+          </w:p>
+          <w:p>
+            <w:pPr>
+              <w:spacing w:after="0" w:line="240" w:lineRule="auto"/>
+              <w:rPr>
+                <w:rFonts w:ascii="Arial" w:eastAsia="Times New Roman" w:hAnsi="Arial" w:cs="Arial"/>
+                <w:color w:val="000000"/>
+                <w:kern w:val="0"/>
+                <w:sz w:val="16"/>
+                <w:szCs w:val="16"/>
+                <w14:ligatures w14:val="none"/>
+              </w:rPr>
+            </w:pPr>
+          </w:p>
+          <w:p>
+            <w:pPr>
+              <w:spacing w:after="0" w:line="240" w:lineRule="auto"/>
+              <w:rPr>
+                <w:rFonts w:ascii="Arial" w:eastAsia="Times New Roman" w:hAnsi="Arial" w:cs="Arial"/>
+                <w:color w:val="000000"/>
+                <w:kern w:val="0"/>
+                <w:sz w:val="16"/>
+                <w:szCs w:val="16"/>
+                <w14:ligatures w14:val="none"/>
+              </w:rPr>
+            </w:pPr>
+          </w:p>
+          <w:p>
+            <w:pPr>
+              <w:spacing w:after="0" w:line="240" w:lineRule="auto"/>
+              <w:rPr>
+                <w:rFonts w:ascii="Arial" w:eastAsia="Times New Roman" w:hAnsi="Arial" w:cs="Arial"/>
+                <w:color w:val="000000"/>
+                <w:kern w:val="0"/>
+                <w:sz w:val="16"/>
+                <w:szCs w:val="16"/>
+                <w14:ligatures w14:val="none"/>
+              </w:rPr>
+            </w:pPr>
+          </w:p>
+          <w:p>
+            <w:pPr>
+              <w:spacing w:after="0" w:line="240" w:lineRule="auto"/>
+              <w:rPr>
+                <w:rFonts w:ascii="Arial" w:eastAsia="Times New Roman" w:hAnsi="Arial" w:cs="Arial"/>
+                <w:color w:val="000000"/>
+                <w:kern w:val="0"/>
+                <w:sz w:val="16"/>
+                <w:szCs w:val="16"/>
+                <w14:ligatures w14:val="none"/>
+              </w:rPr>
+            </w:pPr>
           </w:p>
         </w:tc>
       </w:tr>
@@ -6338,6 +7961,17 @@
                 <w14:ligatures w14:val="none"/>
               </w:rPr>
             </w:pPr>
+            <w:r>
+              <w:rPr>
+                <w:rFonts w:ascii="Arial" w:eastAsia="Times New Roman" w:hAnsi="Arial" w:cs="Arial"/>
+                <w:color w:val="000000"/>
+                <w:kern w:val="0"/>
+                <w:sz w:val="16"/>
+                <w:szCs w:val="16"/>
+                <w14:ligatures w14:val="none"/>
+              </w:rPr>
+              <w:t>We have renamed our Methods section accordingly.</w:t>
+            </w:r>
           </w:p>
         </w:tc>
       </w:tr>
@@ -6406,6 +8040,204 @@
                 <w14:ligatures w14:val="none"/>
               </w:rPr>
             </w:pPr>
+            <w:r>
+              <w:rPr>
+                <w:rFonts w:ascii="Arial" w:eastAsia="Times New Roman" w:hAnsi="Arial" w:cs="Arial"/>
+                <w:color w:val="000000"/>
+                <w:kern w:val="0"/>
+                <w:sz w:val="16"/>
+                <w:szCs w:val="16"/>
+                <w14:ligatures w14:val="none"/>
+              </w:rPr>
+              <w:t>U</w:t>
+            </w:r>
+            <w:r>
+              <w:rPr>
+                <w:rFonts w:ascii="Arial" w:eastAsia="Times New Roman" w:hAnsi="Arial" w:cs="Arial"/>
+                <w:color w:val="000000"/>
+                <w:kern w:val="0"/>
+                <w:sz w:val="16"/>
+                <w:szCs w:val="16"/>
+                <w14:ligatures w14:val="none"/>
+              </w:rPr>
+              <w:t>nder the “Participants” subheading of our Methods sectio</w:t>
+            </w:r>
+            <w:r>
+              <w:rPr>
+                <w:rFonts w:ascii="Arial" w:eastAsia="Times New Roman" w:hAnsi="Arial" w:cs="Arial"/>
+                <w:color w:val="000000"/>
+                <w:kern w:val="0"/>
+                <w:sz w:val="16"/>
+                <w:szCs w:val="16"/>
+                <w14:ligatures w14:val="none"/>
+              </w:rPr>
+              <w:t>n, w</w:t>
+            </w:r>
+            <w:r>
+              <w:rPr>
+                <w:rFonts w:ascii="Arial" w:eastAsia="Times New Roman" w:hAnsi="Arial" w:cs="Arial"/>
+                <w:color w:val="000000"/>
+                <w:kern w:val="0"/>
+                <w:sz w:val="16"/>
+                <w:szCs w:val="16"/>
+                <w14:ligatures w14:val="none"/>
+              </w:rPr>
+              <w:t xml:space="preserve">e note that </w:t>
+            </w:r>
+            <w:r>
+              <w:rPr>
+                <w:rFonts w:ascii="Arial" w:eastAsia="Times New Roman" w:hAnsi="Arial" w:cs="Arial"/>
+                <w:color w:val="000000"/>
+                <w:kern w:val="0"/>
+                <w:sz w:val="16"/>
+                <w:szCs w:val="16"/>
+                <w14:ligatures w14:val="none"/>
+              </w:rPr>
+              <w:t xml:space="preserve">no statistical method was used to predetermine sample size and that no </w:t>
+            </w:r>
+            <w:r>
+              <w:rPr>
+                <w:rFonts w:ascii="Arial" w:eastAsia="Times New Roman" w:hAnsi="Arial" w:cs="Arial"/>
+                <w:color w:val="000000"/>
+                <w:kern w:val="0"/>
+                <w:sz w:val="16"/>
+                <w:szCs w:val="16"/>
+                <w14:ligatures w14:val="none"/>
+              </w:rPr>
+              <w:t>participants</w:t>
+            </w:r>
+            <w:r>
+              <w:rPr>
+                <w:rFonts w:ascii="Arial" w:eastAsia="Times New Roman" w:hAnsi="Arial" w:cs="Arial"/>
+                <w:color w:val="000000"/>
+                <w:kern w:val="0"/>
+                <w:sz w:val="16"/>
+                <w:szCs w:val="16"/>
+                <w14:ligatures w14:val="none"/>
+              </w:rPr>
+              <w:t xml:space="preserve"> </w:t>
+            </w:r>
+            <w:r>
+              <w:rPr>
+                <w:rFonts w:ascii="Arial" w:eastAsia="Times New Roman" w:hAnsi="Arial" w:cs="Arial"/>
+                <w:color w:val="000000"/>
+                <w:kern w:val="0"/>
+                <w:sz w:val="16"/>
+                <w:szCs w:val="16"/>
+                <w14:ligatures w14:val="none"/>
+              </w:rPr>
+              <w:t xml:space="preserve">were excluded from the </w:t>
+            </w:r>
+            <w:r>
+              <w:rPr>
+                <w:rFonts w:ascii="Arial" w:eastAsia="Times New Roman" w:hAnsi="Arial" w:cs="Arial"/>
+                <w:color w:val="000000"/>
+                <w:kern w:val="0"/>
+                <w:sz w:val="16"/>
+                <w:szCs w:val="16"/>
+                <w14:ligatures w14:val="none"/>
+              </w:rPr>
+              <w:t>dataset</w:t>
+            </w:r>
+            <w:r>
+              <w:rPr>
+                <w:rFonts w:ascii="Arial" w:eastAsia="Times New Roman" w:hAnsi="Arial" w:cs="Arial"/>
+                <w:color w:val="000000"/>
+                <w:kern w:val="0"/>
+                <w:sz w:val="16"/>
+                <w:szCs w:val="16"/>
+                <w14:ligatures w14:val="none"/>
+              </w:rPr>
+              <w:t>.</w:t>
+            </w:r>
+            <w:r>
+              <w:rPr>
+                <w:rFonts w:ascii="Arial" w:eastAsia="Times New Roman" w:hAnsi="Arial" w:cs="Arial"/>
+                <w:color w:val="000000"/>
+                <w:kern w:val="0"/>
+                <w:sz w:val="16"/>
+                <w:szCs w:val="16"/>
+                <w14:ligatures w14:val="none"/>
+              </w:rPr>
+              <w:t xml:space="preserve"> </w:t>
+            </w:r>
+            <w:r>
+              <w:rPr>
+                <w:rFonts w:ascii="Arial" w:eastAsia="Times New Roman" w:hAnsi="Arial" w:cs="Arial"/>
+                <w:color w:val="000000"/>
+                <w:kern w:val="0"/>
+                <w:sz w:val="16"/>
+                <w:szCs w:val="16"/>
+                <w14:ligatures w14:val="none"/>
+              </w:rPr>
+              <w:t>Under the “</w:t>
+            </w:r>
+            <w:r>
+              <w:rPr>
+                <w:rFonts w:ascii="Arial" w:eastAsia="Times New Roman" w:hAnsi="Arial" w:cs="Arial"/>
+                <w:color w:val="000000"/>
+                <w:kern w:val="0"/>
+                <w:sz w:val="16"/>
+                <w:szCs w:val="16"/>
+                <w14:ligatures w14:val="none"/>
+              </w:rPr>
+              <w:t>Experiment</w:t>
+            </w:r>
+            <w:r>
+              <w:rPr>
+                <w:rFonts w:ascii="Arial" w:eastAsia="Times New Roman" w:hAnsi="Arial" w:cs="Arial"/>
+                <w:color w:val="000000"/>
+                <w:kern w:val="0"/>
+                <w:sz w:val="16"/>
+                <w:szCs w:val="16"/>
+                <w14:ligatures w14:val="none"/>
+              </w:rPr>
+              <w:t>” subheading of our Methods section,</w:t>
+            </w:r>
+            <w:r>
+              <w:rPr>
+                <w:rFonts w:ascii="Arial" w:eastAsia="Times New Roman" w:hAnsi="Arial" w:cs="Arial"/>
+                <w:color w:val="000000"/>
+                <w:kern w:val="0"/>
+                <w:sz w:val="16"/>
+                <w:szCs w:val="16"/>
+                <w14:ligatures w14:val="none"/>
+              </w:rPr>
+              <w:t xml:space="preserve"> we note </w:t>
+            </w:r>
+            <w:r>
+              <w:rPr>
+                <w:rFonts w:ascii="Arial" w:eastAsia="Times New Roman" w:hAnsi="Arial" w:cs="Arial"/>
+                <w:color w:val="000000"/>
+                <w:kern w:val="0"/>
+                <w:sz w:val="16"/>
+                <w:szCs w:val="16"/>
+                <w14:ligatures w14:val="none"/>
+              </w:rPr>
+              <w:t>the randomization of quiz questions and non-randomization of lecture</w:t>
+            </w:r>
+            <w:r>
+              <w:rPr>
+                <w:rFonts w:ascii="Arial" w:eastAsia="Times New Roman" w:hAnsi="Arial" w:cs="Arial"/>
+                <w:color w:val="000000"/>
+                <w:kern w:val="0"/>
+                <w:sz w:val="16"/>
+                <w:szCs w:val="16"/>
+                <w14:ligatures w14:val="none"/>
+              </w:rPr>
+              <w:t xml:space="preserve">s </w:t>
+            </w:r>
+            <w:r>
+              <w:rPr>
+                <w:rFonts w:ascii="Arial" w:eastAsia="Times New Roman" w:hAnsi="Arial" w:cs="Arial"/>
+                <w:color w:val="000000"/>
+                <w:kern w:val="0"/>
+                <w:sz w:val="16"/>
+                <w:szCs w:val="16"/>
+                <w14:ligatures w14:val="none"/>
+              </w:rPr>
+              <w:t>presented.</w:t>
+            </w:r>
           </w:p>
         </w:tc>
       </w:tr>
@@ -6731,6 +8563,28 @@
                 <w14:ligatures w14:val="none"/>
               </w:rPr>
             </w:pPr>
+            <w:r>
+              <w:rPr>
+                <w:rFonts w:ascii="Arial" w:eastAsia="Times New Roman" w:hAnsi="Arial" w:cs="Arial"/>
+                <w:color w:val="000000"/>
+                <w:kern w:val="0"/>
+                <w:sz w:val="16"/>
+                <w:szCs w:val="16"/>
+                <w14:ligatures w14:val="none"/>
+              </w:rPr>
+              <w:t xml:space="preserve">We have ensured that </w:t>
+            </w:r>
+            <w:r>
+              <w:rPr>
+                <w:rFonts w:ascii="Arial" w:eastAsia="Times New Roman" w:hAnsi="Arial" w:cs="Arial"/>
+                <w:color w:val="000000"/>
+                <w:kern w:val="0"/>
+                <w:sz w:val="16"/>
+                <w:szCs w:val="16"/>
+                <w14:ligatures w14:val="none"/>
+              </w:rPr>
+              <w:t>all references contain all required information.</w:t>
+            </w:r>
           </w:p>
         </w:tc>
       </w:tr>
@@ -6798,6 +8652,17 @@
                 <w14:ligatures w14:val="none"/>
               </w:rPr>
             </w:pPr>
+            <w:r>
+              <w:rPr>
+                <w:rFonts w:ascii="Arial" w:eastAsia="Times New Roman" w:hAnsi="Arial" w:cs="Arial"/>
+                <w:color w:val="000000"/>
+                <w:kern w:val="0"/>
+                <w:sz w:val="16"/>
+                <w:szCs w:val="16"/>
+                <w14:ligatures w14:val="none"/>
+              </w:rPr>
+              <w:t>Done.</w:t>
+            </w:r>
           </w:p>
         </w:tc>
       </w:tr>
@@ -6865,6 +8730,17 @@
                 <w14:ligatures w14:val="none"/>
               </w:rPr>
             </w:pPr>
+            <w:r>
+              <w:rPr>
+                <w:rFonts w:ascii="Arial" w:eastAsia="Times New Roman" w:hAnsi="Arial" w:cs="Arial"/>
+                <w:color w:val="000000"/>
+                <w:kern w:val="0"/>
+                <w:sz w:val="16"/>
+                <w:szCs w:val="16"/>
+                <w14:ligatures w14:val="none"/>
+              </w:rPr>
+              <w:t>Done.</w:t>
+            </w:r>
           </w:p>
         </w:tc>
       </w:tr>
@@ -7128,6 +9004,7 @@
                 <w:kern w:val="0"/>
                 <w:sz w:val="16"/>
                 <w:szCs w:val="16"/>
+                <w:highlight w:val="yellow"/>
                 <w14:ligatures w14:val="none"/>
               </w:rPr>
             </w:pPr>
@@ -7168,6 +9045,28 @@
                 <w14:ligatures w14:val="none"/>
               </w:rPr>
             </w:pPr>
+            <w:r>
+              <w:rPr>
+                <w:rFonts w:ascii="Arial" w:eastAsia="Times New Roman" w:hAnsi="Arial" w:cs="Arial"/>
+                <w:color w:val="000000"/>
+                <w:kern w:val="0"/>
+                <w:sz w:val="16"/>
+                <w:szCs w:val="16"/>
+                <w14:ligatures w14:val="none"/>
+              </w:rPr>
+              <w:t xml:space="preserve">We have included a negative statement in the “Competing Interests” section of our manuscript file and </w:t>
+            </w:r>
+            <w:r>
+              <w:rPr>
+                <w:rFonts w:ascii="Arial" w:eastAsia="Times New Roman" w:hAnsi="Arial" w:cs="Arial"/>
+                <w:color w:val="000000"/>
+                <w:kern w:val="0"/>
+                <w:sz w:val="16"/>
+                <w:szCs w:val="16"/>
+                <w14:ligatures w14:val="none"/>
+              </w:rPr>
+              <w:t>in the manuscript tracking system.</w:t>
+            </w:r>
           </w:p>
         </w:tc>
       </w:tr>
@@ -7434,6 +9333,17 @@
                 <w14:ligatures w14:val="none"/>
               </w:rPr>
             </w:pPr>
+            <w:r>
+              <w:rPr>
+                <w:rFonts w:ascii="Arial" w:eastAsia="Times New Roman" w:hAnsi="Arial" w:cs="Arial"/>
+                <w:color w:val="000000"/>
+                <w:kern w:val="0"/>
+                <w:sz w:val="16"/>
+                <w:szCs w:val="16"/>
+                <w14:ligatures w14:val="none"/>
+              </w:rPr>
+              <w:t>Done.</w:t>
+            </w:r>
           </w:p>
         </w:tc>
       </w:tr>
@@ -7811,6 +9721,39 @@
                 <w14:ligatures w14:val="none"/>
               </w:rPr>
             </w:pPr>
+            <w:r>
+              <w:rPr>
+                <w:rFonts w:ascii="Arial" w:eastAsia="Times New Roman" w:hAnsi="Arial" w:cs="Arial"/>
+                <w:color w:val="000000"/>
+                <w:kern w:val="0"/>
+                <w:sz w:val="16"/>
+                <w:szCs w:val="16"/>
+                <w14:ligatures w14:val="none"/>
+              </w:rPr>
+              <w:t xml:space="preserve">We confirm that </w:t>
+            </w:r>
+            <w:r>
+              <w:rPr>
+                <w:rFonts w:ascii="Arial" w:eastAsia="Times New Roman" w:hAnsi="Arial" w:cs="Arial"/>
+                <w:color w:val="000000"/>
+                <w:kern w:val="0"/>
+                <w:sz w:val="16"/>
+                <w:szCs w:val="16"/>
+                <w14:ligatures w14:val="none"/>
+              </w:rPr>
+              <w:t xml:space="preserve">our Supplementary Figures </w:t>
+            </w:r>
+            <w:r>
+              <w:rPr>
+                <w:rFonts w:ascii="Arial" w:eastAsia="Times New Roman" w:hAnsi="Arial" w:cs="Arial"/>
+                <w:color w:val="000000"/>
+                <w:kern w:val="0"/>
+                <w:sz w:val="16"/>
+                <w:szCs w:val="16"/>
+                <w14:ligatures w14:val="none"/>
+              </w:rPr>
+              <w:t>conform to these guidelines.</w:t>
+            </w:r>
           </w:p>
         </w:tc>
       </w:tr>
@@ -8100,6 +10043,28 @@
                 <w14:ligatures w14:val="none"/>
               </w:rPr>
             </w:pPr>
+            <w:r>
+              <w:rPr>
+                <w:rFonts w:ascii="Arial" w:eastAsia="Times New Roman" w:hAnsi="Arial" w:cs="Arial"/>
+                <w:color w:val="000000"/>
+                <w:kern w:val="0"/>
+                <w:sz w:val="16"/>
+                <w:szCs w:val="16"/>
+                <w14:ligatures w14:val="none"/>
+              </w:rPr>
+              <w:t>No individual files exceed 30MB.</w:t>
+            </w:r>
+            <w:r>
+              <w:rPr>
+                <w:rFonts w:ascii="Arial" w:eastAsia="Times New Roman" w:hAnsi="Arial" w:cs="Arial"/>
+                <w:color w:val="000000"/>
+                <w:kern w:val="0"/>
+                <w:sz w:val="16"/>
+                <w:szCs w:val="16"/>
+                <w14:ligatures w14:val="none"/>
+              </w:rPr>
+              <w:t xml:space="preserve"> </w:t>
+            </w:r>
           </w:p>
         </w:tc>
       </w:tr>
@@ -8167,6 +10132,39 @@
                 <w14:ligatures w14:val="none"/>
               </w:rPr>
             </w:pPr>
+            <w:r>
+              <w:rPr>
+                <w:rFonts w:ascii="Arial" w:eastAsia="Times New Roman" w:hAnsi="Arial" w:cs="Arial"/>
+                <w:color w:val="000000"/>
+                <w:kern w:val="0"/>
+                <w:sz w:val="16"/>
+                <w:szCs w:val="16"/>
+                <w14:ligatures w14:val="none"/>
+              </w:rPr>
+              <w:t>Our main manuscript files is supplied in LaTeX format</w:t>
+            </w:r>
+            <w:r>
+              <w:rPr>
+                <w:rFonts w:ascii="Arial" w:eastAsia="Times New Roman" w:hAnsi="Arial" w:cs="Arial"/>
+                <w:color w:val="000000"/>
+                <w:kern w:val="0"/>
+                <w:sz w:val="16"/>
+                <w:szCs w:val="16"/>
+                <w14:ligatures w14:val="none"/>
+              </w:rPr>
+              <w:t xml:space="preserve"> (main.tex)</w:t>
+            </w:r>
+            <w:r>
+              <w:rPr>
+                <w:rFonts w:ascii="Arial" w:eastAsia="Times New Roman" w:hAnsi="Arial" w:cs="Arial"/>
+                <w:color w:val="000000"/>
+                <w:kern w:val="0"/>
+                <w:sz w:val="16"/>
+                <w:szCs w:val="16"/>
+                <w14:ligatures w14:val="none"/>
+              </w:rPr>
+              <w:t>.</w:t>
+            </w:r>
           </w:p>
         </w:tc>
       </w:tr>
@@ -8234,6 +10232,17 @@
                 <w14:ligatures w14:val="none"/>
               </w:rPr>
             </w:pPr>
+            <w:r>
+              <w:rPr>
+                <w:rFonts w:ascii="Arial" w:eastAsia="Times New Roman" w:hAnsi="Arial" w:cs="Arial"/>
+                <w:color w:val="000000"/>
+                <w:kern w:val="0"/>
+                <w:sz w:val="16"/>
+                <w:szCs w:val="16"/>
+                <w14:ligatures w14:val="none"/>
+              </w:rPr>
+              <w:t>We provide all figures as individual PDF files.</w:t>
+            </w:r>
           </w:p>
         </w:tc>
       </w:tr>
@@ -8261,6 +10270,7 @@
                 <w:kern w:val="0"/>
                 <w:sz w:val="16"/>
                 <w:szCs w:val="16"/>
+                <w:highlight w:val="yellow"/>
                 <w14:ligatures w14:val="none"/>
               </w:rPr>
             </w:pPr>
@@ -8420,6 +10430,7 @@
                 <w:kern w:val="0"/>
                 <w:sz w:val="20"/>
                 <w:szCs w:val="20"/>
+                <w:highlight w:val="yellow"/>
                 <w14:ligatures w14:val="none"/>
               </w:rPr>
             </w:pPr>
@@ -8514,15 +10525,149 @@
               <w:spacing w:after="0" w:line="240" w:lineRule="auto"/>
               <w:rPr>
                 <w:rFonts w:ascii="Arial" w:eastAsia="Times New Roman" w:hAnsi="Arial" w:cs="Arial"/>
-                <w:b/>
-                <w:bCs/>
-                <w:color w:val="000000"/>
-                <w:kern w:val="0"/>
-                <w:sz w:val="16"/>
-                <w:szCs w:val="16"/>
-                <w14:ligatures w14:val="none"/>
-              </w:rPr>
-            </w:pPr>
+                <w:color w:val="000000"/>
+                <w:kern w:val="0"/>
+                <w:sz w:val="16"/>
+                <w:szCs w:val="16"/>
+                <w14:ligatures w14:val="none"/>
+              </w:rPr>
+            </w:pPr>
+            <w:r>
+              <w:rPr>
+                <w:rFonts w:ascii="Arial" w:eastAsia="Times New Roman" w:hAnsi="Arial" w:cs="Arial"/>
+                <w:color w:val="000000"/>
+                <w:kern w:val="0"/>
+                <w:sz w:val="16"/>
+                <w:szCs w:val="16"/>
+                <w14:ligatures w14:val="none"/>
+              </w:rPr>
+              <w:t>W</w:t>
+            </w:r>
+            <w:r>
+              <w:rPr>
+                <w:rFonts w:ascii="Arial" w:eastAsia="Times New Roman" w:hAnsi="Arial" w:cs="Arial"/>
+                <w:color w:val="000000"/>
+                <w:kern w:val="0"/>
+                <w:sz w:val="16"/>
+                <w:szCs w:val="16"/>
+                <w14:ligatures w14:val="none"/>
+              </w:rPr>
+              <w:t xml:space="preserve">e have removed the </w:t>
+            </w:r>
+            <w:r>
+              <w:rPr>
+                <w:rFonts w:ascii="Arial" w:eastAsia="Times New Roman" w:hAnsi="Arial" w:cs="Arial"/>
+                <w:color w:val="000000"/>
+                <w:kern w:val="0"/>
+                <w:sz w:val="16"/>
+                <w:szCs w:val="16"/>
+                <w14:ligatures w14:val="none"/>
+              </w:rPr>
+              <w:t xml:space="preserve">lecture </w:t>
+            </w:r>
+            <w:r>
+              <w:rPr>
+                <w:rFonts w:ascii="Arial" w:eastAsia="Times New Roman" w:hAnsi="Arial" w:cs="Arial"/>
+                <w:color w:val="000000"/>
+                <w:kern w:val="0"/>
+                <w:sz w:val="16"/>
+                <w:szCs w:val="16"/>
+                <w14:ligatures w14:val="none"/>
+              </w:rPr>
+              <w:t xml:space="preserve">screenshots from the </w:t>
+            </w:r>
+          </w:p>
+          <w:p>
+            <w:pPr>
+              <w:spacing w:after="0" w:line="240" w:lineRule="auto"/>
+              <w:rPr>
+                <w:rFonts w:ascii="Arial" w:eastAsia="Times New Roman" w:hAnsi="Arial" w:cs="Arial"/>
+                <w:color w:val="000000"/>
+                <w:kern w:val="0"/>
+                <w:sz w:val="16"/>
+                <w:szCs w:val="16"/>
+                <w14:ligatures w14:val="none"/>
+              </w:rPr>
+            </w:pPr>
+            <w:r>
+              <w:rPr>
+                <w:rFonts w:ascii="Arial" w:eastAsia="Times New Roman" w:hAnsi="Arial" w:cs="Arial"/>
+                <w:color w:val="000000"/>
+                <w:kern w:val="0"/>
+                <w:sz w:val="16"/>
+                <w:szCs w:val="16"/>
+                <w14:ligatures w14:val="none"/>
+              </w:rPr>
+              <w:t xml:space="preserve">background of </w:t>
+            </w:r>
+            <w:r>
+              <w:rPr>
+                <w:rFonts w:ascii="Arial" w:eastAsia="Times New Roman" w:hAnsi="Arial" w:cs="Arial"/>
+                <w:color w:val="000000"/>
+                <w:kern w:val="0"/>
+                <w:sz w:val="16"/>
+                <w:szCs w:val="16"/>
+                <w14:ligatures w14:val="none"/>
+              </w:rPr>
+              <w:t>Figure 1</w:t>
+            </w:r>
+            <w:r>
+              <w:rPr>
+                <w:rFonts w:ascii="Arial" w:eastAsia="Times New Roman" w:hAnsi="Arial" w:cs="Arial"/>
+                <w:color w:val="000000"/>
+                <w:kern w:val="0"/>
+                <w:sz w:val="16"/>
+                <w:szCs w:val="16"/>
+                <w14:ligatures w14:val="none"/>
+              </w:rPr>
+              <w:t xml:space="preserve"> as we feel this content is not </w:t>
+            </w:r>
+          </w:p>
+          <w:p>
+            <w:pPr>
+              <w:spacing w:after="0" w:line="240" w:lineRule="auto"/>
+              <w:rPr>
+                <w:rFonts w:ascii="Arial" w:eastAsia="Times New Roman" w:hAnsi="Arial" w:cs="Arial"/>
+                <w:color w:val="000000"/>
+                <w:kern w:val="0"/>
+                <w:sz w:val="16"/>
+                <w:szCs w:val="16"/>
+                <w14:ligatures w14:val="none"/>
+              </w:rPr>
+            </w:pPr>
+            <w:r>
+              <w:rPr>
+                <w:rFonts w:ascii="Arial" w:eastAsia="Times New Roman" w:hAnsi="Arial" w:cs="Arial"/>
+                <w:color w:val="000000"/>
+                <w:kern w:val="0"/>
+                <w:sz w:val="16"/>
+                <w:szCs w:val="16"/>
+                <w14:ligatures w14:val="none"/>
+              </w:rPr>
+              <w:t xml:space="preserve">essential </w:t>
+            </w:r>
+            <w:r>
+              <w:rPr>
+                <w:rFonts w:ascii="Arial" w:eastAsia="Times New Roman" w:hAnsi="Arial" w:cs="Arial"/>
+                <w:color w:val="000000"/>
+                <w:kern w:val="0"/>
+                <w:sz w:val="16"/>
+                <w:szCs w:val="16"/>
+                <w14:ligatures w14:val="none"/>
+              </w:rPr>
+              <w:t xml:space="preserve">to our </w:t>
+            </w:r>
+            <w:r>
+              <w:rPr>
+                <w:rFonts w:ascii="Arial" w:eastAsia="Times New Roman" w:hAnsi="Arial" w:cs="Arial"/>
+                <w:color w:val="000000"/>
+                <w:kern w:val="0"/>
+                <w:sz w:val="16"/>
+                <w:szCs w:val="16"/>
+                <w14:ligatures w14:val="none"/>
+              </w:rPr>
+              <w:t>manuscript.</w:t>
+            </w:r>
           </w:p>
         </w:tc>
       </w:tr>
@@ -8901,6 +11046,28 @@
                 <w14:ligatures w14:val="none"/>
               </w:rPr>
             </w:pPr>
+            <w:r>
+              <w:rPr>
+                <w:rFonts w:ascii="Arial" w:eastAsia="Times New Roman" w:hAnsi="Arial" w:cs="Arial"/>
+                <w:color w:val="000000"/>
+                <w:kern w:val="0"/>
+                <w:sz w:val="16"/>
+                <w:szCs w:val="16"/>
+                <w14:ligatures w14:val="none"/>
+              </w:rPr>
+              <w:t xml:space="preserve">We have </w:t>
+            </w:r>
+            <w:r>
+              <w:rPr>
+                <w:rFonts w:ascii="Arial" w:eastAsia="Times New Roman" w:hAnsi="Arial" w:cs="Arial"/>
+                <w:color w:val="000000"/>
+                <w:kern w:val="0"/>
+                <w:sz w:val="16"/>
+                <w:szCs w:val="16"/>
+                <w14:ligatures w14:val="none"/>
+              </w:rPr>
+              <w:t>included an updated Reporting Summary with our resubmission.</w:t>
+            </w:r>
           </w:p>
         </w:tc>
       </w:tr>
@@ -9363,6 +11530,7 @@
                 <w:kern w:val="0"/>
                 <w:sz w:val="16"/>
                 <w:szCs w:val="16"/>
+                <w:highlight w:val="yellow"/>
                 <w14:ligatures w14:val="none"/>
               </w:rPr>
             </w:pPr>
@@ -9403,6 +11571,195 @@
                 <w14:ligatures w14:val="none"/>
               </w:rPr>
             </w:pPr>
+            <w:r>
+              <w:rPr>
+                <w:rFonts w:ascii="Arial" w:eastAsia="Times New Roman" w:hAnsi="Arial" w:cs="Arial"/>
+                <w:color w:val="000000"/>
+                <w:kern w:val="0"/>
+                <w:sz w:val="16"/>
+                <w:szCs w:val="16"/>
+                <w14:ligatures w14:val="none"/>
+              </w:rPr>
+              <w:t xml:space="preserve">We </w:t>
+            </w:r>
+            <w:r>
+              <w:rPr>
+                <w:rFonts w:ascii="Arial" w:eastAsia="Times New Roman" w:hAnsi="Arial" w:cs="Arial"/>
+                <w:color w:val="000000"/>
+                <w:kern w:val="0"/>
+                <w:sz w:val="16"/>
+                <w:szCs w:val="16"/>
+                <w14:ligatures w14:val="none"/>
+              </w:rPr>
+              <w:t xml:space="preserve">report Pearson’s </w:t>
+            </w:r>
+            <w:r>
+              <w:rPr>
+                <w:rFonts w:ascii="Arial" w:eastAsia="Times New Roman" w:hAnsi="Arial" w:cs="Arial"/>
+                <w:i/>
+                <w:iCs/>
+                <w:color w:val="000000"/>
+                <w:kern w:val="0"/>
+                <w:sz w:val="16"/>
+                <w:szCs w:val="16"/>
+                <w14:ligatures w14:val="none"/>
+              </w:rPr>
+              <w:t>r</w:t>
+            </w:r>
+            <w:r>
+              <w:rPr>
+                <w:rFonts w:ascii="Arial" w:eastAsia="Times New Roman" w:hAnsi="Arial" w:cs="Arial"/>
+                <w:color w:val="000000"/>
+                <w:kern w:val="0"/>
+                <w:sz w:val="16"/>
+                <w:szCs w:val="16"/>
+                <w14:ligatures w14:val="none"/>
+              </w:rPr>
+              <w:t xml:space="preserve"> </w:t>
+            </w:r>
+            <w:r>
+              <w:rPr>
+                <w:rFonts w:ascii="Arial" w:eastAsia="Times New Roman" w:hAnsi="Arial" w:cs="Arial"/>
+                <w:color w:val="000000"/>
+                <w:kern w:val="0"/>
+                <w:sz w:val="16"/>
+                <w:szCs w:val="16"/>
+                <w14:ligatures w14:val="none"/>
+              </w:rPr>
+              <w:t xml:space="preserve">(i.e., correlations) for multiple analyses </w:t>
+            </w:r>
+            <w:r>
+              <w:rPr>
+                <w:rFonts w:ascii="Arial" w:eastAsia="Times New Roman" w:hAnsi="Arial" w:cs="Arial"/>
+                <w:color w:val="000000"/>
+                <w:kern w:val="0"/>
+                <w:sz w:val="16"/>
+                <w:szCs w:val="16"/>
+                <w14:ligatures w14:val="none"/>
+              </w:rPr>
+              <w:t>presented in</w:t>
+            </w:r>
+            <w:r>
+              <w:rPr>
+                <w:rFonts w:ascii="Arial" w:eastAsia="Times New Roman" w:hAnsi="Arial" w:cs="Arial"/>
+                <w:color w:val="000000"/>
+                <w:kern w:val="0"/>
+                <w:sz w:val="16"/>
+                <w:szCs w:val="16"/>
+                <w14:ligatures w14:val="none"/>
+              </w:rPr>
+              <w:t xml:space="preserve"> our </w:t>
+            </w:r>
+            <w:r>
+              <w:rPr>
+                <w:rFonts w:ascii="Arial" w:eastAsia="Times New Roman" w:hAnsi="Arial" w:cs="Arial"/>
+                <w:color w:val="000000"/>
+                <w:kern w:val="0"/>
+                <w:sz w:val="16"/>
+                <w:szCs w:val="16"/>
+                <w14:ligatures w14:val="none"/>
+              </w:rPr>
+              <w:t>Results section</w:t>
+            </w:r>
+            <w:r>
+              <w:rPr>
+                <w:rFonts w:ascii="Arial" w:eastAsia="Times New Roman" w:hAnsi="Arial" w:cs="Arial"/>
+                <w:color w:val="000000"/>
+                <w:kern w:val="0"/>
+                <w:sz w:val="16"/>
+                <w:szCs w:val="16"/>
+                <w14:ligatures w14:val="none"/>
+              </w:rPr>
+              <w:t xml:space="preserve"> and Supplementary Information file</w:t>
+            </w:r>
+            <w:r>
+              <w:rPr>
+                <w:rFonts w:ascii="Arial" w:eastAsia="Times New Roman" w:hAnsi="Arial" w:cs="Arial"/>
+                <w:color w:val="000000"/>
+                <w:kern w:val="0"/>
+                <w:sz w:val="16"/>
+                <w:szCs w:val="16"/>
+                <w14:ligatures w14:val="none"/>
+              </w:rPr>
+              <w:t xml:space="preserve"> (e.g.,</w:t>
+            </w:r>
+            <w:r>
+              <w:rPr>
+                <w:rFonts w:ascii="Arial" w:eastAsia="Times New Roman" w:hAnsi="Arial" w:cs="Arial"/>
+                <w:color w:val="000000"/>
+                <w:kern w:val="0"/>
+                <w:sz w:val="16"/>
+                <w:szCs w:val="16"/>
+                <w14:ligatures w14:val="none"/>
+              </w:rPr>
+              <w:t xml:space="preserve"> </w:t>
+            </w:r>
+            <w:r>
+              <w:rPr>
+                <w:rFonts w:ascii="Arial" w:eastAsia="Times New Roman" w:hAnsi="Arial" w:cs="Arial"/>
+                <w:color w:val="000000"/>
+                <w:kern w:val="0"/>
+                <w:sz w:val="16"/>
+                <w:szCs w:val="16"/>
+                <w14:ligatures w14:val="none"/>
+              </w:rPr>
+              <w:t>Fig</w:t>
+            </w:r>
+            <w:r>
+              <w:rPr>
+                <w:rFonts w:ascii="Arial" w:eastAsia="Times New Roman" w:hAnsi="Arial" w:cs="Arial"/>
+                <w:color w:val="000000"/>
+                <w:kern w:val="0"/>
+                <w:sz w:val="16"/>
+                <w:szCs w:val="16"/>
+                <w14:ligatures w14:val="none"/>
+              </w:rPr>
+              <w:t>ure</w:t>
+            </w:r>
+            <w:r>
+              <w:rPr>
+                <w:rFonts w:ascii="Arial" w:eastAsia="Times New Roman" w:hAnsi="Arial" w:cs="Arial"/>
+                <w:color w:val="000000"/>
+                <w:kern w:val="0"/>
+                <w:sz w:val="16"/>
+                <w:szCs w:val="16"/>
+                <w14:ligatures w14:val="none"/>
+              </w:rPr>
+              <w:t xml:space="preserve"> 3</w:t>
+            </w:r>
+            <w:r>
+              <w:rPr>
+                <w:rFonts w:ascii="Arial" w:eastAsia="Times New Roman" w:hAnsi="Arial" w:cs="Arial"/>
+                <w:color w:val="000000"/>
+                <w:kern w:val="0"/>
+                <w:sz w:val="16"/>
+                <w:szCs w:val="16"/>
+                <w14:ligatures w14:val="none"/>
+              </w:rPr>
+              <w:t xml:space="preserve">b, </w:t>
+            </w:r>
+            <w:r>
+              <w:rPr>
+                <w:rFonts w:ascii="Arial" w:eastAsia="Times New Roman" w:hAnsi="Arial" w:cs="Arial"/>
+                <w:color w:val="000000"/>
+                <w:kern w:val="0"/>
+                <w:sz w:val="16"/>
+                <w:szCs w:val="16"/>
+                <w14:ligatures w14:val="none"/>
+              </w:rPr>
+              <w:t>Supplementary Figure 2b)</w:t>
+            </w:r>
+            <w:r>
+              <w:rPr>
+                <w:rFonts w:ascii="Arial" w:eastAsia="Times New Roman" w:hAnsi="Arial" w:cs="Arial"/>
+                <w:color w:val="000000"/>
+                <w:kern w:val="0"/>
+                <w:sz w:val="16"/>
+                <w:szCs w:val="16"/>
+                <w14:ligatures w14:val="none"/>
+              </w:rPr>
+              <w:t>.</w:t>
+            </w:r>
           </w:p>
         </w:tc>
       </w:tr>
@@ -9515,6 +11872,7 @@
                 <w:szCs w:val="16"/>
                 <w14:ligatures w14:val="none"/>
               </w:rPr>
+              <w:lastRenderedPageBreak/>
               <w:t>Please ensure all the data collection/data analysis software/tools/algorithms/packages used in the study are clearly mentioned in the manuscript and are also listed in the reporting summary (with version numbers).</w:t>
             </w:r>
           </w:p>
@@ -9543,6 +11901,127 @@
                 <w14:ligatures w14:val="none"/>
               </w:rPr>
             </w:pPr>
+            <w:r>
+              <w:rPr>
+                <w:rFonts w:ascii="Arial" w:eastAsia="Times New Roman" w:hAnsi="Arial" w:cs="Arial"/>
+                <w:color w:val="000000"/>
+                <w:kern w:val="0"/>
+                <w:sz w:val="16"/>
+                <w:szCs w:val="16"/>
+                <w14:ligatures w14:val="none"/>
+              </w:rPr>
+              <w:t xml:space="preserve">We have listed all software </w:t>
+            </w:r>
+            <w:r>
+              <w:rPr>
+                <w:rFonts w:ascii="Arial" w:eastAsia="Times New Roman" w:hAnsi="Arial" w:cs="Arial"/>
+                <w:color w:val="000000"/>
+                <w:kern w:val="0"/>
+                <w:sz w:val="16"/>
+                <w:szCs w:val="16"/>
+                <w14:ligatures w14:val="none"/>
+              </w:rPr>
+              <w:t xml:space="preserve">tools and packages </w:t>
+            </w:r>
+            <w:r>
+              <w:rPr>
+                <w:rFonts w:ascii="Arial" w:eastAsia="Times New Roman" w:hAnsi="Arial" w:cs="Arial"/>
+                <w:color w:val="000000"/>
+                <w:kern w:val="0"/>
+                <w:sz w:val="16"/>
+                <w:szCs w:val="16"/>
+                <w14:ligatures w14:val="none"/>
+              </w:rPr>
+              <w:t xml:space="preserve">used in our study (with version numbers) in our Reporting Summary. However, as these comprise </w:t>
+            </w:r>
+            <w:r>
+              <w:rPr>
+                <w:rFonts w:ascii="Arial" w:eastAsia="Times New Roman" w:hAnsi="Arial" w:cs="Arial"/>
+                <w:color w:val="000000"/>
+                <w:kern w:val="0"/>
+                <w:sz w:val="16"/>
+                <w:szCs w:val="16"/>
+                <w14:ligatures w14:val="none"/>
+              </w:rPr>
+              <w:t>over 300</w:t>
+            </w:r>
+            <w:r>
+              <w:rPr>
+                <w:rFonts w:ascii="Arial" w:eastAsia="Times New Roman" w:hAnsi="Arial" w:cs="Arial"/>
+                <w:color w:val="000000"/>
+                <w:kern w:val="0"/>
+                <w:sz w:val="16"/>
+                <w:szCs w:val="16"/>
+                <w14:ligatures w14:val="none"/>
+              </w:rPr>
+              <w:t xml:space="preserve"> </w:t>
+            </w:r>
+            <w:r>
+              <w:rPr>
+                <w:rFonts w:ascii="Arial" w:eastAsia="Times New Roman" w:hAnsi="Arial" w:cs="Arial"/>
+                <w:color w:val="000000"/>
+                <w:kern w:val="0"/>
+                <w:sz w:val="16"/>
+                <w:szCs w:val="16"/>
+                <w14:ligatures w14:val="none"/>
+              </w:rPr>
+              <w:t xml:space="preserve">individual </w:t>
+            </w:r>
+            <w:r>
+              <w:rPr>
+                <w:rFonts w:ascii="Arial" w:eastAsia="Times New Roman" w:hAnsi="Arial" w:cs="Arial"/>
+                <w:color w:val="000000"/>
+                <w:kern w:val="0"/>
+                <w:sz w:val="16"/>
+                <w:szCs w:val="16"/>
+                <w14:ligatures w14:val="none"/>
+              </w:rPr>
+              <w:t>packages</w:t>
+            </w:r>
+            <w:r>
+              <w:rPr>
+                <w:rFonts w:ascii="Arial" w:eastAsia="Times New Roman" w:hAnsi="Arial" w:cs="Arial"/>
+                <w:color w:val="000000"/>
+                <w:kern w:val="0"/>
+                <w:sz w:val="16"/>
+                <w:szCs w:val="16"/>
+                <w14:ligatures w14:val="none"/>
+              </w:rPr>
+              <w:t xml:space="preserve">, we feel </w:t>
+            </w:r>
+            <w:r>
+              <w:rPr>
+                <w:rFonts w:ascii="Arial" w:eastAsia="Times New Roman" w:hAnsi="Arial" w:cs="Arial"/>
+                <w:color w:val="000000"/>
+                <w:kern w:val="0"/>
+                <w:sz w:val="16"/>
+                <w:szCs w:val="16"/>
+                <w14:ligatures w14:val="none"/>
+              </w:rPr>
+              <w:t xml:space="preserve">listing them in the </w:t>
+            </w:r>
+            <w:r>
+              <w:rPr>
+                <w:rFonts w:ascii="Arial" w:eastAsia="Times New Roman" w:hAnsi="Arial" w:cs="Arial"/>
+                <w:color w:val="000000"/>
+                <w:kern w:val="0"/>
+                <w:sz w:val="16"/>
+                <w:szCs w:val="16"/>
+                <w14:ligatures w14:val="none"/>
+              </w:rPr>
+              <w:t>manuscript itself would be unwieldy</w:t>
+            </w:r>
+            <w:r>
+              <w:rPr>
+                <w:rFonts w:ascii="Arial" w:eastAsia="Times New Roman" w:hAnsi="Arial" w:cs="Arial"/>
+                <w:color w:val="000000"/>
+                <w:kern w:val="0"/>
+                <w:sz w:val="16"/>
+                <w:szCs w:val="16"/>
+                <w14:ligatures w14:val="none"/>
+              </w:rPr>
+              <w:t>.</w:t>
+            </w:r>
           </w:p>
         </w:tc>
       </w:tr>
@@ -9586,7 +12065,6 @@
                 <w:szCs w:val="16"/>
                 <w14:ligatures w14:val="none"/>
               </w:rPr>
-              <w:lastRenderedPageBreak/>
               <w:t>Field Specific Reporting</w:t>
             </w:r>
           </w:p>
@@ -9757,6 +12235,17 @@
                 <w14:ligatures w14:val="none"/>
               </w:rPr>
             </w:pPr>
+            <w:r>
+              <w:rPr>
+                <w:rFonts w:ascii="Arial" w:eastAsia="Times New Roman" w:hAnsi="Arial" w:cs="Arial"/>
+                <w:color w:val="000000"/>
+                <w:kern w:val="0"/>
+                <w:sz w:val="16"/>
+                <w:szCs w:val="16"/>
+                <w14:ligatures w14:val="none"/>
+              </w:rPr>
+              <w:t>Done.</w:t>
+            </w:r>
           </w:p>
         </w:tc>
       </w:tr>
@@ -9897,6 +12386,17 @@
                 <w14:ligatures w14:val="none"/>
               </w:rPr>
             </w:pPr>
+            <w:r>
+              <w:rPr>
+                <w:rFonts w:ascii="Arial" w:eastAsia="Times New Roman" w:hAnsi="Arial" w:cs="Arial"/>
+                <w:color w:val="000000"/>
+                <w:kern w:val="0"/>
+                <w:sz w:val="16"/>
+                <w:szCs w:val="16"/>
+                <w14:ligatures w14:val="none"/>
+              </w:rPr>
+              <w:t>Done.</w:t>
+            </w:r>
           </w:p>
         </w:tc>
       </w:tr>

</xml_diff>

<commit_message>
final updates before creating zenodo DOI
</commit_message>
<xml_diff>
--- a/paper/admin/Author_Checklist_NCOMMS-23-10640C__1762787328_45.docx
+++ b/paper/admin/Author_Checklist_NCOMMS-23-10640C__1762787328_45.docx
@@ -1010,7 +1010,31 @@
                 <w14:ligatures w14:val="none"/>
               </w:rPr>
               <w:lastRenderedPageBreak/>
-              <w:t xml:space="preserve">Please supply a two-sentence summary of your work to be used on our website and in our e-alerts. The summary should be written in the third person, accessible to a broad audience, contain no more than 250 *characters* including spaces, and should include two sentences, the first of which describes the background to the work, and the second of which summarises the major conclusions.  </w:t>
+              <w:t xml:space="preserve">Please supply a two-sentence summary of your work to be used on our website and in our e-alerts. The summary should be written in the third person, accessible to a broad audience, contain no more than 250 *characters* including spaces, and should include two sentences, the first of which describes the background to the work, and the second of which </w:t>
+            </w:r>
+            <w:proofErr w:type="spellStart"/>
+            <w:r>
+              <w:rPr>
+                <w:rFonts w:ascii="Arial" w:eastAsia="Times New Roman" w:hAnsi="Arial" w:cs="Arial"/>
+                <w:color w:val="000000"/>
+                <w:kern w:val="0"/>
+                <w:sz w:val="16"/>
+                <w:szCs w:val="16"/>
+                <w14:ligatures w14:val="none"/>
+              </w:rPr>
+              <w:t>summarises</w:t>
+            </w:r>
+            <w:proofErr w:type="spellEnd"/>
+            <w:r>
+              <w:rPr>
+                <w:rFonts w:ascii="Arial" w:eastAsia="Times New Roman" w:hAnsi="Arial" w:cs="Arial"/>
+                <w:color w:val="000000"/>
+                <w:kern w:val="0"/>
+                <w:sz w:val="16"/>
+                <w:szCs w:val="16"/>
+                <w14:ligatures w14:val="none"/>
+              </w:rPr>
+              <w:t xml:space="preserve"> the major conclusions.  </w:t>
             </w:r>
             <w:r>
               <w:rPr>
@@ -1231,7 +1255,29 @@
                 <w:szCs w:val="16"/>
                 <w14:ligatures w14:val="none"/>
               </w:rPr>
-              <w:t>Traditional quiz scores provide limited insight into what students know. The authors show that text embedding models combined with short multiple-choice quizzes yield high-resolution maps of conceptual knowledge and learning.</w:t>
+              <w:t xml:space="preserve">Traditional quiz scores provide limited insight into what students know. The authors show that text embedding models combined with short multiple-choice quizzes yield </w:t>
+            </w:r>
+            <w:r>
+              <w:rPr>
+                <w:rFonts w:ascii="Arial" w:eastAsia="Times New Roman" w:hAnsi="Arial" w:cs="Arial"/>
+                <w:color w:val="000000"/>
+                <w:kern w:val="0"/>
+                <w:sz w:val="16"/>
+                <w:szCs w:val="16"/>
+                <w14:ligatures w14:val="none"/>
+              </w:rPr>
+              <w:t xml:space="preserve">detailed </w:t>
+            </w:r>
+            <w:r>
+              <w:rPr>
+                <w:rFonts w:ascii="Arial" w:eastAsia="Times New Roman" w:hAnsi="Arial" w:cs="Arial"/>
+                <w:color w:val="000000"/>
+                <w:kern w:val="0"/>
+                <w:sz w:val="16"/>
+                <w:szCs w:val="16"/>
+                <w14:ligatures w14:val="none"/>
+              </w:rPr>
+              <w:t>maps of conceptual knowledge and learning.</w:t>
             </w:r>
           </w:p>
         </w:tc>
@@ -1776,7 +1822,68 @@
                 <w:szCs w:val="16"/>
                 <w14:ligatures w14:val="none"/>
               </w:rPr>
-              <w:t>Ensure affiliations are appropriately labeled and featured sequentially and in ascending order (1,2,3,... or a,b,c...). Please ensure all corresponding authors are marked with a specific symbol and include their emails.</w:t>
+              <w:t>Ensure affiliations are appropriately labeled and featured sequentially and in ascending order (1,</w:t>
+            </w:r>
+            <w:proofErr w:type="gramStart"/>
+            <w:r>
+              <w:rPr>
+                <w:rFonts w:ascii="Arial" w:eastAsia="Times New Roman" w:hAnsi="Arial" w:cs="Arial"/>
+                <w:color w:val="000000"/>
+                <w:kern w:val="0"/>
+                <w:sz w:val="16"/>
+                <w:szCs w:val="16"/>
+                <w14:ligatures w14:val="none"/>
+              </w:rPr>
+              <w:t>2,3,...</w:t>
+            </w:r>
+            <w:proofErr w:type="gramEnd"/>
+            <w:r>
+              <w:rPr>
+                <w:rFonts w:ascii="Arial" w:eastAsia="Times New Roman" w:hAnsi="Arial" w:cs="Arial"/>
+                <w:color w:val="000000"/>
+                <w:kern w:val="0"/>
+                <w:sz w:val="16"/>
+                <w:szCs w:val="16"/>
+                <w14:ligatures w14:val="none"/>
+              </w:rPr>
+              <w:t xml:space="preserve"> or </w:t>
+            </w:r>
+            <w:proofErr w:type="spellStart"/>
+            <w:proofErr w:type="gramStart"/>
+            <w:r>
+              <w:rPr>
+                <w:rFonts w:ascii="Arial" w:eastAsia="Times New Roman" w:hAnsi="Arial" w:cs="Arial"/>
+                <w:color w:val="000000"/>
+                <w:kern w:val="0"/>
+                <w:sz w:val="16"/>
+                <w:szCs w:val="16"/>
+                <w14:ligatures w14:val="none"/>
+              </w:rPr>
+              <w:t>a,b</w:t>
+            </w:r>
+            <w:proofErr w:type="gramEnd"/>
+            <w:r>
+              <w:rPr>
+                <w:rFonts w:ascii="Arial" w:eastAsia="Times New Roman" w:hAnsi="Arial" w:cs="Arial"/>
+                <w:color w:val="000000"/>
+                <w:kern w:val="0"/>
+                <w:sz w:val="16"/>
+                <w:szCs w:val="16"/>
+                <w14:ligatures w14:val="none"/>
+              </w:rPr>
+              <w:t>,c</w:t>
+            </w:r>
+            <w:proofErr w:type="spellEnd"/>
+            <w:r>
+              <w:rPr>
+                <w:rFonts w:ascii="Arial" w:eastAsia="Times New Roman" w:hAnsi="Arial" w:cs="Arial"/>
+                <w:color w:val="000000"/>
+                <w:kern w:val="0"/>
+                <w:sz w:val="16"/>
+                <w:szCs w:val="16"/>
+                <w14:ligatures w14:val="none"/>
+              </w:rPr>
+              <w:t>...). Please ensure all corresponding authors are marked with a specific symbol and include their emails.</w:t>
             </w:r>
             <w:r>
               <w:rPr>
@@ -2513,7 +2620,63 @@
                 <w:szCs w:val="16"/>
                 <w14:ligatures w14:val="none"/>
               </w:rPr>
-              <w:t>To comply with this format and optimise the presentation of data in your Article, we suggest the following changes to the display items in your paper:</w:t>
+              <w:t xml:space="preserve">To comply with this format and </w:t>
+            </w:r>
+            <w:proofErr w:type="spellStart"/>
+            <w:r>
+              <w:rPr>
+                <w:rFonts w:ascii="Arial" w:eastAsia="Times New Roman" w:hAnsi="Arial" w:cs="Arial"/>
+                <w:b/>
+                <w:bCs/>
+                <w:color w:val="000000"/>
+                <w:kern w:val="0"/>
+                <w:sz w:val="16"/>
+                <w:szCs w:val="16"/>
+                <w14:ligatures w14:val="none"/>
+              </w:rPr>
+              <w:t>optimise</w:t>
+            </w:r>
+            <w:proofErr w:type="spellEnd"/>
+            <w:r>
+              <w:rPr>
+                <w:rFonts w:ascii="Arial" w:eastAsia="Times New Roman" w:hAnsi="Arial" w:cs="Arial"/>
+                <w:b/>
+                <w:bCs/>
+                <w:color w:val="000000"/>
+                <w:kern w:val="0"/>
+                <w:sz w:val="16"/>
+                <w:szCs w:val="16"/>
+                <w14:ligatures w14:val="none"/>
+              </w:rPr>
+              <w:t xml:space="preserve"> the presentation of data in your </w:t>
+            </w:r>
+            <w:proofErr w:type="gramStart"/>
+            <w:r>
+              <w:rPr>
+                <w:rFonts w:ascii="Arial" w:eastAsia="Times New Roman" w:hAnsi="Arial" w:cs="Arial"/>
+                <w:b/>
+                <w:bCs/>
+                <w:color w:val="000000"/>
+                <w:kern w:val="0"/>
+                <w:sz w:val="16"/>
+                <w:szCs w:val="16"/>
+                <w14:ligatures w14:val="none"/>
+              </w:rPr>
+              <w:t>Article</w:t>
+            </w:r>
+            <w:proofErr w:type="gramEnd"/>
+            <w:r>
+              <w:rPr>
+                <w:rFonts w:ascii="Arial" w:eastAsia="Times New Roman" w:hAnsi="Arial" w:cs="Arial"/>
+                <w:b/>
+                <w:bCs/>
+                <w:color w:val="000000"/>
+                <w:kern w:val="0"/>
+                <w:sz w:val="16"/>
+                <w:szCs w:val="16"/>
+                <w14:ligatures w14:val="none"/>
+              </w:rPr>
+              <w:t>, we suggest the following changes to the display items in your paper:</w:t>
             </w:r>
           </w:p>
         </w:tc>
@@ -3098,7 +3261,31 @@
                 <w:szCs w:val="16"/>
                 <w14:ligatures w14:val="none"/>
               </w:rPr>
-              <w:t>We do not edit Supplementary Information files; they will be uploaded with the published article as they are submitted with the final version of your manuscript. Any tracked changes should be removed from the file and the file should be provided as a PDF file. Supplementary Figures do not need to be provided separately.</w:t>
+              <w:t xml:space="preserve">We do not edit Supplementary Information files; they will be uploaded with the published article as they are submitted with the final version of your manuscript. Any tracked changes should be removed from the </w:t>
+            </w:r>
+            <w:proofErr w:type="gramStart"/>
+            <w:r>
+              <w:rPr>
+                <w:rFonts w:ascii="Arial" w:eastAsia="Times New Roman" w:hAnsi="Arial" w:cs="Arial"/>
+                <w:color w:val="000000"/>
+                <w:kern w:val="0"/>
+                <w:sz w:val="16"/>
+                <w:szCs w:val="16"/>
+                <w14:ligatures w14:val="none"/>
+              </w:rPr>
+              <w:t>file</w:t>
+            </w:r>
+            <w:proofErr w:type="gramEnd"/>
+            <w:r>
+              <w:rPr>
+                <w:rFonts w:ascii="Arial" w:eastAsia="Times New Roman" w:hAnsi="Arial" w:cs="Arial"/>
+                <w:color w:val="000000"/>
+                <w:kern w:val="0"/>
+                <w:sz w:val="16"/>
+                <w:szCs w:val="16"/>
+                <w14:ligatures w14:val="none"/>
+              </w:rPr>
+              <w:t xml:space="preserve"> and the file should be provided as a PDF file. Supplementary Figures do not need to be provided separately.</w:t>
             </w:r>
           </w:p>
         </w:tc>
@@ -3768,7 +3955,55 @@
                 <w14:ligatures w14:val="none"/>
               </w:rPr>
               <w:lastRenderedPageBreak/>
-              <w:t xml:space="preserve">Please follow our statistical guidelines when reporting statistics (https://www.nature.com/documents/ncomms_-_statisticalguidance.pdf). We particularly wish to draw your attention to our requirements for the reporting and interpretation of null results. Non-significant findings derived from null-hypotheses significance tests (NHST) may not be interpreted.  For instance, when reporting null results obtained through NHST, you cannot say ‘there was no difference…’ or ‘there was no effect…’; instead, you must say ‘there was no statistically significant difference…’ or ‘there was no statistically significant effect…’.. It also inappropriate to say ‘There was no statistically significant difference between x and y (p=.342), which suggests that…’.  </w:t>
+              <w:t>Please follow our statistical guidelines when reporting statistics (https://www.nature.com/documents/ncomms_-_statisticalguidance.pdf). We particularly wish to draw your attention to our requirements for the reporting and interpretation of null results. Non-significant findings derived from null-hypotheses significance tests (NHST) may not be interpreted.  For instance, when reporting null results obtained through NHST, you cannot say ‘there was no difference…’ or ‘there was no effect…’; instead, you must say ‘there was no statistically significant difference…’ or ‘there was no statistically significant effect…</w:t>
+            </w:r>
+            <w:proofErr w:type="gramStart"/>
+            <w:r>
+              <w:rPr>
+                <w:rFonts w:ascii="Arial" w:eastAsia="Times New Roman" w:hAnsi="Arial" w:cs="Arial"/>
+                <w:color w:val="000000"/>
+                <w:kern w:val="0"/>
+                <w:sz w:val="16"/>
+                <w:szCs w:val="16"/>
+                <w14:ligatures w14:val="none"/>
+              </w:rPr>
+              <w:t>’..</w:t>
+            </w:r>
+            <w:proofErr w:type="gramEnd"/>
+            <w:r>
+              <w:rPr>
+                <w:rFonts w:ascii="Arial" w:eastAsia="Times New Roman" w:hAnsi="Arial" w:cs="Arial"/>
+                <w:color w:val="000000"/>
+                <w:kern w:val="0"/>
+                <w:sz w:val="16"/>
+                <w:szCs w:val="16"/>
+                <w14:ligatures w14:val="none"/>
+              </w:rPr>
+              <w:t xml:space="preserve"> It also inappropriate to </w:t>
+            </w:r>
+            <w:proofErr w:type="gramStart"/>
+            <w:r>
+              <w:rPr>
+                <w:rFonts w:ascii="Arial" w:eastAsia="Times New Roman" w:hAnsi="Arial" w:cs="Arial"/>
+                <w:color w:val="000000"/>
+                <w:kern w:val="0"/>
+                <w:sz w:val="16"/>
+                <w:szCs w:val="16"/>
+                <w14:ligatures w14:val="none"/>
+              </w:rPr>
+              <w:t>say</w:t>
+            </w:r>
+            <w:proofErr w:type="gramEnd"/>
+            <w:r>
+              <w:rPr>
+                <w:rFonts w:ascii="Arial" w:eastAsia="Times New Roman" w:hAnsi="Arial" w:cs="Arial"/>
+                <w:color w:val="000000"/>
+                <w:kern w:val="0"/>
+                <w:sz w:val="16"/>
+                <w:szCs w:val="16"/>
+                <w14:ligatures w14:val="none"/>
+              </w:rPr>
+              <w:t xml:space="preserve"> ‘There was no statistically significant difference between x and y (p=.342), which suggests that…’.  </w:t>
             </w:r>
             <w:r>
               <w:rPr>
@@ -4004,16 +4239,29 @@
                 <w14:ligatures w14:val="none"/>
               </w:rPr>
             </w:pPr>
-            <w:r>
-              <w:rPr>
-                <w:rFonts w:ascii="Arial" w:eastAsia="Times New Roman" w:hAnsi="Arial" w:cs="Arial"/>
-                <w:color w:val="000000"/>
-                <w:kern w:val="0"/>
-                <w:sz w:val="16"/>
-                <w:szCs w:val="16"/>
-                <w14:ligatures w14:val="none"/>
-              </w:rPr>
-              <w:t xml:space="preserve">Any body of text within the Supplementary Information file (except figure and table legends) should come under a main heading of 'Supplementary Methods', 'Supplementary Discussion' or a numbered 'Supplementary Note X'. Subheadings are then permitted under these. Please ensure to refer to these headings in the main manuscript.  </w:t>
+            <w:proofErr w:type="spellStart"/>
+            <w:r>
+              <w:rPr>
+                <w:rFonts w:ascii="Arial" w:eastAsia="Times New Roman" w:hAnsi="Arial" w:cs="Arial"/>
+                <w:color w:val="000000"/>
+                <w:kern w:val="0"/>
+                <w:sz w:val="16"/>
+                <w:szCs w:val="16"/>
+                <w14:ligatures w14:val="none"/>
+              </w:rPr>
+              <w:t>Any body</w:t>
+            </w:r>
+            <w:proofErr w:type="spellEnd"/>
+            <w:r>
+              <w:rPr>
+                <w:rFonts w:ascii="Arial" w:eastAsia="Times New Roman" w:hAnsi="Arial" w:cs="Arial"/>
+                <w:color w:val="000000"/>
+                <w:kern w:val="0"/>
+                <w:sz w:val="16"/>
+                <w:szCs w:val="16"/>
+                <w14:ligatures w14:val="none"/>
+              </w:rPr>
+              <w:t xml:space="preserve"> of text within the Supplementary Information file (except figure and table legends) should come under a main heading of 'Supplementary Methods', 'Supplementary Discussion' or a numbered 'Supplementary Note X'. Subheadings are then permitted under these. Please ensure to refer to these headings in the main manuscript.  </w:t>
             </w:r>
           </w:p>
         </w:tc>
@@ -4050,7 +4298,29 @@
                 <w:szCs w:val="16"/>
                 <w14:ligatures w14:val="none"/>
               </w:rPr>
-              <w:t>We have renamed our “Supplementary results” section to “Supplementary discussion” to comply with this guideline. We refer to this section in the Discussion section of our main manuscript.</w:t>
+              <w:t xml:space="preserve">We have renamed our “Supplementary results” section to “Supplementary discussion” to </w:t>
+            </w:r>
+            <w:r>
+              <w:rPr>
+                <w:rFonts w:ascii="Arial" w:eastAsia="Times New Roman" w:hAnsi="Arial" w:cs="Arial"/>
+                <w:color w:val="000000"/>
+                <w:kern w:val="0"/>
+                <w:sz w:val="16"/>
+                <w:szCs w:val="16"/>
+                <w14:ligatures w14:val="none"/>
+              </w:rPr>
+              <w:t xml:space="preserve">adhere to </w:t>
+            </w:r>
+            <w:r>
+              <w:rPr>
+                <w:rFonts w:ascii="Arial" w:eastAsia="Times New Roman" w:hAnsi="Arial" w:cs="Arial"/>
+                <w:color w:val="000000"/>
+                <w:kern w:val="0"/>
+                <w:sz w:val="16"/>
+                <w:szCs w:val="16"/>
+                <w14:ligatures w14:val="none"/>
+              </w:rPr>
+              <w:t>this guideline. We refer to this section in the Discussion section of our main manuscript.</w:t>
             </w:r>
           </w:p>
         </w:tc>
@@ -4091,7 +4361,31 @@
                 <w:szCs w:val="16"/>
                 <w14:ligatures w14:val="none"/>
               </w:rPr>
-              <w:t xml:space="preserve">Please clarify whether you have obtained permission to share the Khan Univerisity lecture transcripts (Supplementary Table 3). </w:t>
+              <w:t xml:space="preserve">Please clarify whether you have obtained permission to share the Khan </w:t>
+            </w:r>
+            <w:proofErr w:type="spellStart"/>
+            <w:r>
+              <w:rPr>
+                <w:rFonts w:ascii="Arial" w:eastAsia="Times New Roman" w:hAnsi="Arial" w:cs="Arial"/>
+                <w:color w:val="000000"/>
+                <w:kern w:val="0"/>
+                <w:sz w:val="16"/>
+                <w:szCs w:val="16"/>
+                <w14:ligatures w14:val="none"/>
+              </w:rPr>
+              <w:t>Univerisity</w:t>
+            </w:r>
+            <w:proofErr w:type="spellEnd"/>
+            <w:r>
+              <w:rPr>
+                <w:rFonts w:ascii="Arial" w:eastAsia="Times New Roman" w:hAnsi="Arial" w:cs="Arial"/>
+                <w:color w:val="000000"/>
+                <w:kern w:val="0"/>
+                <w:sz w:val="16"/>
+                <w:szCs w:val="16"/>
+                <w14:ligatures w14:val="none"/>
+              </w:rPr>
+              <w:t xml:space="preserve"> lecture transcripts (Supplementary Table 3). </w:t>
             </w:r>
           </w:p>
         </w:tc>
@@ -4326,18 +4620,7 @@
                 <w:szCs w:val="16"/>
                 <w14:ligatures w14:val="none"/>
               </w:rPr>
-              <w:t>examples</w:t>
-            </w:r>
-            <w:r>
-              <w:rPr>
-                <w:rFonts w:ascii="Arial" w:eastAsia="Times New Roman" w:hAnsi="Arial" w:cs="Arial"/>
-                <w:color w:val="000000"/>
-                <w:kern w:val="0"/>
-                <w:sz w:val="16"/>
-                <w:szCs w:val="16"/>
-                <w14:ligatures w14:val="none"/>
-              </w:rPr>
-              <w:t xml:space="preserve"> </w:t>
+              <w:t xml:space="preserve">examples </w:t>
             </w:r>
             <w:r>
               <w:rPr>
@@ -5209,8 +5492,51 @@
                 <w:szCs w:val="16"/>
                 <w14:ligatures w14:val="none"/>
               </w:rPr>
-              <w:t>Please note that data presentation has to be revised to comply with our policy in figure(s) 5b,d.</w:t>
-            </w:r>
+              <w:t xml:space="preserve">Please note that data presentation </w:t>
+            </w:r>
+            <w:proofErr w:type="gramStart"/>
+            <w:r>
+              <w:rPr>
+                <w:rFonts w:ascii="Arial" w:eastAsia="Times New Roman" w:hAnsi="Arial" w:cs="Arial"/>
+                <w:b/>
+                <w:bCs/>
+                <w:color w:val="000000"/>
+                <w:kern w:val="0"/>
+                <w:sz w:val="16"/>
+                <w:szCs w:val="16"/>
+                <w14:ligatures w14:val="none"/>
+              </w:rPr>
+              <w:t>has to</w:t>
+            </w:r>
+            <w:proofErr w:type="gramEnd"/>
+            <w:r>
+              <w:rPr>
+                <w:rFonts w:ascii="Arial" w:eastAsia="Times New Roman" w:hAnsi="Arial" w:cs="Arial"/>
+                <w:b/>
+                <w:bCs/>
+                <w:color w:val="000000"/>
+                <w:kern w:val="0"/>
+                <w:sz w:val="16"/>
+                <w:szCs w:val="16"/>
+                <w14:ligatures w14:val="none"/>
+              </w:rPr>
+              <w:t xml:space="preserve"> be revised to comply with our policy in figure(s) 5</w:t>
+            </w:r>
+            <w:proofErr w:type="gramStart"/>
+            <w:r>
+              <w:rPr>
+                <w:rFonts w:ascii="Arial" w:eastAsia="Times New Roman" w:hAnsi="Arial" w:cs="Arial"/>
+                <w:b/>
+                <w:bCs/>
+                <w:color w:val="000000"/>
+                <w:kern w:val="0"/>
+                <w:sz w:val="16"/>
+                <w:szCs w:val="16"/>
+                <w14:ligatures w14:val="none"/>
+              </w:rPr>
+              <w:t>b,d.</w:t>
+            </w:r>
+            <w:proofErr w:type="gramEnd"/>
           </w:p>
         </w:tc>
         <w:tc>
@@ -5437,8 +5763,23 @@
                 <w:szCs w:val="16"/>
                 <w14:ligatures w14:val="none"/>
               </w:rPr>
-              <w:t>Please note that this information is missing in the legend(s) of figure(s) 5b,d.</w:t>
-            </w:r>
+              <w:t>Please note that this information is missing in the legend(s) of figure(s) 5</w:t>
+            </w:r>
+            <w:proofErr w:type="gramStart"/>
+            <w:r>
+              <w:rPr>
+                <w:rFonts w:ascii="Arial" w:eastAsia="Times New Roman" w:hAnsi="Arial" w:cs="Arial"/>
+                <w:b/>
+                <w:bCs/>
+                <w:color w:val="000000"/>
+                <w:kern w:val="0"/>
+                <w:sz w:val="16"/>
+                <w:szCs w:val="16"/>
+                <w14:ligatures w14:val="none"/>
+              </w:rPr>
+              <w:t>b,d.</w:t>
+            </w:r>
+            <w:proofErr w:type="gramEnd"/>
             <w:r>
               <w:rPr>
                 <w:rFonts w:ascii="Arial" w:eastAsia="Times New Roman" w:hAnsi="Arial" w:cs="Arial"/>
@@ -5608,7 +5949,55 @@
                 <w:szCs w:val="16"/>
                 <w14:ligatures w14:val="none"/>
               </w:rPr>
-              <w:t>All error bars need to be defined in the legends (e.g. SD, SEM) together with a measure of centre (e.g. mean, median). For example, the legends should state something along the lines of “Data are presented as mean values +/- SEM” as appropriate. All box plots need to be defined in the legends in terms of minima, maxima, centre, bounds of box and whiskers and percentile.</w:t>
+              <w:t xml:space="preserve">All error bars need to be defined in the legends (e.g. SD, SEM) together with a measure of </w:t>
+            </w:r>
+            <w:proofErr w:type="spellStart"/>
+            <w:r>
+              <w:rPr>
+                <w:rFonts w:ascii="Arial" w:eastAsia="Times New Roman" w:hAnsi="Arial" w:cs="Arial"/>
+                <w:color w:val="000000"/>
+                <w:kern w:val="0"/>
+                <w:sz w:val="16"/>
+                <w:szCs w:val="16"/>
+                <w14:ligatures w14:val="none"/>
+              </w:rPr>
+              <w:t>centre</w:t>
+            </w:r>
+            <w:proofErr w:type="spellEnd"/>
+            <w:r>
+              <w:rPr>
+                <w:rFonts w:ascii="Arial" w:eastAsia="Times New Roman" w:hAnsi="Arial" w:cs="Arial"/>
+                <w:color w:val="000000"/>
+                <w:kern w:val="0"/>
+                <w:sz w:val="16"/>
+                <w:szCs w:val="16"/>
+                <w14:ligatures w14:val="none"/>
+              </w:rPr>
+              <w:t xml:space="preserve"> (e.g. mean, median). For example, the legends should state something along the lines of “Data are presented as mean values +/- SEM” as appropriate. All box plots need to be defined in the legends in terms of minima, maxima, </w:t>
+            </w:r>
+            <w:proofErr w:type="spellStart"/>
+            <w:r>
+              <w:rPr>
+                <w:rFonts w:ascii="Arial" w:eastAsia="Times New Roman" w:hAnsi="Arial" w:cs="Arial"/>
+                <w:color w:val="000000"/>
+                <w:kern w:val="0"/>
+                <w:sz w:val="16"/>
+                <w:szCs w:val="16"/>
+                <w14:ligatures w14:val="none"/>
+              </w:rPr>
+              <w:t>centre</w:t>
+            </w:r>
+            <w:proofErr w:type="spellEnd"/>
+            <w:r>
+              <w:rPr>
+                <w:rFonts w:ascii="Arial" w:eastAsia="Times New Roman" w:hAnsi="Arial" w:cs="Arial"/>
+                <w:color w:val="000000"/>
+                <w:kern w:val="0"/>
+                <w:sz w:val="16"/>
+                <w:szCs w:val="16"/>
+                <w14:ligatures w14:val="none"/>
+              </w:rPr>
+              <w:t>, bounds of box and whiskers and percentile.</w:t>
             </w:r>
           </w:p>
         </w:tc>
@@ -5680,8 +6069,51 @@
                 <w14:ligatures w14:val="none"/>
               </w:rPr>
               <w:br/>
-              <w:t>Please note that the measure of centre for the error bars/error bands needs to be defined in the legend(s) of figure(s) 5a-d; 6; 7a,b.</w:t>
-            </w:r>
+              <w:t xml:space="preserve">Please note that the measure of </w:t>
+            </w:r>
+            <w:proofErr w:type="spellStart"/>
+            <w:r>
+              <w:rPr>
+                <w:rFonts w:ascii="Arial" w:eastAsia="Times New Roman" w:hAnsi="Arial" w:cs="Arial"/>
+                <w:b/>
+                <w:bCs/>
+                <w:color w:val="000000"/>
+                <w:kern w:val="0"/>
+                <w:sz w:val="16"/>
+                <w:szCs w:val="16"/>
+                <w14:ligatures w14:val="none"/>
+              </w:rPr>
+              <w:t>centre</w:t>
+            </w:r>
+            <w:proofErr w:type="spellEnd"/>
+            <w:r>
+              <w:rPr>
+                <w:rFonts w:ascii="Arial" w:eastAsia="Times New Roman" w:hAnsi="Arial" w:cs="Arial"/>
+                <w:b/>
+                <w:bCs/>
+                <w:color w:val="000000"/>
+                <w:kern w:val="0"/>
+                <w:sz w:val="16"/>
+                <w:szCs w:val="16"/>
+                <w14:ligatures w14:val="none"/>
+              </w:rPr>
+              <w:t xml:space="preserve"> for the error bars/error bands needs to be defined in the legend(s) of figure(s) 5a-d; 6; 7</w:t>
+            </w:r>
+            <w:proofErr w:type="gramStart"/>
+            <w:r>
+              <w:rPr>
+                <w:rFonts w:ascii="Arial" w:eastAsia="Times New Roman" w:hAnsi="Arial" w:cs="Arial"/>
+                <w:b/>
+                <w:bCs/>
+                <w:color w:val="000000"/>
+                <w:kern w:val="0"/>
+                <w:sz w:val="16"/>
+                <w:szCs w:val="16"/>
+                <w14:ligatures w14:val="none"/>
+              </w:rPr>
+              <w:t>a,b.</w:t>
+            </w:r>
+            <w:proofErr w:type="gramEnd"/>
           </w:p>
         </w:tc>
         <w:tc>
@@ -6517,7 +6949,31 @@
                 <w:szCs w:val="16"/>
                 <w14:ligatures w14:val="none"/>
               </w:rPr>
-              <w:t xml:space="preserve">Nature journals strongly support public availability of data and code. Please deposit the data and code used in your paper into a public data repository, or alternatively, present the data as Supplementary Information. If data can only be shared on request, please explain why in your Data Availability Statement, and also in the correspondence with your editor. </w:t>
+              <w:t xml:space="preserve">Nature journals strongly support public availability of data and code. Please deposit the data and code used in your paper into a public data repository, or alternatively, present the data as Supplementary Information. If data can only be shared on request, please explain why in your Data Availability Statement, </w:t>
+            </w:r>
+            <w:proofErr w:type="gramStart"/>
+            <w:r>
+              <w:rPr>
+                <w:rFonts w:ascii="Arial" w:eastAsia="Times New Roman" w:hAnsi="Arial" w:cs="Arial"/>
+                <w:color w:val="000000"/>
+                <w:kern w:val="0"/>
+                <w:sz w:val="16"/>
+                <w:szCs w:val="16"/>
+                <w14:ligatures w14:val="none"/>
+              </w:rPr>
+              <w:t>and also</w:t>
+            </w:r>
+            <w:proofErr w:type="gramEnd"/>
+            <w:r>
+              <w:rPr>
+                <w:rFonts w:ascii="Arial" w:eastAsia="Times New Roman" w:hAnsi="Arial" w:cs="Arial"/>
+                <w:color w:val="000000"/>
+                <w:kern w:val="0"/>
+                <w:sz w:val="16"/>
+                <w:szCs w:val="16"/>
+                <w14:ligatures w14:val="none"/>
+              </w:rPr>
+              <w:t xml:space="preserve"> in the correspondence with your editor. </w:t>
             </w:r>
             <w:r>
               <w:rPr>
@@ -6725,7 +7181,55 @@
                 <w14:ligatures w14:val="none"/>
               </w:rPr>
               <w:br/>
-              <w:t xml:space="preserve">  This minimum dataset may be provided through deposition in public community/discipline-specific repositories, custom proprietary repositories or general repositories like Figshare, Zenodo and Dryad. Providing large datasets in supplementary information is strongly discouraged and the preferred approach is to make data available in repositories. Please see https://www.springernature.com/gp/authors/research-data-policy/recommended-repositories for a list of recommended repositories.</w:t>
+              <w:t xml:space="preserve">  This minimum dataset may be provided through deposition in public community/discipline-specific repositories, custom proprietary repositories or general repositories like </w:t>
+            </w:r>
+            <w:proofErr w:type="spellStart"/>
+            <w:r>
+              <w:rPr>
+                <w:rFonts w:ascii="Arial" w:eastAsia="Times New Roman" w:hAnsi="Arial" w:cs="Arial"/>
+                <w:color w:val="000000"/>
+                <w:kern w:val="0"/>
+                <w:sz w:val="16"/>
+                <w:szCs w:val="16"/>
+                <w14:ligatures w14:val="none"/>
+              </w:rPr>
+              <w:t>Figshare</w:t>
+            </w:r>
+            <w:proofErr w:type="spellEnd"/>
+            <w:r>
+              <w:rPr>
+                <w:rFonts w:ascii="Arial" w:eastAsia="Times New Roman" w:hAnsi="Arial" w:cs="Arial"/>
+                <w:color w:val="000000"/>
+                <w:kern w:val="0"/>
+                <w:sz w:val="16"/>
+                <w:szCs w:val="16"/>
+                <w14:ligatures w14:val="none"/>
+              </w:rPr>
+              <w:t xml:space="preserve">, </w:t>
+            </w:r>
+            <w:proofErr w:type="spellStart"/>
+            <w:r>
+              <w:rPr>
+                <w:rFonts w:ascii="Arial" w:eastAsia="Times New Roman" w:hAnsi="Arial" w:cs="Arial"/>
+                <w:color w:val="000000"/>
+                <w:kern w:val="0"/>
+                <w:sz w:val="16"/>
+                <w:szCs w:val="16"/>
+                <w14:ligatures w14:val="none"/>
+              </w:rPr>
+              <w:t>Zenodo</w:t>
+            </w:r>
+            <w:proofErr w:type="spellEnd"/>
+            <w:r>
+              <w:rPr>
+                <w:rFonts w:ascii="Arial" w:eastAsia="Times New Roman" w:hAnsi="Arial" w:cs="Arial"/>
+                <w:color w:val="000000"/>
+                <w:kern w:val="0"/>
+                <w:sz w:val="16"/>
+                <w:szCs w:val="16"/>
+                <w14:ligatures w14:val="none"/>
+              </w:rPr>
+              <w:t xml:space="preserve"> and Dryad. Providing large datasets in supplementary information is strongly discouraged and the preferred approach is to make data available in repositories. Please see https://www.springernature.com/gp/authors/research-data-policy/recommended-repositories for a list of recommended repositories.</w:t>
             </w:r>
             <w:r>
               <w:rPr>
@@ -7165,21 +7669,163 @@
                 <w:kern w:val="0"/>
                 <w:sz w:val="16"/>
                 <w:szCs w:val="16"/>
-                <w:highlight w:val="yellow"/>
-                <w14:ligatures w14:val="none"/>
-              </w:rPr>
-            </w:pPr>
-            <w:r>
-              <w:rPr>
-                <w:rFonts w:ascii="Arial" w:eastAsia="Times New Roman" w:hAnsi="Arial" w:cs="Arial"/>
-                <w:color w:val="000000"/>
-                <w:kern w:val="0"/>
-                <w:sz w:val="16"/>
-                <w:szCs w:val="16"/>
-                <w:highlight w:val="yellow"/>
-                <w14:ligatures w14:val="none"/>
-              </w:rPr>
-              <w:t>We notice that you have deposited your code in a Github repository, which we fully support. We strongly encourage you in addition to make your code citable by obtaining a DOI for the Github repository in order to provide a permanent reference to the version of the code used in this study and improve reproducibility. This can be done by linking the repository to Zenodo, following the instructions here: https://guides.github.com/activities/citable-code/ Please cite the Github repository in your manuscript text or Code Availability statement and in your reference list: authors, title (this paper), repository name, DOI identifier, year. Alternatively, you can deposit the code in Gigantum or Code Ocean for the same purpose.</w:t>
+                <w14:ligatures w14:val="none"/>
+              </w:rPr>
+            </w:pPr>
+            <w:r>
+              <w:rPr>
+                <w:rFonts w:ascii="Arial" w:eastAsia="Times New Roman" w:hAnsi="Arial" w:cs="Arial"/>
+                <w:color w:val="000000"/>
+                <w:kern w:val="0"/>
+                <w:sz w:val="16"/>
+                <w:szCs w:val="16"/>
+                <w14:ligatures w14:val="none"/>
+              </w:rPr>
+              <w:t xml:space="preserve">We notice that you have deposited your code in a </w:t>
+            </w:r>
+            <w:proofErr w:type="spellStart"/>
+            <w:r>
+              <w:rPr>
+                <w:rFonts w:ascii="Arial" w:eastAsia="Times New Roman" w:hAnsi="Arial" w:cs="Arial"/>
+                <w:color w:val="000000"/>
+                <w:kern w:val="0"/>
+                <w:sz w:val="16"/>
+                <w:szCs w:val="16"/>
+                <w14:ligatures w14:val="none"/>
+              </w:rPr>
+              <w:t>Github</w:t>
+            </w:r>
+            <w:proofErr w:type="spellEnd"/>
+            <w:r>
+              <w:rPr>
+                <w:rFonts w:ascii="Arial" w:eastAsia="Times New Roman" w:hAnsi="Arial" w:cs="Arial"/>
+                <w:color w:val="000000"/>
+                <w:kern w:val="0"/>
+                <w:sz w:val="16"/>
+                <w:szCs w:val="16"/>
+                <w14:ligatures w14:val="none"/>
+              </w:rPr>
+              <w:t xml:space="preserve"> repository, which we fully support. We strongly encourage you in addition to make your code citable by obtaining a DOI for the </w:t>
+            </w:r>
+            <w:proofErr w:type="spellStart"/>
+            <w:r>
+              <w:rPr>
+                <w:rFonts w:ascii="Arial" w:eastAsia="Times New Roman" w:hAnsi="Arial" w:cs="Arial"/>
+                <w:color w:val="000000"/>
+                <w:kern w:val="0"/>
+                <w:sz w:val="16"/>
+                <w:szCs w:val="16"/>
+                <w14:ligatures w14:val="none"/>
+              </w:rPr>
+              <w:t>Github</w:t>
+            </w:r>
+            <w:proofErr w:type="spellEnd"/>
+            <w:r>
+              <w:rPr>
+                <w:rFonts w:ascii="Arial" w:eastAsia="Times New Roman" w:hAnsi="Arial" w:cs="Arial"/>
+                <w:color w:val="000000"/>
+                <w:kern w:val="0"/>
+                <w:sz w:val="16"/>
+                <w:szCs w:val="16"/>
+                <w14:ligatures w14:val="none"/>
+              </w:rPr>
+              <w:t xml:space="preserve"> repository </w:t>
+            </w:r>
+            <w:proofErr w:type="gramStart"/>
+            <w:r>
+              <w:rPr>
+                <w:rFonts w:ascii="Arial" w:eastAsia="Times New Roman" w:hAnsi="Arial" w:cs="Arial"/>
+                <w:color w:val="000000"/>
+                <w:kern w:val="0"/>
+                <w:sz w:val="16"/>
+                <w:szCs w:val="16"/>
+                <w14:ligatures w14:val="none"/>
+              </w:rPr>
+              <w:t>in order to</w:t>
+            </w:r>
+            <w:proofErr w:type="gramEnd"/>
+            <w:r>
+              <w:rPr>
+                <w:rFonts w:ascii="Arial" w:eastAsia="Times New Roman" w:hAnsi="Arial" w:cs="Arial"/>
+                <w:color w:val="000000"/>
+                <w:kern w:val="0"/>
+                <w:sz w:val="16"/>
+                <w:szCs w:val="16"/>
+                <w14:ligatures w14:val="none"/>
+              </w:rPr>
+              <w:t xml:space="preserve"> provide a permanent reference to the version of the code used in this study and improve reproducibility. This can be done by linking the repository to </w:t>
+            </w:r>
+            <w:proofErr w:type="spellStart"/>
+            <w:r>
+              <w:rPr>
+                <w:rFonts w:ascii="Arial" w:eastAsia="Times New Roman" w:hAnsi="Arial" w:cs="Arial"/>
+                <w:color w:val="000000"/>
+                <w:kern w:val="0"/>
+                <w:sz w:val="16"/>
+                <w:szCs w:val="16"/>
+                <w14:ligatures w14:val="none"/>
+              </w:rPr>
+              <w:t>Zenodo</w:t>
+            </w:r>
+            <w:proofErr w:type="spellEnd"/>
+            <w:r>
+              <w:rPr>
+                <w:rFonts w:ascii="Arial" w:eastAsia="Times New Roman" w:hAnsi="Arial" w:cs="Arial"/>
+                <w:color w:val="000000"/>
+                <w:kern w:val="0"/>
+                <w:sz w:val="16"/>
+                <w:szCs w:val="16"/>
+                <w14:ligatures w14:val="none"/>
+              </w:rPr>
+              <w:t xml:space="preserve">, following the instructions here: https://guides.github.com/activities/citable-code/ Please cite the </w:t>
+            </w:r>
+            <w:proofErr w:type="spellStart"/>
+            <w:r>
+              <w:rPr>
+                <w:rFonts w:ascii="Arial" w:eastAsia="Times New Roman" w:hAnsi="Arial" w:cs="Arial"/>
+                <w:color w:val="000000"/>
+                <w:kern w:val="0"/>
+                <w:sz w:val="16"/>
+                <w:szCs w:val="16"/>
+                <w14:ligatures w14:val="none"/>
+              </w:rPr>
+              <w:t>Github</w:t>
+            </w:r>
+            <w:proofErr w:type="spellEnd"/>
+            <w:r>
+              <w:rPr>
+                <w:rFonts w:ascii="Arial" w:eastAsia="Times New Roman" w:hAnsi="Arial" w:cs="Arial"/>
+                <w:color w:val="000000"/>
+                <w:kern w:val="0"/>
+                <w:sz w:val="16"/>
+                <w:szCs w:val="16"/>
+                <w14:ligatures w14:val="none"/>
+              </w:rPr>
+              <w:t xml:space="preserve"> repository in your manuscript text or Code Availability statement and in your reference list: authors, title (this paper), repository name, DOI identifier, year. Alternatively, you can deposit the code in </w:t>
+            </w:r>
+            <w:proofErr w:type="spellStart"/>
+            <w:r>
+              <w:rPr>
+                <w:rFonts w:ascii="Arial" w:eastAsia="Times New Roman" w:hAnsi="Arial" w:cs="Arial"/>
+                <w:color w:val="000000"/>
+                <w:kern w:val="0"/>
+                <w:sz w:val="16"/>
+                <w:szCs w:val="16"/>
+                <w14:ligatures w14:val="none"/>
+              </w:rPr>
+              <w:t>Gigantum</w:t>
+            </w:r>
+            <w:proofErr w:type="spellEnd"/>
+            <w:r>
+              <w:rPr>
+                <w:rFonts w:ascii="Arial" w:eastAsia="Times New Roman" w:hAnsi="Arial" w:cs="Arial"/>
+                <w:color w:val="000000"/>
+                <w:kern w:val="0"/>
+                <w:sz w:val="16"/>
+                <w:szCs w:val="16"/>
+                <w14:ligatures w14:val="none"/>
+              </w:rPr>
+              <w:t xml:space="preserve"> or Code Ocean for the same purpose.</w:t>
             </w:r>
           </w:p>
         </w:tc>
@@ -7234,21 +7880,91 @@
                 <w:kern w:val="0"/>
                 <w:sz w:val="16"/>
                 <w:szCs w:val="16"/>
-                <w:highlight w:val="yellow"/>
-                <w14:ligatures w14:val="none"/>
-              </w:rPr>
-            </w:pPr>
-            <w:r>
-              <w:rPr>
-                <w:rFonts w:ascii="Arial" w:eastAsia="Times New Roman" w:hAnsi="Arial" w:cs="Arial"/>
-                <w:color w:val="000000"/>
-                <w:kern w:val="0"/>
-                <w:sz w:val="16"/>
-                <w:szCs w:val="16"/>
-                <w:highlight w:val="yellow"/>
-                <w14:ligatures w14:val="none"/>
-              </w:rPr>
-              <w:t>Please provide a DOI URL to the Github repository in both the Data Availability and Code Availability Statement. You can obtain the DOI URL by linking the github page to Zenodo.</w:t>
+                <w14:ligatures w14:val="none"/>
+              </w:rPr>
+            </w:pPr>
+            <w:r>
+              <w:rPr>
+                <w:rFonts w:ascii="Arial" w:eastAsia="Times New Roman" w:hAnsi="Arial" w:cs="Arial"/>
+                <w:color w:val="000000"/>
+                <w:kern w:val="0"/>
+                <w:sz w:val="16"/>
+                <w:szCs w:val="16"/>
+                <w14:ligatures w14:val="none"/>
+              </w:rPr>
+              <w:t xml:space="preserve">Please provide a DOI URL to the </w:t>
+            </w:r>
+            <w:proofErr w:type="spellStart"/>
+            <w:r>
+              <w:rPr>
+                <w:rFonts w:ascii="Arial" w:eastAsia="Times New Roman" w:hAnsi="Arial" w:cs="Arial"/>
+                <w:color w:val="000000"/>
+                <w:kern w:val="0"/>
+                <w:sz w:val="16"/>
+                <w:szCs w:val="16"/>
+                <w14:ligatures w14:val="none"/>
+              </w:rPr>
+              <w:t>Github</w:t>
+            </w:r>
+            <w:proofErr w:type="spellEnd"/>
+            <w:r>
+              <w:rPr>
+                <w:rFonts w:ascii="Arial" w:eastAsia="Times New Roman" w:hAnsi="Arial" w:cs="Arial"/>
+                <w:color w:val="000000"/>
+                <w:kern w:val="0"/>
+                <w:sz w:val="16"/>
+                <w:szCs w:val="16"/>
+                <w14:ligatures w14:val="none"/>
+              </w:rPr>
+              <w:t xml:space="preserve"> repository in both the Data Availability and Code Availability Statement. You can obtain the DOI URL by linking the </w:t>
+            </w:r>
+            <w:proofErr w:type="spellStart"/>
+            <w:r>
+              <w:rPr>
+                <w:rFonts w:ascii="Arial" w:eastAsia="Times New Roman" w:hAnsi="Arial" w:cs="Arial"/>
+                <w:color w:val="000000"/>
+                <w:kern w:val="0"/>
+                <w:sz w:val="16"/>
+                <w:szCs w:val="16"/>
+                <w14:ligatures w14:val="none"/>
+              </w:rPr>
+              <w:t>github</w:t>
+            </w:r>
+            <w:proofErr w:type="spellEnd"/>
+            <w:r>
+              <w:rPr>
+                <w:rFonts w:ascii="Arial" w:eastAsia="Times New Roman" w:hAnsi="Arial" w:cs="Arial"/>
+                <w:color w:val="000000"/>
+                <w:kern w:val="0"/>
+                <w:sz w:val="16"/>
+                <w:szCs w:val="16"/>
+                <w14:ligatures w14:val="none"/>
+              </w:rPr>
+              <w:t xml:space="preserve"> page to </w:t>
+            </w:r>
+            <w:proofErr w:type="spellStart"/>
+            <w:r>
+              <w:rPr>
+                <w:rFonts w:ascii="Arial" w:eastAsia="Times New Roman" w:hAnsi="Arial" w:cs="Arial"/>
+                <w:color w:val="000000"/>
+                <w:kern w:val="0"/>
+                <w:sz w:val="16"/>
+                <w:szCs w:val="16"/>
+                <w14:ligatures w14:val="none"/>
+              </w:rPr>
+              <w:t>Zenodo</w:t>
+            </w:r>
+            <w:proofErr w:type="spellEnd"/>
+            <w:r>
+              <w:rPr>
+                <w:rFonts w:ascii="Arial" w:eastAsia="Times New Roman" w:hAnsi="Arial" w:cs="Arial"/>
+                <w:color w:val="000000"/>
+                <w:kern w:val="0"/>
+                <w:sz w:val="16"/>
+                <w:szCs w:val="16"/>
+                <w14:ligatures w14:val="none"/>
+              </w:rPr>
+              <w:t>.</w:t>
             </w:r>
           </w:p>
         </w:tc>
@@ -7276,6 +7992,96 @@
                 <w14:ligatures w14:val="none"/>
               </w:rPr>
             </w:pPr>
+            <w:r>
+              <w:rPr>
+                <w:rFonts w:ascii="Arial" w:eastAsia="Times New Roman" w:hAnsi="Arial" w:cs="Arial"/>
+                <w:color w:val="000000"/>
+                <w:kern w:val="0"/>
+                <w:sz w:val="16"/>
+                <w:szCs w:val="16"/>
+                <w14:ligatures w14:val="none"/>
+              </w:rPr>
+              <w:t xml:space="preserve">We have replaced the GitHub URL in our Data availability </w:t>
+            </w:r>
+            <w:r>
+              <w:rPr>
+                <w:rFonts w:ascii="Arial" w:eastAsia="Times New Roman" w:hAnsi="Arial" w:cs="Arial"/>
+                <w:color w:val="000000"/>
+                <w:kern w:val="0"/>
+                <w:sz w:val="16"/>
+                <w:szCs w:val="16"/>
+                <w14:ligatures w14:val="none"/>
+              </w:rPr>
+              <w:t xml:space="preserve">section, </w:t>
+            </w:r>
+            <w:r>
+              <w:rPr>
+                <w:rFonts w:ascii="Arial" w:eastAsia="Times New Roman" w:hAnsi="Arial" w:cs="Arial"/>
+                <w:color w:val="000000"/>
+                <w:kern w:val="0"/>
+                <w:sz w:val="16"/>
+                <w:szCs w:val="16"/>
+                <w14:ligatures w14:val="none"/>
+              </w:rPr>
+              <w:t xml:space="preserve">Code availability </w:t>
+            </w:r>
+            <w:r>
+              <w:rPr>
+                <w:rFonts w:ascii="Arial" w:eastAsia="Times New Roman" w:hAnsi="Arial" w:cs="Arial"/>
+                <w:color w:val="000000"/>
+                <w:kern w:val="0"/>
+                <w:sz w:val="16"/>
+                <w:szCs w:val="16"/>
+                <w14:ligatures w14:val="none"/>
+              </w:rPr>
+              <w:t>section</w:t>
+            </w:r>
+            <w:r>
+              <w:rPr>
+                <w:rFonts w:ascii="Arial" w:eastAsia="Times New Roman" w:hAnsi="Arial" w:cs="Arial"/>
+                <w:color w:val="000000"/>
+                <w:kern w:val="0"/>
+                <w:sz w:val="16"/>
+                <w:szCs w:val="16"/>
+                <w14:ligatures w14:val="none"/>
+              </w:rPr>
+              <w:t xml:space="preserve">, and </w:t>
+            </w:r>
+            <w:r>
+              <w:rPr>
+                <w:rFonts w:ascii="Arial" w:eastAsia="Times New Roman" w:hAnsi="Arial" w:cs="Arial"/>
+                <w:color w:val="000000"/>
+                <w:kern w:val="0"/>
+                <w:sz w:val="16"/>
+                <w:szCs w:val="16"/>
+                <w14:ligatures w14:val="none"/>
+              </w:rPr>
+              <w:t xml:space="preserve">Reporting Summary with a </w:t>
+            </w:r>
+            <w:proofErr w:type="spellStart"/>
+            <w:r>
+              <w:rPr>
+                <w:rFonts w:ascii="Arial" w:eastAsia="Times New Roman" w:hAnsi="Arial" w:cs="Arial"/>
+                <w:color w:val="000000"/>
+                <w:kern w:val="0"/>
+                <w:sz w:val="16"/>
+                <w:szCs w:val="16"/>
+                <w14:ligatures w14:val="none"/>
+              </w:rPr>
+              <w:t>Zenodo</w:t>
+            </w:r>
+            <w:proofErr w:type="spellEnd"/>
+            <w:r>
+              <w:rPr>
+                <w:rFonts w:ascii="Arial" w:eastAsia="Times New Roman" w:hAnsi="Arial" w:cs="Arial"/>
+                <w:color w:val="000000"/>
+                <w:kern w:val="0"/>
+                <w:sz w:val="16"/>
+                <w:szCs w:val="16"/>
+                <w14:ligatures w14:val="none"/>
+              </w:rPr>
+              <w:t xml:space="preserve"> URL.</w:t>
+            </w:r>
           </w:p>
         </w:tc>
       </w:tr>
@@ -7599,7 +8405,31 @@
                 <w14:ligatures w14:val="none"/>
               </w:rPr>
               <w:br/>
-              <w:t>Data should be reported disaggregated for sex and gender where this information has been collected and consent has been obtained for reporting and sharing individual-level data; disaggregated numbers for individual experiments must be provided in the source data files whereas overall numbers may be provided in the methods section and Nature Portfolio Reporting Summary.</w:t>
+              <w:t xml:space="preserve">Data should be reported disaggregated for sex and gender where this information has been </w:t>
+            </w:r>
+            <w:proofErr w:type="gramStart"/>
+            <w:r>
+              <w:rPr>
+                <w:rFonts w:ascii="Arial" w:eastAsia="Times New Roman" w:hAnsi="Arial" w:cs="Arial"/>
+                <w:color w:val="000000"/>
+                <w:kern w:val="0"/>
+                <w:sz w:val="16"/>
+                <w:szCs w:val="16"/>
+                <w14:ligatures w14:val="none"/>
+              </w:rPr>
+              <w:t>collected</w:t>
+            </w:r>
+            <w:proofErr w:type="gramEnd"/>
+            <w:r>
+              <w:rPr>
+                <w:rFonts w:ascii="Arial" w:eastAsia="Times New Roman" w:hAnsi="Arial" w:cs="Arial"/>
+                <w:color w:val="000000"/>
+                <w:kern w:val="0"/>
+                <w:sz w:val="16"/>
+                <w:szCs w:val="16"/>
+                <w14:ligatures w14:val="none"/>
+              </w:rPr>
+              <w:t xml:space="preserve"> and consent has been obtained for reporting and sharing individual-level data; disaggregated numbers for individual experiments must be provided in the source data files whereas overall numbers may be provided in the methods section and Nature Portfolio Reporting Summary.</w:t>
             </w:r>
             <w:r>
               <w:rPr>
@@ -8012,7 +8842,31 @@
                 <w14:ligatures w14:val="none"/>
               </w:rPr>
               <w:lastRenderedPageBreak/>
-              <w:t xml:space="preserve">Please confirm that the following information has been provided in the manuscript if appropriate: how sample sizes were chosen, whether any data were excluded (including why) and whether randomization and blinding was used. If statements regarding these issues are negative, please include the following statements if appropriate: “No statistical method was used to predetermine sample size. “No data were excluded from the analyses”; "The experiments were not randomized"; "The Investigators were not blinded to allocation during experiments and outcome assessment”. </w:t>
+              <w:t xml:space="preserve">Please confirm that the following information has been provided in the manuscript if appropriate: how sample sizes were </w:t>
+            </w:r>
+            <w:proofErr w:type="gramStart"/>
+            <w:r>
+              <w:rPr>
+                <w:rFonts w:ascii="Arial" w:eastAsia="Times New Roman" w:hAnsi="Arial" w:cs="Arial"/>
+                <w:color w:val="000000"/>
+                <w:kern w:val="0"/>
+                <w:sz w:val="16"/>
+                <w:szCs w:val="16"/>
+                <w14:ligatures w14:val="none"/>
+              </w:rPr>
+              <w:t>chosen,</w:t>
+            </w:r>
+            <w:proofErr w:type="gramEnd"/>
+            <w:r>
+              <w:rPr>
+                <w:rFonts w:ascii="Arial" w:eastAsia="Times New Roman" w:hAnsi="Arial" w:cs="Arial"/>
+                <w:color w:val="000000"/>
+                <w:kern w:val="0"/>
+                <w:sz w:val="16"/>
+                <w:szCs w:val="16"/>
+                <w14:ligatures w14:val="none"/>
+              </w:rPr>
+              <w:t xml:space="preserve"> whether any data were excluded (including why) and whether randomization and blinding was used. If statements regarding these issues are negative, please include the following statements if appropriate: “No statistical method was used to predetermine sample size. “No data were excluded from the analyses”; "The experiments were not randomized"; "The Investigators were not blinded to allocation during experiments and outcome assessment”. </w:t>
             </w:r>
           </w:p>
         </w:tc>
@@ -8049,29 +8903,7 @@
                 <w:szCs w:val="16"/>
                 <w14:ligatures w14:val="none"/>
               </w:rPr>
-              <w:t>U</w:t>
-            </w:r>
-            <w:r>
-              <w:rPr>
-                <w:rFonts w:ascii="Arial" w:eastAsia="Times New Roman" w:hAnsi="Arial" w:cs="Arial"/>
-                <w:color w:val="000000"/>
-                <w:kern w:val="0"/>
-                <w:sz w:val="16"/>
-                <w:szCs w:val="16"/>
-                <w14:ligatures w14:val="none"/>
-              </w:rPr>
-              <w:t>nder the “Participants” subheading of our Methods sectio</w:t>
-            </w:r>
-            <w:r>
-              <w:rPr>
-                <w:rFonts w:ascii="Arial" w:eastAsia="Times New Roman" w:hAnsi="Arial" w:cs="Arial"/>
-                <w:color w:val="000000"/>
-                <w:kern w:val="0"/>
-                <w:sz w:val="16"/>
-                <w:szCs w:val="16"/>
-                <w14:ligatures w14:val="none"/>
-              </w:rPr>
-              <w:t>n, w</w:t>
+              <w:t>Under the “Participants” subheading of our Methods section, w</w:t>
             </w:r>
             <w:r>
               <w:rPr>
@@ -8159,40 +8991,7 @@
                 <w:szCs w:val="16"/>
                 <w14:ligatures w14:val="none"/>
               </w:rPr>
-              <w:t xml:space="preserve"> </w:t>
-            </w:r>
-            <w:r>
-              <w:rPr>
-                <w:rFonts w:ascii="Arial" w:eastAsia="Times New Roman" w:hAnsi="Arial" w:cs="Arial"/>
-                <w:color w:val="000000"/>
-                <w:kern w:val="0"/>
-                <w:sz w:val="16"/>
-                <w:szCs w:val="16"/>
-                <w14:ligatures w14:val="none"/>
-              </w:rPr>
-              <w:t>Under the “</w:t>
-            </w:r>
-            <w:r>
-              <w:rPr>
-                <w:rFonts w:ascii="Arial" w:eastAsia="Times New Roman" w:hAnsi="Arial" w:cs="Arial"/>
-                <w:color w:val="000000"/>
-                <w:kern w:val="0"/>
-                <w:sz w:val="16"/>
-                <w:szCs w:val="16"/>
-                <w14:ligatures w14:val="none"/>
-              </w:rPr>
-              <w:t>Experiment</w:t>
-            </w:r>
-            <w:r>
-              <w:rPr>
-                <w:rFonts w:ascii="Arial" w:eastAsia="Times New Roman" w:hAnsi="Arial" w:cs="Arial"/>
-                <w:color w:val="000000"/>
-                <w:kern w:val="0"/>
-                <w:sz w:val="16"/>
-                <w:szCs w:val="16"/>
-                <w14:ligatures w14:val="none"/>
-              </w:rPr>
-              <w:t>” subheading of our Methods section,</w:t>
+              <w:t xml:space="preserve"> Under the “Experiment” subheading of our Methods section,</w:t>
             </w:r>
             <w:r>
               <w:rPr>
@@ -8512,7 +9311,79 @@
                 <w:szCs w:val="16"/>
                 <w14:ligatures w14:val="none"/>
               </w:rPr>
-              <w:t>All references must be cited in numerical order. The reference list will be formatted according to the Nature style by our journal production team, however please ensure that references contain all of the information required, eg:</w:t>
+              <w:t xml:space="preserve">All references must be cited in numerical order. The reference list will be formatted according to the Nature style by our journal production team, </w:t>
+            </w:r>
+            <w:proofErr w:type="gramStart"/>
+            <w:r>
+              <w:rPr>
+                <w:rFonts w:ascii="Arial" w:eastAsia="Times New Roman" w:hAnsi="Arial" w:cs="Arial"/>
+                <w:color w:val="000000"/>
+                <w:kern w:val="0"/>
+                <w:sz w:val="16"/>
+                <w:szCs w:val="16"/>
+                <w14:ligatures w14:val="none"/>
+              </w:rPr>
+              <w:t>however</w:t>
+            </w:r>
+            <w:proofErr w:type="gramEnd"/>
+            <w:r>
+              <w:rPr>
+                <w:rFonts w:ascii="Arial" w:eastAsia="Times New Roman" w:hAnsi="Arial" w:cs="Arial"/>
+                <w:color w:val="000000"/>
+                <w:kern w:val="0"/>
+                <w:sz w:val="16"/>
+                <w:szCs w:val="16"/>
+                <w14:ligatures w14:val="none"/>
+              </w:rPr>
+              <w:t xml:space="preserve"> please ensure that references contain </w:t>
+            </w:r>
+            <w:proofErr w:type="gramStart"/>
+            <w:r>
+              <w:rPr>
+                <w:rFonts w:ascii="Arial" w:eastAsia="Times New Roman" w:hAnsi="Arial" w:cs="Arial"/>
+                <w:color w:val="000000"/>
+                <w:kern w:val="0"/>
+                <w:sz w:val="16"/>
+                <w:szCs w:val="16"/>
+                <w14:ligatures w14:val="none"/>
+              </w:rPr>
+              <w:t>all of</w:t>
+            </w:r>
+            <w:proofErr w:type="gramEnd"/>
+            <w:r>
+              <w:rPr>
+                <w:rFonts w:ascii="Arial" w:eastAsia="Times New Roman" w:hAnsi="Arial" w:cs="Arial"/>
+                <w:color w:val="000000"/>
+                <w:kern w:val="0"/>
+                <w:sz w:val="16"/>
+                <w:szCs w:val="16"/>
+                <w14:ligatures w14:val="none"/>
+              </w:rPr>
+              <w:t xml:space="preserve"> the information required, </w:t>
+            </w:r>
+            <w:proofErr w:type="spellStart"/>
+            <w:r>
+              <w:rPr>
+                <w:rFonts w:ascii="Arial" w:eastAsia="Times New Roman" w:hAnsi="Arial" w:cs="Arial"/>
+                <w:color w:val="000000"/>
+                <w:kern w:val="0"/>
+                <w:sz w:val="16"/>
+                <w:szCs w:val="16"/>
+                <w14:ligatures w14:val="none"/>
+              </w:rPr>
+              <w:t>eg</w:t>
+            </w:r>
+            <w:proofErr w:type="spellEnd"/>
+            <w:r>
+              <w:rPr>
+                <w:rFonts w:ascii="Arial" w:eastAsia="Times New Roman" w:hAnsi="Arial" w:cs="Arial"/>
+                <w:color w:val="000000"/>
+                <w:kern w:val="0"/>
+                <w:sz w:val="16"/>
+                <w:szCs w:val="16"/>
+                <w14:ligatures w14:val="none"/>
+              </w:rPr>
+              <w:t>:</w:t>
             </w:r>
             <w:r>
               <w:rPr>
@@ -8535,7 +9406,102 @@
                 <w14:ligatures w14:val="none"/>
               </w:rPr>
               <w:br/>
-              <w:t>Kurumada, S., Takamori, S. &amp; Yamashita, M. An alkyl-substituted aluminium anion with strong basicity and nucleophilicity. &lt;i&gt;Nat. Chem.&lt;/i&gt; &lt;b&gt;12&lt;/b&gt;, 36–39 (2020).</w:t>
+            </w:r>
+            <w:proofErr w:type="spellStart"/>
+            <w:r>
+              <w:rPr>
+                <w:rFonts w:ascii="Arial" w:eastAsia="Times New Roman" w:hAnsi="Arial" w:cs="Arial"/>
+                <w:color w:val="000000"/>
+                <w:kern w:val="0"/>
+                <w:sz w:val="16"/>
+                <w:szCs w:val="16"/>
+                <w14:ligatures w14:val="none"/>
+              </w:rPr>
+              <w:t>Kurumada</w:t>
+            </w:r>
+            <w:proofErr w:type="spellEnd"/>
+            <w:r>
+              <w:rPr>
+                <w:rFonts w:ascii="Arial" w:eastAsia="Times New Roman" w:hAnsi="Arial" w:cs="Arial"/>
+                <w:color w:val="000000"/>
+                <w:kern w:val="0"/>
+                <w:sz w:val="16"/>
+                <w:szCs w:val="16"/>
+                <w14:ligatures w14:val="none"/>
+              </w:rPr>
+              <w:t xml:space="preserve">, S., Takamori, S. &amp; Yamashita, M. An alkyl-substituted </w:t>
+            </w:r>
+            <w:proofErr w:type="spellStart"/>
+            <w:r>
+              <w:rPr>
+                <w:rFonts w:ascii="Arial" w:eastAsia="Times New Roman" w:hAnsi="Arial" w:cs="Arial"/>
+                <w:color w:val="000000"/>
+                <w:kern w:val="0"/>
+                <w:sz w:val="16"/>
+                <w:szCs w:val="16"/>
+                <w14:ligatures w14:val="none"/>
+              </w:rPr>
+              <w:t>aluminium</w:t>
+            </w:r>
+            <w:proofErr w:type="spellEnd"/>
+            <w:r>
+              <w:rPr>
+                <w:rFonts w:ascii="Arial" w:eastAsia="Times New Roman" w:hAnsi="Arial" w:cs="Arial"/>
+                <w:color w:val="000000"/>
+                <w:kern w:val="0"/>
+                <w:sz w:val="16"/>
+                <w:szCs w:val="16"/>
+                <w14:ligatures w14:val="none"/>
+              </w:rPr>
+              <w:t xml:space="preserve"> anion with strong basicity and nucleophilicity. &lt;</w:t>
+            </w:r>
+            <w:proofErr w:type="spellStart"/>
+            <w:r>
+              <w:rPr>
+                <w:rFonts w:ascii="Arial" w:eastAsia="Times New Roman" w:hAnsi="Arial" w:cs="Arial"/>
+                <w:color w:val="000000"/>
+                <w:kern w:val="0"/>
+                <w:sz w:val="16"/>
+                <w:szCs w:val="16"/>
+                <w14:ligatures w14:val="none"/>
+              </w:rPr>
+              <w:t>i</w:t>
+            </w:r>
+            <w:proofErr w:type="spellEnd"/>
+            <w:r>
+              <w:rPr>
+                <w:rFonts w:ascii="Arial" w:eastAsia="Times New Roman" w:hAnsi="Arial" w:cs="Arial"/>
+                <w:color w:val="000000"/>
+                <w:kern w:val="0"/>
+                <w:sz w:val="16"/>
+                <w:szCs w:val="16"/>
+                <w14:ligatures w14:val="none"/>
+              </w:rPr>
+              <w:t>&gt;Nat. Chem.&lt;/</w:t>
+            </w:r>
+            <w:proofErr w:type="spellStart"/>
+            <w:r>
+              <w:rPr>
+                <w:rFonts w:ascii="Arial" w:eastAsia="Times New Roman" w:hAnsi="Arial" w:cs="Arial"/>
+                <w:color w:val="000000"/>
+                <w:kern w:val="0"/>
+                <w:sz w:val="16"/>
+                <w:szCs w:val="16"/>
+                <w14:ligatures w14:val="none"/>
+              </w:rPr>
+              <w:t>i</w:t>
+            </w:r>
+            <w:proofErr w:type="spellEnd"/>
+            <w:r>
+              <w:rPr>
+                <w:rFonts w:ascii="Arial" w:eastAsia="Times New Roman" w:hAnsi="Arial" w:cs="Arial"/>
+                <w:color w:val="000000"/>
+                <w:kern w:val="0"/>
+                <w:sz w:val="16"/>
+                <w:szCs w:val="16"/>
+                <w14:ligatures w14:val="none"/>
+              </w:rPr>
+              <w:t>&gt; &lt;b&gt;12&lt;/b&gt;, 36–39 (2020).</w:t>
             </w:r>
           </w:p>
         </w:tc>
@@ -8624,7 +9590,31 @@
                 <w:szCs w:val="16"/>
                 <w14:ligatures w14:val="none"/>
               </w:rPr>
-              <w:t>Supplementary References should appear at the end of the Supplementary Information file, and must be self-contained and numbered from 1. References mentioned in both the main text and the Supplementary Information should be part of both reference lists so that the Supplementary Information does not refer to the reference list in the main paper and vice versa.</w:t>
+              <w:t xml:space="preserve">Supplementary References should appear at the end of the Supplementary Information </w:t>
+            </w:r>
+            <w:proofErr w:type="gramStart"/>
+            <w:r>
+              <w:rPr>
+                <w:rFonts w:ascii="Arial" w:eastAsia="Times New Roman" w:hAnsi="Arial" w:cs="Arial"/>
+                <w:color w:val="000000"/>
+                <w:kern w:val="0"/>
+                <w:sz w:val="16"/>
+                <w:szCs w:val="16"/>
+                <w14:ligatures w14:val="none"/>
+              </w:rPr>
+              <w:t>file, and</w:t>
+            </w:r>
+            <w:proofErr w:type="gramEnd"/>
+            <w:r>
+              <w:rPr>
+                <w:rFonts w:ascii="Arial" w:eastAsia="Times New Roman" w:hAnsi="Arial" w:cs="Arial"/>
+                <w:color w:val="000000"/>
+                <w:kern w:val="0"/>
+                <w:sz w:val="16"/>
+                <w:szCs w:val="16"/>
+                <w14:ligatures w14:val="none"/>
+              </w:rPr>
+              <w:t xml:space="preserve"> must be self-contained and numbered from 1. References mentioned in both the main text and the Supplementary Information should be part of both reference lists so that the Supplementary Information does not refer to the reference list in the main paper and vice versa.</w:t>
             </w:r>
           </w:p>
         </w:tc>
@@ -9657,7 +10647,31 @@
                 <w14:ligatures w14:val="none"/>
               </w:rPr>
               <w:br/>
-              <w:t xml:space="preserve">* Any chart axis, error bars, scale bars, molecular weight markers, symbols and colour scales are defined. </w:t>
+              <w:t xml:space="preserve">* Any chart axis, error bars, scale bars, molecular weight markers, symbols and </w:t>
+            </w:r>
+            <w:proofErr w:type="spellStart"/>
+            <w:r>
+              <w:rPr>
+                <w:rFonts w:ascii="Arial" w:eastAsia="Times New Roman" w:hAnsi="Arial" w:cs="Arial"/>
+                <w:color w:val="000000"/>
+                <w:kern w:val="0"/>
+                <w:sz w:val="16"/>
+                <w:szCs w:val="16"/>
+                <w14:ligatures w14:val="none"/>
+              </w:rPr>
+              <w:t>colour</w:t>
+            </w:r>
+            <w:proofErr w:type="spellEnd"/>
+            <w:r>
+              <w:rPr>
+                <w:rFonts w:ascii="Arial" w:eastAsia="Times New Roman" w:hAnsi="Arial" w:cs="Arial"/>
+                <w:color w:val="000000"/>
+                <w:kern w:val="0"/>
+                <w:sz w:val="16"/>
+                <w:szCs w:val="16"/>
+                <w14:ligatures w14:val="none"/>
+              </w:rPr>
+              <w:t xml:space="preserve"> scales are defined. </w:t>
             </w:r>
             <w:r>
               <w:rPr>
@@ -10141,18 +11155,66 @@
                 <w:szCs w:val="16"/>
                 <w14:ligatures w14:val="none"/>
               </w:rPr>
-              <w:t>Our main manuscript files is supplied in LaTeX format</w:t>
-            </w:r>
-            <w:r>
-              <w:rPr>
-                <w:rFonts w:ascii="Arial" w:eastAsia="Times New Roman" w:hAnsi="Arial" w:cs="Arial"/>
-                <w:color w:val="000000"/>
-                <w:kern w:val="0"/>
-                <w:sz w:val="16"/>
-                <w:szCs w:val="16"/>
-                <w14:ligatures w14:val="none"/>
-              </w:rPr>
-              <w:t xml:space="preserve"> (main.tex)</w:t>
+              <w:t xml:space="preserve">Our main manuscript files </w:t>
+            </w:r>
+            <w:proofErr w:type="gramStart"/>
+            <w:r>
+              <w:rPr>
+                <w:rFonts w:ascii="Arial" w:eastAsia="Times New Roman" w:hAnsi="Arial" w:cs="Arial"/>
+                <w:color w:val="000000"/>
+                <w:kern w:val="0"/>
+                <w:sz w:val="16"/>
+                <w:szCs w:val="16"/>
+                <w14:ligatures w14:val="none"/>
+              </w:rPr>
+              <w:t>is</w:t>
+            </w:r>
+            <w:proofErr w:type="gramEnd"/>
+            <w:r>
+              <w:rPr>
+                <w:rFonts w:ascii="Arial" w:eastAsia="Times New Roman" w:hAnsi="Arial" w:cs="Arial"/>
+                <w:color w:val="000000"/>
+                <w:kern w:val="0"/>
+                <w:sz w:val="16"/>
+                <w:szCs w:val="16"/>
+                <w14:ligatures w14:val="none"/>
+              </w:rPr>
+              <w:t xml:space="preserve"> supplied in LaTeX format</w:t>
+            </w:r>
+            <w:r>
+              <w:rPr>
+                <w:rFonts w:ascii="Arial" w:eastAsia="Times New Roman" w:hAnsi="Arial" w:cs="Arial"/>
+                <w:color w:val="000000"/>
+                <w:kern w:val="0"/>
+                <w:sz w:val="16"/>
+                <w:szCs w:val="16"/>
+                <w14:ligatures w14:val="none"/>
+              </w:rPr>
+              <w:t xml:space="preserve"> (</w:t>
+            </w:r>
+            <w:proofErr w:type="spellStart"/>
+            <w:r>
+              <w:rPr>
+                <w:rFonts w:ascii="Arial" w:eastAsia="Times New Roman" w:hAnsi="Arial" w:cs="Arial"/>
+                <w:color w:val="000000"/>
+                <w:kern w:val="0"/>
+                <w:sz w:val="16"/>
+                <w:szCs w:val="16"/>
+                <w14:ligatures w14:val="none"/>
+              </w:rPr>
+              <w:t>main.tex</w:t>
+            </w:r>
+            <w:proofErr w:type="spellEnd"/>
+            <w:r>
+              <w:rPr>
+                <w:rFonts w:ascii="Arial" w:eastAsia="Times New Roman" w:hAnsi="Arial" w:cs="Arial"/>
+                <w:color w:val="000000"/>
+                <w:kern w:val="0"/>
+                <w:sz w:val="16"/>
+                <w:szCs w:val="16"/>
+                <w14:ligatures w14:val="none"/>
+              </w:rPr>
+              <w:t>)</w:t>
             </w:r>
             <w:r>
               <w:rPr>
@@ -10307,7 +11369,79 @@
                 <w14:ligatures w14:val="none"/>
               </w:rPr>
               <w:br/>
-              <w:t>If any elements of your submitted work have been created with BioRender you will need to ensure you have obtained a publication license from BioRender, adhering to the user requirements as outlined within the license. The reference for BioRender created graphics should be present in the accompanying legend of the display material it is present in.</w:t>
+              <w:t xml:space="preserve">If any elements of your submitted work have been created with </w:t>
+            </w:r>
+            <w:proofErr w:type="spellStart"/>
+            <w:r>
+              <w:rPr>
+                <w:rFonts w:ascii="Arial" w:eastAsia="Times New Roman" w:hAnsi="Arial" w:cs="Arial"/>
+                <w:color w:val="000000"/>
+                <w:kern w:val="0"/>
+                <w:sz w:val="16"/>
+                <w:szCs w:val="16"/>
+                <w14:ligatures w14:val="none"/>
+              </w:rPr>
+              <w:t>BioRender</w:t>
+            </w:r>
+            <w:proofErr w:type="spellEnd"/>
+            <w:r>
+              <w:rPr>
+                <w:rFonts w:ascii="Arial" w:eastAsia="Times New Roman" w:hAnsi="Arial" w:cs="Arial"/>
+                <w:color w:val="000000"/>
+                <w:kern w:val="0"/>
+                <w:sz w:val="16"/>
+                <w:szCs w:val="16"/>
+                <w14:ligatures w14:val="none"/>
+              </w:rPr>
+              <w:t xml:space="preserve"> you will need to ensure you have obtained a publication license from </w:t>
+            </w:r>
+            <w:proofErr w:type="spellStart"/>
+            <w:r>
+              <w:rPr>
+                <w:rFonts w:ascii="Arial" w:eastAsia="Times New Roman" w:hAnsi="Arial" w:cs="Arial"/>
+                <w:color w:val="000000"/>
+                <w:kern w:val="0"/>
+                <w:sz w:val="16"/>
+                <w:szCs w:val="16"/>
+                <w14:ligatures w14:val="none"/>
+              </w:rPr>
+              <w:t>BioRender</w:t>
+            </w:r>
+            <w:proofErr w:type="spellEnd"/>
+            <w:r>
+              <w:rPr>
+                <w:rFonts w:ascii="Arial" w:eastAsia="Times New Roman" w:hAnsi="Arial" w:cs="Arial"/>
+                <w:color w:val="000000"/>
+                <w:kern w:val="0"/>
+                <w:sz w:val="16"/>
+                <w:szCs w:val="16"/>
+                <w14:ligatures w14:val="none"/>
+              </w:rPr>
+              <w:t xml:space="preserve">, adhering to the user requirements as outlined within the license. The reference for </w:t>
+            </w:r>
+            <w:proofErr w:type="spellStart"/>
+            <w:r>
+              <w:rPr>
+                <w:rFonts w:ascii="Arial" w:eastAsia="Times New Roman" w:hAnsi="Arial" w:cs="Arial"/>
+                <w:color w:val="000000"/>
+                <w:kern w:val="0"/>
+                <w:sz w:val="16"/>
+                <w:szCs w:val="16"/>
+                <w14:ligatures w14:val="none"/>
+              </w:rPr>
+              <w:t>BioRender</w:t>
+            </w:r>
+            <w:proofErr w:type="spellEnd"/>
+            <w:r>
+              <w:rPr>
+                <w:rFonts w:ascii="Arial" w:eastAsia="Times New Roman" w:hAnsi="Arial" w:cs="Arial"/>
+                <w:color w:val="000000"/>
+                <w:kern w:val="0"/>
+                <w:sz w:val="16"/>
+                <w:szCs w:val="16"/>
+                <w14:ligatures w14:val="none"/>
+              </w:rPr>
+              <w:t xml:space="preserve"> created graphics should be present in the accompanying legend of the display material it is present in.</w:t>
             </w:r>
             <w:r>
               <w:rPr>
@@ -10353,7 +11487,31 @@
                 <w14:ligatures w14:val="none"/>
               </w:rPr>
               <w:br/>
-              <w:t>For more information please see the BioRender knowledge article here: https://help.biorender.com/hc/en-gb/articles/21283116932765-CC-BY-publishing-and-reader-permissions</w:t>
+              <w:t xml:space="preserve">For more information please see the </w:t>
+            </w:r>
+            <w:proofErr w:type="spellStart"/>
+            <w:r>
+              <w:rPr>
+                <w:rFonts w:ascii="Arial" w:eastAsia="Times New Roman" w:hAnsi="Arial" w:cs="Arial"/>
+                <w:color w:val="000000"/>
+                <w:kern w:val="0"/>
+                <w:sz w:val="16"/>
+                <w:szCs w:val="16"/>
+                <w14:ligatures w14:val="none"/>
+              </w:rPr>
+              <w:t>BioRender</w:t>
+            </w:r>
+            <w:proofErr w:type="spellEnd"/>
+            <w:r>
+              <w:rPr>
+                <w:rFonts w:ascii="Arial" w:eastAsia="Times New Roman" w:hAnsi="Arial" w:cs="Arial"/>
+                <w:color w:val="000000"/>
+                <w:kern w:val="0"/>
+                <w:sz w:val="16"/>
+                <w:szCs w:val="16"/>
+                <w14:ligatures w14:val="none"/>
+              </w:rPr>
+              <w:t xml:space="preserve"> knowledge article here: https://help.biorender.com/hc/en-gb/articles/21283116932765-CC-BY-publishing-and-reader-permissions</w:t>
             </w:r>
             <w:r>
               <w:rPr>
@@ -11543,7 +12701,31 @@
                 <w:szCs w:val="16"/>
                 <w14:ligatures w14:val="none"/>
               </w:rPr>
-              <w:t>Please select n/a for checkbox 10 as this information could not be found in the manuscript or if this statistical analysis was carried out specify the information in the manuscript.</w:t>
+              <w:t>Please select n/</w:t>
+            </w:r>
+            <w:proofErr w:type="gramStart"/>
+            <w:r>
+              <w:rPr>
+                <w:rFonts w:ascii="Arial" w:eastAsia="Times New Roman" w:hAnsi="Arial" w:cs="Arial"/>
+                <w:color w:val="000000"/>
+                <w:kern w:val="0"/>
+                <w:sz w:val="16"/>
+                <w:szCs w:val="16"/>
+                <w14:ligatures w14:val="none"/>
+              </w:rPr>
+              <w:t>a for</w:t>
+            </w:r>
+            <w:proofErr w:type="gramEnd"/>
+            <w:r>
+              <w:rPr>
+                <w:rFonts w:ascii="Arial" w:eastAsia="Times New Roman" w:hAnsi="Arial" w:cs="Arial"/>
+                <w:color w:val="000000"/>
+                <w:kern w:val="0"/>
+                <w:sz w:val="16"/>
+                <w:szCs w:val="16"/>
+                <w14:ligatures w14:val="none"/>
+              </w:rPr>
+              <w:t xml:space="preserve"> checkbox 10 as this information could not be found in the manuscript or if this statistical analysis was carried out specify the information in the manuscript.</w:t>
             </w:r>
           </w:p>
         </w:tc>
@@ -12127,6 +13309,7 @@
                 <w14:ligatures w14:val="none"/>
               </w:rPr>
             </w:pPr>
+            <w:proofErr w:type="spellStart"/>
             <w:r>
               <w:rPr>
                 <w:rFonts w:ascii="Arial" w:eastAsia="Times New Roman" w:hAnsi="Arial" w:cs="Arial"/>
@@ -12138,7 +13321,21 @@
                 <w:szCs w:val="16"/>
                 <w14:ligatures w14:val="none"/>
               </w:rPr>
-              <w:t>Behavioural and Social Study design</w:t>
+              <w:t>Behavioural</w:t>
+            </w:r>
+            <w:proofErr w:type="spellEnd"/>
+            <w:r>
+              <w:rPr>
+                <w:rFonts w:ascii="Arial" w:eastAsia="Times New Roman" w:hAnsi="Arial" w:cs="Arial"/>
+                <w:b/>
+                <w:bCs/>
+                <w:color w:val="000000"/>
+                <w:kern w:val="0"/>
+                <w:sz w:val="16"/>
+                <w:szCs w:val="16"/>
+                <w14:ligatures w14:val="none"/>
+              </w:rPr>
+              <w:t xml:space="preserve"> and Social Study design</w:t>
             </w:r>
           </w:p>
         </w:tc>

</xml_diff>

<commit_message>
final updates to author checklist
</commit_message>
<xml_diff>
--- a/paper/admin/Author_Checklist_NCOMMS-23-10640C__1762787328_45.docx
+++ b/paper/admin/Author_Checklist_NCOMMS-23-10640C__1762787328_45.docx
@@ -7853,6 +7853,151 @@
                 <w14:ligatures w14:val="none"/>
               </w:rPr>
             </w:pPr>
+            <w:r>
+              <w:rPr>
+                <w:rFonts w:ascii="Arial" w:eastAsia="Times New Roman" w:hAnsi="Arial" w:cs="Arial"/>
+                <w:color w:val="000000"/>
+                <w:kern w:val="0"/>
+                <w:sz w:val="16"/>
+                <w:szCs w:val="16"/>
+                <w14:ligatures w14:val="none"/>
+              </w:rPr>
+              <w:t xml:space="preserve">We have </w:t>
+            </w:r>
+            <w:r>
+              <w:rPr>
+                <w:rFonts w:ascii="Arial" w:eastAsia="Times New Roman" w:hAnsi="Arial" w:cs="Arial"/>
+                <w:color w:val="000000"/>
+                <w:kern w:val="0"/>
+                <w:sz w:val="16"/>
+                <w:szCs w:val="16"/>
+                <w14:ligatures w14:val="none"/>
+              </w:rPr>
+              <w:t xml:space="preserve">obtained a DOI via </w:t>
+            </w:r>
+            <w:proofErr w:type="spellStart"/>
+            <w:r>
+              <w:rPr>
+                <w:rFonts w:ascii="Arial" w:eastAsia="Times New Roman" w:hAnsi="Arial" w:cs="Arial"/>
+                <w:color w:val="000000"/>
+                <w:kern w:val="0"/>
+                <w:sz w:val="16"/>
+                <w:szCs w:val="16"/>
+                <w14:ligatures w14:val="none"/>
+              </w:rPr>
+              <w:t>Zenodo</w:t>
+            </w:r>
+            <w:proofErr w:type="spellEnd"/>
+            <w:r>
+              <w:rPr>
+                <w:rFonts w:ascii="Arial" w:eastAsia="Times New Roman" w:hAnsi="Arial" w:cs="Arial"/>
+                <w:color w:val="000000"/>
+                <w:kern w:val="0"/>
+                <w:sz w:val="16"/>
+                <w:szCs w:val="16"/>
+                <w14:ligatures w14:val="none"/>
+              </w:rPr>
+              <w:t xml:space="preserve"> </w:t>
+            </w:r>
+            <w:r>
+              <w:rPr>
+                <w:rFonts w:ascii="Arial" w:eastAsia="Times New Roman" w:hAnsi="Arial" w:cs="Arial"/>
+                <w:color w:val="000000"/>
+                <w:kern w:val="0"/>
+                <w:sz w:val="16"/>
+                <w:szCs w:val="16"/>
+                <w14:ligatures w14:val="none"/>
+              </w:rPr>
+              <w:t xml:space="preserve">and </w:t>
+            </w:r>
+            <w:r>
+              <w:rPr>
+                <w:rFonts w:ascii="Arial" w:eastAsia="Times New Roman" w:hAnsi="Arial" w:cs="Arial"/>
+                <w:color w:val="000000"/>
+                <w:kern w:val="0"/>
+                <w:sz w:val="16"/>
+                <w:szCs w:val="16"/>
+                <w14:ligatures w14:val="none"/>
+              </w:rPr>
+              <w:t xml:space="preserve">cite </w:t>
+            </w:r>
+            <w:r>
+              <w:rPr>
+                <w:rFonts w:ascii="Arial" w:eastAsia="Times New Roman" w:hAnsi="Arial" w:cs="Arial"/>
+                <w:color w:val="000000"/>
+                <w:kern w:val="0"/>
+                <w:sz w:val="16"/>
+                <w:szCs w:val="16"/>
+                <w14:ligatures w14:val="none"/>
+              </w:rPr>
+              <w:t>our GitHub repository in our Data availability and Code availability sections</w:t>
+            </w:r>
+            <w:r>
+              <w:rPr>
+                <w:rFonts w:ascii="Arial" w:eastAsia="Times New Roman" w:hAnsi="Arial" w:cs="Arial"/>
+                <w:color w:val="000000"/>
+                <w:kern w:val="0"/>
+                <w:sz w:val="16"/>
+                <w:szCs w:val="16"/>
+                <w14:ligatures w14:val="none"/>
+              </w:rPr>
+              <w:t xml:space="preserve">. </w:t>
+            </w:r>
+            <w:r>
+              <w:rPr>
+                <w:rFonts w:ascii="Arial" w:eastAsia="Times New Roman" w:hAnsi="Arial" w:cs="Arial"/>
+                <w:color w:val="000000"/>
+                <w:kern w:val="0"/>
+                <w:sz w:val="16"/>
+                <w:szCs w:val="16"/>
+                <w14:ligatures w14:val="none"/>
+              </w:rPr>
+              <w:t>We have</w:t>
+            </w:r>
+            <w:r>
+              <w:rPr>
+                <w:rFonts w:ascii="Arial" w:eastAsia="Times New Roman" w:hAnsi="Arial" w:cs="Arial"/>
+                <w:color w:val="000000"/>
+                <w:kern w:val="0"/>
+                <w:sz w:val="16"/>
+                <w:szCs w:val="16"/>
+                <w14:ligatures w14:val="none"/>
+              </w:rPr>
+              <w:t xml:space="preserve"> </w:t>
+            </w:r>
+            <w:r>
+              <w:rPr>
+                <w:rFonts w:ascii="Arial" w:eastAsia="Times New Roman" w:hAnsi="Arial" w:cs="Arial"/>
+                <w:color w:val="000000"/>
+                <w:kern w:val="0"/>
+                <w:sz w:val="16"/>
+                <w:szCs w:val="16"/>
+                <w14:ligatures w14:val="none"/>
+              </w:rPr>
+              <w:t xml:space="preserve">added an entry to our reference list in </w:t>
+            </w:r>
+            <w:r>
+              <w:rPr>
+                <w:rFonts w:ascii="Arial" w:eastAsia="Times New Roman" w:hAnsi="Arial" w:cs="Arial"/>
+                <w:color w:val="000000"/>
+                <w:kern w:val="0"/>
+                <w:sz w:val="16"/>
+                <w:szCs w:val="16"/>
+                <w14:ligatures w14:val="none"/>
+              </w:rPr>
+              <w:t xml:space="preserve">the </w:t>
+            </w:r>
+            <w:r>
+              <w:rPr>
+                <w:rFonts w:ascii="Arial" w:eastAsia="Times New Roman" w:hAnsi="Arial" w:cs="Arial"/>
+                <w:color w:val="000000"/>
+                <w:kern w:val="0"/>
+                <w:sz w:val="16"/>
+                <w:szCs w:val="16"/>
+                <w14:ligatures w14:val="none"/>
+              </w:rPr>
+              <w:t>proper format.</w:t>
+            </w:r>
           </w:p>
         </w:tc>
       </w:tr>
@@ -8001,7 +8146,110 @@
                 <w:szCs w:val="16"/>
                 <w14:ligatures w14:val="none"/>
               </w:rPr>
-              <w:t xml:space="preserve">We have replaced the GitHub URL in our Data availability </w:t>
+              <w:t xml:space="preserve">We have </w:t>
+            </w:r>
+            <w:r>
+              <w:rPr>
+                <w:rFonts w:ascii="Arial" w:eastAsia="Times New Roman" w:hAnsi="Arial" w:cs="Arial"/>
+                <w:color w:val="000000"/>
+                <w:kern w:val="0"/>
+                <w:sz w:val="16"/>
+                <w:szCs w:val="16"/>
+                <w14:ligatures w14:val="none"/>
+              </w:rPr>
+              <w:t xml:space="preserve">added the </w:t>
+            </w:r>
+            <w:proofErr w:type="spellStart"/>
+            <w:r>
+              <w:rPr>
+                <w:rFonts w:ascii="Arial" w:eastAsia="Times New Roman" w:hAnsi="Arial" w:cs="Arial"/>
+                <w:color w:val="000000"/>
+                <w:kern w:val="0"/>
+                <w:sz w:val="16"/>
+                <w:szCs w:val="16"/>
+                <w14:ligatures w14:val="none"/>
+              </w:rPr>
+              <w:t>Zenodo</w:t>
+            </w:r>
+            <w:proofErr w:type="spellEnd"/>
+            <w:r>
+              <w:rPr>
+                <w:rFonts w:ascii="Arial" w:eastAsia="Times New Roman" w:hAnsi="Arial" w:cs="Arial"/>
+                <w:color w:val="000000"/>
+                <w:kern w:val="0"/>
+                <w:sz w:val="16"/>
+                <w:szCs w:val="16"/>
+                <w14:ligatures w14:val="none"/>
+              </w:rPr>
+              <w:t xml:space="preserve"> </w:t>
+            </w:r>
+            <w:r>
+              <w:rPr>
+                <w:rFonts w:ascii="Arial" w:eastAsia="Times New Roman" w:hAnsi="Arial" w:cs="Arial"/>
+                <w:color w:val="000000"/>
+                <w:kern w:val="0"/>
+                <w:sz w:val="16"/>
+                <w:szCs w:val="16"/>
+                <w14:ligatures w14:val="none"/>
+              </w:rPr>
+              <w:t xml:space="preserve">DOI </w:t>
+            </w:r>
+            <w:r>
+              <w:rPr>
+                <w:rFonts w:ascii="Arial" w:eastAsia="Times New Roman" w:hAnsi="Arial" w:cs="Arial"/>
+                <w:color w:val="000000"/>
+                <w:kern w:val="0"/>
+                <w:sz w:val="16"/>
+                <w:szCs w:val="16"/>
+                <w14:ligatures w14:val="none"/>
+              </w:rPr>
+              <w:t>URL</w:t>
+            </w:r>
+            <w:r>
+              <w:rPr>
+                <w:rFonts w:ascii="Arial" w:eastAsia="Times New Roman" w:hAnsi="Arial" w:cs="Arial"/>
+                <w:color w:val="000000"/>
+                <w:kern w:val="0"/>
+                <w:sz w:val="16"/>
+                <w:szCs w:val="16"/>
+                <w14:ligatures w14:val="none"/>
+              </w:rPr>
+              <w:t xml:space="preserve"> </w:t>
+            </w:r>
+            <w:r>
+              <w:rPr>
+                <w:rFonts w:ascii="Arial" w:eastAsia="Times New Roman" w:hAnsi="Arial" w:cs="Arial"/>
+                <w:color w:val="000000"/>
+                <w:kern w:val="0"/>
+                <w:sz w:val="16"/>
+                <w:szCs w:val="16"/>
+                <w14:ligatures w14:val="none"/>
+              </w:rPr>
+              <w:t xml:space="preserve">to our </w:t>
+            </w:r>
+            <w:proofErr w:type="spellStart"/>
+            <w:r>
+              <w:rPr>
+                <w:rFonts w:ascii="Arial" w:eastAsia="Times New Roman" w:hAnsi="Arial" w:cs="Arial"/>
+                <w:color w:val="000000"/>
+                <w:kern w:val="0"/>
+                <w:sz w:val="16"/>
+                <w:szCs w:val="16"/>
+                <w14:ligatures w14:val="none"/>
+              </w:rPr>
+              <w:t>Data</w:t>
+            </w:r>
+            <w:proofErr w:type="spellEnd"/>
+            <w:r>
+              <w:rPr>
+                <w:rFonts w:ascii="Arial" w:eastAsia="Times New Roman" w:hAnsi="Arial" w:cs="Arial"/>
+                <w:color w:val="000000"/>
+                <w:kern w:val="0"/>
+                <w:sz w:val="16"/>
+                <w:szCs w:val="16"/>
+                <w14:ligatures w14:val="none"/>
+              </w:rPr>
+              <w:t xml:space="preserve"> availability </w:t>
             </w:r>
             <w:r>
               <w:rPr>
@@ -8056,31 +8304,7 @@
                 <w:szCs w:val="16"/>
                 <w14:ligatures w14:val="none"/>
               </w:rPr>
-              <w:t xml:space="preserve">Reporting Summary with a </w:t>
-            </w:r>
-            <w:proofErr w:type="spellStart"/>
-            <w:r>
-              <w:rPr>
-                <w:rFonts w:ascii="Arial" w:eastAsia="Times New Roman" w:hAnsi="Arial" w:cs="Arial"/>
-                <w:color w:val="000000"/>
-                <w:kern w:val="0"/>
-                <w:sz w:val="16"/>
-                <w:szCs w:val="16"/>
-                <w14:ligatures w14:val="none"/>
-              </w:rPr>
-              <w:t>Zenodo</w:t>
-            </w:r>
-            <w:proofErr w:type="spellEnd"/>
-            <w:r>
-              <w:rPr>
-                <w:rFonts w:ascii="Arial" w:eastAsia="Times New Roman" w:hAnsi="Arial" w:cs="Arial"/>
-                <w:color w:val="000000"/>
-                <w:kern w:val="0"/>
-                <w:sz w:val="16"/>
-                <w:szCs w:val="16"/>
-                <w14:ligatures w14:val="none"/>
-              </w:rPr>
-              <w:t xml:space="preserve"> URL.</w:t>
+              <w:t>Reporting Summary.</w:t>
             </w:r>
           </w:p>
         </w:tc>

</xml_diff>